<commit_message>
have a template filled with dummy text
</commit_message>
<xml_diff>
--- a/src/rdmo_docx_export/exports/templates/horizon-template.docx
+++ b/src/rdmo_docx_export/exports/templates/horizon-template.docx
@@ -249,8 +249,8 @@
         <w:tblLook w:val="04A0" w:firstRow="1" w:lastRow="0" w:firstColumn="1" w:lastColumn="0" w:noHBand="0" w:noVBand="1"/>
       </w:tblPr>
       <w:tblGrid>
-        <w:gridCol w:w="3487"/>
-        <w:gridCol w:w="5105"/>
+        <w:gridCol w:w="3484"/>
+        <w:gridCol w:w="5108"/>
       </w:tblGrid>
       <w:tr>
         <w:tc>
@@ -352,7 +352,33 @@
                 <w:sz w:val="18"/>
                 <w:szCs w:val="16"/>
               </w:rPr>
-              <w:t>projectnumber</w:t>
+              <w:t>{{</w:t>
+            </w:r>
+            <w:proofErr w:type="spellStart"/>
+            <w:r>
+              <w:rPr>
+                <w:rFonts w:eastAsia="Calibri" w:cs="Arial"/>
+                <w:sz w:val="18"/>
+                <w:szCs w:val="16"/>
+              </w:rPr>
+              <w:t>P</w:t>
+            </w:r>
+            <w:r>
+              <w:rPr>
+                <w:rFonts w:eastAsia="Calibri" w:cs="Arial"/>
+                <w:sz w:val="18"/>
+                <w:szCs w:val="16"/>
+              </w:rPr>
+              <w:t>rojectnumber</w:t>
+            </w:r>
+            <w:proofErr w:type="spellEnd"/>
+            <w:r>
+              <w:rPr>
+                <w:rFonts w:eastAsia="Calibri" w:cs="Arial"/>
+                <w:sz w:val="18"/>
+                <w:szCs w:val="16"/>
+              </w:rPr>
+              <w:t>}}</w:t>
             </w:r>
           </w:p>
         </w:tc>
@@ -406,7 +432,25 @@
                 <w:sz w:val="18"/>
                 <w:szCs w:val="16"/>
               </w:rPr>
+              <w:t>{{</w:t>
+            </w:r>
+            <w:proofErr w:type="spellStart"/>
+            <w:r>
+              <w:rPr>
+                <w:rFonts w:eastAsia="Calibri" w:cs="Arial"/>
+                <w:sz w:val="18"/>
+                <w:szCs w:val="16"/>
+              </w:rPr>
               <w:t>projectacronym</w:t>
+            </w:r>
+            <w:proofErr w:type="spellEnd"/>
+            <w:r>
+              <w:rPr>
+                <w:rFonts w:eastAsia="Calibri" w:cs="Arial"/>
+                <w:sz w:val="18"/>
+                <w:szCs w:val="16"/>
+              </w:rPr>
+              <w:t>}}</w:t>
             </w:r>
           </w:p>
         </w:tc>
@@ -459,7 +503,33 @@
                 <w:sz w:val="18"/>
                 <w:szCs w:val="16"/>
               </w:rPr>
-              <w:t>projecttitle</w:t>
+              <w:t>{{</w:t>
+            </w:r>
+            <w:proofErr w:type="spellStart"/>
+            <w:r>
+              <w:rPr>
+                <w:rFonts w:eastAsia="Calibri" w:cs="Arial"/>
+                <w:sz w:val="18"/>
+                <w:szCs w:val="16"/>
+              </w:rPr>
+              <w:t>p</w:t>
+            </w:r>
+            <w:r>
+              <w:rPr>
+                <w:rFonts w:eastAsia="Calibri" w:cs="Arial"/>
+                <w:sz w:val="18"/>
+                <w:szCs w:val="16"/>
+              </w:rPr>
+              <w:t>rojecttitle</w:t>
+            </w:r>
+            <w:proofErr w:type="spellEnd"/>
+            <w:r>
+              <w:rPr>
+                <w:rFonts w:eastAsia="Calibri" w:cs="Arial"/>
+                <w:sz w:val="18"/>
+                <w:szCs w:val="16"/>
+              </w:rPr>
+              <w:t>}}</w:t>
             </w:r>
           </w:p>
         </w:tc>
@@ -481,8 +551,8 @@
         <w:tblLook w:val="04A0" w:firstRow="1" w:lastRow="0" w:firstColumn="1" w:lastColumn="0" w:noHBand="0" w:noVBand="1"/>
       </w:tblPr>
       <w:tblGrid>
-        <w:gridCol w:w="3433"/>
-        <w:gridCol w:w="5159"/>
+        <w:gridCol w:w="3431"/>
+        <w:gridCol w:w="5161"/>
       </w:tblGrid>
       <w:tr>
         <w:trPr>
@@ -582,7 +652,25 @@
                 <w:sz w:val="18"/>
                 <w:szCs w:val="18"/>
               </w:rPr>
+              <w:t>{{</w:t>
+            </w:r>
+            <w:proofErr w:type="spellStart"/>
+            <w:r>
+              <w:rPr>
+                <w:rFonts w:eastAsia="Calibri" w:cs="Arial"/>
+                <w:sz w:val="18"/>
+                <w:szCs w:val="18"/>
+              </w:rPr>
               <w:t>dmpdate</w:t>
+            </w:r>
+            <w:proofErr w:type="spellEnd"/>
+            <w:r>
+              <w:rPr>
+                <w:rFonts w:eastAsia="Calibri" w:cs="Arial"/>
+                <w:sz w:val="18"/>
+                <w:szCs w:val="18"/>
+              </w:rPr>
+              <w:t>}}</w:t>
             </w:r>
           </w:p>
         </w:tc>
@@ -641,7 +729,33 @@
                 <w:sz w:val="18"/>
                 <w:szCs w:val="18"/>
               </w:rPr>
-              <w:t>dmpversion</w:t>
+              <w:t>{{</w:t>
+            </w:r>
+            <w:proofErr w:type="spellStart"/>
+            <w:r>
+              <w:rPr>
+                <w:rFonts w:eastAsia="Calibri" w:cs="Arial"/>
+                <w:sz w:val="18"/>
+                <w:szCs w:val="18"/>
+              </w:rPr>
+              <w:t>d</w:t>
+            </w:r>
+            <w:r>
+              <w:rPr>
+                <w:rFonts w:eastAsia="Calibri" w:cs="Arial"/>
+                <w:sz w:val="18"/>
+                <w:szCs w:val="18"/>
+              </w:rPr>
+              <w:t>mpversion</w:t>
+            </w:r>
+            <w:proofErr w:type="spellEnd"/>
+            <w:r>
+              <w:rPr>
+                <w:rFonts w:eastAsia="Calibri" w:cs="Arial"/>
+                <w:sz w:val="18"/>
+                <w:szCs w:val="18"/>
+              </w:rPr>
+              <w:t>}}</w:t>
             </w:r>
           </w:p>
         </w:tc>
@@ -1388,6 +1502,85 @@
         <w:ind w:right="-35"/>
         <w:jc w:val="both"/>
         <w:rPr>
+          <w:iCs/>
+          <w:color w:val="000000" w:themeColor="text1"/>
+          <w:lang w:val="en-GB"/>
+          <w14:shadow w14:blurRad="38100" w14:dist="19050" w14:dir="2700000" w14:sx="100000" w14:sy="100000" w14:kx="0" w14:ky="0" w14:algn="tl">
+            <w14:schemeClr w14:val="dk1">
+              <w14:alpha w14:val="60000"/>
+            </w14:schemeClr>
+          </w14:shadow>
+          <w14:textOutline w14:w="0" w14:cap="flat" w14:cmpd="sng" w14:algn="ctr">
+            <w14:noFill/>
+            <w14:prstDash w14:val="solid"/>
+            <w14:round/>
+          </w14:textOutline>
+        </w:rPr>
+      </w:pPr>
+      <w:r>
+        <w:rPr>
+          <w:iCs/>
+          <w:color w:val="000000" w:themeColor="text1"/>
+          <w:lang w:val="en-GB"/>
+          <w14:shadow w14:blurRad="38100" w14:dist="19050" w14:dir="2700000" w14:sx="100000" w14:sy="100000" w14:kx="0" w14:ky="0" w14:algn="tl">
+            <w14:schemeClr w14:val="dk1">
+              <w14:alpha w14:val="60000"/>
+            </w14:schemeClr>
+          </w14:shadow>
+          <w14:textOutline w14:w="0" w14:cap="flat" w14:cmpd="sng" w14:algn="ctr">
+            <w14:noFill/>
+            <w14:prstDash w14:val="solid"/>
+            <w14:round/>
+          </w14:textOutline>
+        </w:rPr>
+        <w:t>{{Answer</w:t>
+      </w:r>
+      <w:r>
+        <w:rPr>
+          <w:iCs/>
+          <w:color w:val="000000" w:themeColor="text1"/>
+          <w:lang w:val="en-GB"/>
+          <w14:shadow w14:blurRad="38100" w14:dist="19050" w14:dir="2700000" w14:sx="100000" w14:sy="100000" w14:kx="0" w14:ky="0" w14:algn="tl">
+            <w14:schemeClr w14:val="dk1">
+              <w14:alpha w14:val="60000"/>
+            </w14:schemeClr>
+          </w14:shadow>
+          <w14:textOutline w14:w="0" w14:cap="flat" w14:cmpd="sng" w14:algn="ctr">
+            <w14:noFill/>
+            <w14:prstDash w14:val="solid"/>
+            <w14:round/>
+          </w14:textOutline>
+        </w:rPr>
+        <w:t>10</w:t>
+      </w:r>
+      <w:r>
+        <w:rPr>
+          <w:iCs/>
+          <w:color w:val="000000" w:themeColor="text1"/>
+          <w:lang w:val="en-GB"/>
+          <w14:shadow w14:blurRad="38100" w14:dist="19050" w14:dir="2700000" w14:sx="100000" w14:sy="100000" w14:kx="0" w14:ky="0" w14:algn="tl">
+            <w14:schemeClr w14:val="dk1">
+              <w14:alpha w14:val="60000"/>
+            </w14:schemeClr>
+          </w14:shadow>
+          <w14:textOutline w14:w="0" w14:cap="flat" w14:cmpd="sng" w14:algn="ctr">
+            <w14:noFill/>
+            <w14:prstDash w14:val="solid"/>
+            <w14:round/>
+          </w14:textOutline>
+        </w:rPr>
+        <w:t>}}</w:t>
+      </w:r>
+    </w:p>
+    <w:p>
+      <w:pPr>
+        <w:pStyle w:val="Textkrper"/>
+        <w:kinsoku w:val="0"/>
+        <w:overflowPunct w:val="0"/>
+        <w:spacing w:after="240"/>
+        <w:ind w:right="-35"/>
+        <w:jc w:val="both"/>
+        <w:rPr>
           <w:i/>
           <w:color w:val="4AA55B"/>
           <w:lang w:val="en-GB"/>
@@ -1411,6 +1604,85 @@
         <w:ind w:right="-35"/>
         <w:jc w:val="both"/>
         <w:rPr>
+          <w:iCs/>
+          <w:color w:val="000000" w:themeColor="text1"/>
+          <w:lang w:val="en-GB"/>
+          <w14:shadow w14:blurRad="38100" w14:dist="19050" w14:dir="2700000" w14:sx="100000" w14:sy="100000" w14:kx="0" w14:ky="0" w14:algn="tl">
+            <w14:schemeClr w14:val="dk1">
+              <w14:alpha w14:val="60000"/>
+            </w14:schemeClr>
+          </w14:shadow>
+          <w14:textOutline w14:w="0" w14:cap="flat" w14:cmpd="sng" w14:algn="ctr">
+            <w14:noFill/>
+            <w14:prstDash w14:val="solid"/>
+            <w14:round/>
+          </w14:textOutline>
+        </w:rPr>
+      </w:pPr>
+      <w:r>
+        <w:rPr>
+          <w:iCs/>
+          <w:color w:val="000000" w:themeColor="text1"/>
+          <w:lang w:val="en-GB"/>
+          <w14:shadow w14:blurRad="38100" w14:dist="19050" w14:dir="2700000" w14:sx="100000" w14:sy="100000" w14:kx="0" w14:ky="0" w14:algn="tl">
+            <w14:schemeClr w14:val="dk1">
+              <w14:alpha w14:val="60000"/>
+            </w14:schemeClr>
+          </w14:shadow>
+          <w14:textOutline w14:w="0" w14:cap="flat" w14:cmpd="sng" w14:algn="ctr">
+            <w14:noFill/>
+            <w14:prstDash w14:val="solid"/>
+            <w14:round/>
+          </w14:textOutline>
+        </w:rPr>
+        <w:t>{{Answer</w:t>
+      </w:r>
+      <w:r>
+        <w:rPr>
+          <w:iCs/>
+          <w:color w:val="000000" w:themeColor="text1"/>
+          <w:lang w:val="en-GB"/>
+          <w14:shadow w14:blurRad="38100" w14:dist="19050" w14:dir="2700000" w14:sx="100000" w14:sy="100000" w14:kx="0" w14:ky="0" w14:algn="tl">
+            <w14:schemeClr w14:val="dk1">
+              <w14:alpha w14:val="60000"/>
+            </w14:schemeClr>
+          </w14:shadow>
+          <w14:textOutline w14:w="0" w14:cap="flat" w14:cmpd="sng" w14:algn="ctr">
+            <w14:noFill/>
+            <w14:prstDash w14:val="solid"/>
+            <w14:round/>
+          </w14:textOutline>
+        </w:rPr>
+        <w:t>11</w:t>
+      </w:r>
+      <w:r>
+        <w:rPr>
+          <w:iCs/>
+          <w:color w:val="000000" w:themeColor="text1"/>
+          <w:lang w:val="en-GB"/>
+          <w14:shadow w14:blurRad="38100" w14:dist="19050" w14:dir="2700000" w14:sx="100000" w14:sy="100000" w14:kx="0" w14:ky="0" w14:algn="tl">
+            <w14:schemeClr w14:val="dk1">
+              <w14:alpha w14:val="60000"/>
+            </w14:schemeClr>
+          </w14:shadow>
+          <w14:textOutline w14:w="0" w14:cap="flat" w14:cmpd="sng" w14:algn="ctr">
+            <w14:noFill/>
+            <w14:prstDash w14:val="solid"/>
+            <w14:round/>
+          </w14:textOutline>
+        </w:rPr>
+        <w:t>}}</w:t>
+      </w:r>
+    </w:p>
+    <w:p>
+      <w:pPr>
+        <w:pStyle w:val="Textkrper"/>
+        <w:kinsoku w:val="0"/>
+        <w:overflowPunct w:val="0"/>
+        <w:spacing w:after="240"/>
+        <w:ind w:right="-35"/>
+        <w:jc w:val="both"/>
+        <w:rPr>
           <w:i/>
           <w:color w:val="4AA55B"/>
           <w:lang w:val="en-GB"/>
@@ -1434,6 +1706,85 @@
         <w:ind w:right="-35"/>
         <w:jc w:val="both"/>
         <w:rPr>
+          <w:iCs/>
+          <w:color w:val="000000" w:themeColor="text1"/>
+          <w:lang w:val="en-GB"/>
+          <w14:shadow w14:blurRad="38100" w14:dist="19050" w14:dir="2700000" w14:sx="100000" w14:sy="100000" w14:kx="0" w14:ky="0" w14:algn="tl">
+            <w14:schemeClr w14:val="dk1">
+              <w14:alpha w14:val="60000"/>
+            </w14:schemeClr>
+          </w14:shadow>
+          <w14:textOutline w14:w="0" w14:cap="flat" w14:cmpd="sng" w14:algn="ctr">
+            <w14:noFill/>
+            <w14:prstDash w14:val="solid"/>
+            <w14:round/>
+          </w14:textOutline>
+        </w:rPr>
+      </w:pPr>
+      <w:r>
+        <w:rPr>
+          <w:iCs/>
+          <w:color w:val="000000" w:themeColor="text1"/>
+          <w:lang w:val="en-GB"/>
+          <w14:shadow w14:blurRad="38100" w14:dist="19050" w14:dir="2700000" w14:sx="100000" w14:sy="100000" w14:kx="0" w14:ky="0" w14:algn="tl">
+            <w14:schemeClr w14:val="dk1">
+              <w14:alpha w14:val="60000"/>
+            </w14:schemeClr>
+          </w14:shadow>
+          <w14:textOutline w14:w="0" w14:cap="flat" w14:cmpd="sng" w14:algn="ctr">
+            <w14:noFill/>
+            <w14:prstDash w14:val="solid"/>
+            <w14:round/>
+          </w14:textOutline>
+        </w:rPr>
+        <w:t>{{Answer</w:t>
+      </w:r>
+      <w:r>
+        <w:rPr>
+          <w:iCs/>
+          <w:color w:val="000000" w:themeColor="text1"/>
+          <w:lang w:val="en-GB"/>
+          <w14:shadow w14:blurRad="38100" w14:dist="19050" w14:dir="2700000" w14:sx="100000" w14:sy="100000" w14:kx="0" w14:ky="0" w14:algn="tl">
+            <w14:schemeClr w14:val="dk1">
+              <w14:alpha w14:val="60000"/>
+            </w14:schemeClr>
+          </w14:shadow>
+          <w14:textOutline w14:w="0" w14:cap="flat" w14:cmpd="sng" w14:algn="ctr">
+            <w14:noFill/>
+            <w14:prstDash w14:val="solid"/>
+            <w14:round/>
+          </w14:textOutline>
+        </w:rPr>
+        <w:t>12</w:t>
+      </w:r>
+      <w:r>
+        <w:rPr>
+          <w:iCs/>
+          <w:color w:val="000000" w:themeColor="text1"/>
+          <w:lang w:val="en-GB"/>
+          <w14:shadow w14:blurRad="38100" w14:dist="19050" w14:dir="2700000" w14:sx="100000" w14:sy="100000" w14:kx="0" w14:ky="0" w14:algn="tl">
+            <w14:schemeClr w14:val="dk1">
+              <w14:alpha w14:val="60000"/>
+            </w14:schemeClr>
+          </w14:shadow>
+          <w14:textOutline w14:w="0" w14:cap="flat" w14:cmpd="sng" w14:algn="ctr">
+            <w14:noFill/>
+            <w14:prstDash w14:val="solid"/>
+            <w14:round/>
+          </w14:textOutline>
+        </w:rPr>
+        <w:t>}}</w:t>
+      </w:r>
+    </w:p>
+    <w:p>
+      <w:pPr>
+        <w:pStyle w:val="Textkrper"/>
+        <w:kinsoku w:val="0"/>
+        <w:overflowPunct w:val="0"/>
+        <w:spacing w:after="240"/>
+        <w:ind w:right="-35"/>
+        <w:jc w:val="both"/>
+        <w:rPr>
           <w:b/>
           <w:i/>
           <w:lang w:val="en-GB"/>
@@ -1480,18 +1831,194 @@
         <w:ind w:right="-35"/>
         <w:jc w:val="both"/>
         <w:rPr>
-          <w:i/>
-          <w:color w:val="4AA55B"/>
-          <w:lang w:val="en-GB"/>
-        </w:rPr>
-      </w:pPr>
-      <w:r>
-        <w:rPr>
-          <w:i/>
-          <w:color w:val="4AA55B"/>
-          <w:lang w:val="en-GB"/>
-        </w:rPr>
-        <w:t>If an embargo is applied to give time to publish or seek protection of the intellectual property (e.g. patents), specify why and how long this will apply, bearing in mind that research data should be made available as soon as possible.</w:t>
+          <w:iCs/>
+          <w:color w:val="000000" w:themeColor="text1"/>
+          <w:lang w:val="en-GB"/>
+          <w14:shadow w14:blurRad="38100" w14:dist="19050" w14:dir="2700000" w14:sx="100000" w14:sy="100000" w14:kx="0" w14:ky="0" w14:algn="tl">
+            <w14:schemeClr w14:val="dk1">
+              <w14:alpha w14:val="60000"/>
+            </w14:schemeClr>
+          </w14:shadow>
+          <w14:textOutline w14:w="0" w14:cap="flat" w14:cmpd="sng" w14:algn="ctr">
+            <w14:noFill/>
+            <w14:prstDash w14:val="solid"/>
+            <w14:round/>
+          </w14:textOutline>
+        </w:rPr>
+      </w:pPr>
+      <w:r>
+        <w:rPr>
+          <w:iCs/>
+          <w:color w:val="000000" w:themeColor="text1"/>
+          <w:lang w:val="en-GB"/>
+          <w14:shadow w14:blurRad="38100" w14:dist="19050" w14:dir="2700000" w14:sx="100000" w14:sy="100000" w14:kx="0" w14:ky="0" w14:algn="tl">
+            <w14:schemeClr w14:val="dk1">
+              <w14:alpha w14:val="60000"/>
+            </w14:schemeClr>
+          </w14:shadow>
+          <w14:textOutline w14:w="0" w14:cap="flat" w14:cmpd="sng" w14:algn="ctr">
+            <w14:noFill/>
+            <w14:prstDash w14:val="solid"/>
+            <w14:round/>
+          </w14:textOutline>
+        </w:rPr>
+        <w:t>{{Answer</w:t>
+      </w:r>
+      <w:r>
+        <w:rPr>
+          <w:iCs/>
+          <w:color w:val="000000" w:themeColor="text1"/>
+          <w:lang w:val="en-GB"/>
+          <w14:shadow w14:blurRad="38100" w14:dist="19050" w14:dir="2700000" w14:sx="100000" w14:sy="100000" w14:kx="0" w14:ky="0" w14:algn="tl">
+            <w14:schemeClr w14:val="dk1">
+              <w14:alpha w14:val="60000"/>
+            </w14:schemeClr>
+          </w14:shadow>
+          <w14:textOutline w14:w="0" w14:cap="flat" w14:cmpd="sng" w14:algn="ctr">
+            <w14:noFill/>
+            <w14:prstDash w14:val="solid"/>
+            <w14:round/>
+          </w14:textOutline>
+        </w:rPr>
+        <w:t>13</w:t>
+      </w:r>
+      <w:r>
+        <w:rPr>
+          <w:iCs/>
+          <w:color w:val="000000" w:themeColor="text1"/>
+          <w:lang w:val="en-GB"/>
+          <w14:shadow w14:blurRad="38100" w14:dist="19050" w14:dir="2700000" w14:sx="100000" w14:sy="100000" w14:kx="0" w14:ky="0" w14:algn="tl">
+            <w14:schemeClr w14:val="dk1">
+              <w14:alpha w14:val="60000"/>
+            </w14:schemeClr>
+          </w14:shadow>
+          <w14:textOutline w14:w="0" w14:cap="flat" w14:cmpd="sng" w14:algn="ctr">
+            <w14:noFill/>
+            <w14:prstDash w14:val="solid"/>
+            <w14:round/>
+          </w14:textOutline>
+        </w:rPr>
+        <w:t>}}</w:t>
+      </w:r>
+    </w:p>
+    <w:p>
+      <w:pPr>
+        <w:pStyle w:val="Textkrper"/>
+        <w:kinsoku w:val="0"/>
+        <w:overflowPunct w:val="0"/>
+        <w:spacing w:after="240"/>
+        <w:ind w:right="-35"/>
+        <w:jc w:val="both"/>
+        <w:rPr>
+          <w:i/>
+          <w:color w:val="4AA55B"/>
+          <w:lang w:val="en-GB"/>
+        </w:rPr>
+      </w:pPr>
+      <w:r>
+        <w:rPr>
+          <w:i/>
+          <w:color w:val="4AA55B"/>
+          <w:lang w:val="en-GB"/>
+        </w:rPr>
+        <w:t>If an embargo is applied to give time to publish or seek protection of the intellectual property (</w:t>
+      </w:r>
+      <w:proofErr w:type="gramStart"/>
+      <w:r>
+        <w:rPr>
+          <w:i/>
+          <w:color w:val="4AA55B"/>
+          <w:lang w:val="en-GB"/>
+        </w:rPr>
+        <w:t>e.g.</w:t>
+      </w:r>
+      <w:proofErr w:type="gramEnd"/>
+      <w:r>
+        <w:rPr>
+          <w:i/>
+          <w:color w:val="4AA55B"/>
+          <w:lang w:val="en-GB"/>
+        </w:rPr>
+        <w:t xml:space="preserve"> patents), specify why and how long this will apply, bearing in mind that research data should be made available as soon as possible.</w:t>
+      </w:r>
+    </w:p>
+    <w:p>
+      <w:pPr>
+        <w:pStyle w:val="Textkrper"/>
+        <w:kinsoku w:val="0"/>
+        <w:overflowPunct w:val="0"/>
+        <w:spacing w:after="240"/>
+        <w:ind w:right="-35"/>
+        <w:jc w:val="both"/>
+        <w:rPr>
+          <w:iCs/>
+          <w:color w:val="000000" w:themeColor="text1"/>
+          <w:lang w:val="en-GB"/>
+          <w14:shadow w14:blurRad="38100" w14:dist="19050" w14:dir="2700000" w14:sx="100000" w14:sy="100000" w14:kx="0" w14:ky="0" w14:algn="tl">
+            <w14:schemeClr w14:val="dk1">
+              <w14:alpha w14:val="60000"/>
+            </w14:schemeClr>
+          </w14:shadow>
+          <w14:textOutline w14:w="0" w14:cap="flat" w14:cmpd="sng" w14:algn="ctr">
+            <w14:noFill/>
+            <w14:prstDash w14:val="solid"/>
+            <w14:round/>
+          </w14:textOutline>
+        </w:rPr>
+      </w:pPr>
+      <w:r>
+        <w:rPr>
+          <w:iCs/>
+          <w:color w:val="000000" w:themeColor="text1"/>
+          <w:lang w:val="en-GB"/>
+          <w14:shadow w14:blurRad="38100" w14:dist="19050" w14:dir="2700000" w14:sx="100000" w14:sy="100000" w14:kx="0" w14:ky="0" w14:algn="tl">
+            <w14:schemeClr w14:val="dk1">
+              <w14:alpha w14:val="60000"/>
+            </w14:schemeClr>
+          </w14:shadow>
+          <w14:textOutline w14:w="0" w14:cap="flat" w14:cmpd="sng" w14:algn="ctr">
+            <w14:noFill/>
+            <w14:prstDash w14:val="solid"/>
+            <w14:round/>
+          </w14:textOutline>
+        </w:rPr>
+        <w:t>{{Answer</w:t>
+      </w:r>
+      <w:r>
+        <w:rPr>
+          <w:iCs/>
+          <w:color w:val="000000" w:themeColor="text1"/>
+          <w:lang w:val="en-GB"/>
+          <w14:shadow w14:blurRad="38100" w14:dist="19050" w14:dir="2700000" w14:sx="100000" w14:sy="100000" w14:kx="0" w14:ky="0" w14:algn="tl">
+            <w14:schemeClr w14:val="dk1">
+              <w14:alpha w14:val="60000"/>
+            </w14:schemeClr>
+          </w14:shadow>
+          <w14:textOutline w14:w="0" w14:cap="flat" w14:cmpd="sng" w14:algn="ctr">
+            <w14:noFill/>
+            <w14:prstDash w14:val="solid"/>
+            <w14:round/>
+          </w14:textOutline>
+        </w:rPr>
+        <w:t>14</w:t>
+      </w:r>
+      <w:r>
+        <w:rPr>
+          <w:iCs/>
+          <w:color w:val="000000" w:themeColor="text1"/>
+          <w:lang w:val="en-GB"/>
+          <w14:shadow w14:blurRad="38100" w14:dist="19050" w14:dir="2700000" w14:sx="100000" w14:sy="100000" w14:kx="0" w14:ky="0" w14:algn="tl">
+            <w14:schemeClr w14:val="dk1">
+              <w14:alpha w14:val="60000"/>
+            </w14:schemeClr>
+          </w14:shadow>
+          <w14:textOutline w14:w="0" w14:cap="flat" w14:cmpd="sng" w14:algn="ctr">
+            <w14:noFill/>
+            <w14:prstDash w14:val="solid"/>
+            <w14:round/>
+          </w14:textOutline>
+        </w:rPr>
+        <w:t>}}</w:t>
       </w:r>
     </w:p>
     <w:p>
@@ -1526,6 +2053,85 @@
         <w:ind w:right="-35"/>
         <w:jc w:val="both"/>
         <w:rPr>
+          <w:iCs/>
+          <w:color w:val="000000" w:themeColor="text1"/>
+          <w:lang w:val="en-GB"/>
+          <w14:shadow w14:blurRad="38100" w14:dist="19050" w14:dir="2700000" w14:sx="100000" w14:sy="100000" w14:kx="0" w14:ky="0" w14:algn="tl">
+            <w14:schemeClr w14:val="dk1">
+              <w14:alpha w14:val="60000"/>
+            </w14:schemeClr>
+          </w14:shadow>
+          <w14:textOutline w14:w="0" w14:cap="flat" w14:cmpd="sng" w14:algn="ctr">
+            <w14:noFill/>
+            <w14:prstDash w14:val="solid"/>
+            <w14:round/>
+          </w14:textOutline>
+        </w:rPr>
+      </w:pPr>
+      <w:r>
+        <w:rPr>
+          <w:iCs/>
+          <w:color w:val="000000" w:themeColor="text1"/>
+          <w:lang w:val="en-GB"/>
+          <w14:shadow w14:blurRad="38100" w14:dist="19050" w14:dir="2700000" w14:sx="100000" w14:sy="100000" w14:kx="0" w14:ky="0" w14:algn="tl">
+            <w14:schemeClr w14:val="dk1">
+              <w14:alpha w14:val="60000"/>
+            </w14:schemeClr>
+          </w14:shadow>
+          <w14:textOutline w14:w="0" w14:cap="flat" w14:cmpd="sng" w14:algn="ctr">
+            <w14:noFill/>
+            <w14:prstDash w14:val="solid"/>
+            <w14:round/>
+          </w14:textOutline>
+        </w:rPr>
+        <w:t>{{Answer</w:t>
+      </w:r>
+      <w:r>
+        <w:rPr>
+          <w:iCs/>
+          <w:color w:val="000000" w:themeColor="text1"/>
+          <w:lang w:val="en-GB"/>
+          <w14:shadow w14:blurRad="38100" w14:dist="19050" w14:dir="2700000" w14:sx="100000" w14:sy="100000" w14:kx="0" w14:ky="0" w14:algn="tl">
+            <w14:schemeClr w14:val="dk1">
+              <w14:alpha w14:val="60000"/>
+            </w14:schemeClr>
+          </w14:shadow>
+          <w14:textOutline w14:w="0" w14:cap="flat" w14:cmpd="sng" w14:algn="ctr">
+            <w14:noFill/>
+            <w14:prstDash w14:val="solid"/>
+            <w14:round/>
+          </w14:textOutline>
+        </w:rPr>
+        <w:t>15</w:t>
+      </w:r>
+      <w:r>
+        <w:rPr>
+          <w:iCs/>
+          <w:color w:val="000000" w:themeColor="text1"/>
+          <w:lang w:val="en-GB"/>
+          <w14:shadow w14:blurRad="38100" w14:dist="19050" w14:dir="2700000" w14:sx="100000" w14:sy="100000" w14:kx="0" w14:ky="0" w14:algn="tl">
+            <w14:schemeClr w14:val="dk1">
+              <w14:alpha w14:val="60000"/>
+            </w14:schemeClr>
+          </w14:shadow>
+          <w14:textOutline w14:w="0" w14:cap="flat" w14:cmpd="sng" w14:algn="ctr">
+            <w14:noFill/>
+            <w14:prstDash w14:val="solid"/>
+            <w14:round/>
+          </w14:textOutline>
+        </w:rPr>
+        <w:t>}}</w:t>
+      </w:r>
+    </w:p>
+    <w:p>
+      <w:pPr>
+        <w:pStyle w:val="Textkrper"/>
+        <w:kinsoku w:val="0"/>
+        <w:overflowPunct w:val="0"/>
+        <w:spacing w:after="240"/>
+        <w:ind w:right="-35"/>
+        <w:jc w:val="both"/>
+        <w:rPr>
           <w:i/>
           <w:color w:val="4AA55B"/>
           <w:lang w:val="en-GB"/>
@@ -1549,6 +2155,85 @@
         <w:ind w:right="-35"/>
         <w:jc w:val="both"/>
         <w:rPr>
+          <w:iCs/>
+          <w:color w:val="000000" w:themeColor="text1"/>
+          <w:lang w:val="en-GB"/>
+          <w14:shadow w14:blurRad="38100" w14:dist="19050" w14:dir="2700000" w14:sx="100000" w14:sy="100000" w14:kx="0" w14:ky="0" w14:algn="tl">
+            <w14:schemeClr w14:val="dk1">
+              <w14:alpha w14:val="60000"/>
+            </w14:schemeClr>
+          </w14:shadow>
+          <w14:textOutline w14:w="0" w14:cap="flat" w14:cmpd="sng" w14:algn="ctr">
+            <w14:noFill/>
+            <w14:prstDash w14:val="solid"/>
+            <w14:round/>
+          </w14:textOutline>
+        </w:rPr>
+      </w:pPr>
+      <w:r>
+        <w:rPr>
+          <w:iCs/>
+          <w:color w:val="000000" w:themeColor="text1"/>
+          <w:lang w:val="en-GB"/>
+          <w14:shadow w14:blurRad="38100" w14:dist="19050" w14:dir="2700000" w14:sx="100000" w14:sy="100000" w14:kx="0" w14:ky="0" w14:algn="tl">
+            <w14:schemeClr w14:val="dk1">
+              <w14:alpha w14:val="60000"/>
+            </w14:schemeClr>
+          </w14:shadow>
+          <w14:textOutline w14:w="0" w14:cap="flat" w14:cmpd="sng" w14:algn="ctr">
+            <w14:noFill/>
+            <w14:prstDash w14:val="solid"/>
+            <w14:round/>
+          </w14:textOutline>
+        </w:rPr>
+        <w:t>{{Answer</w:t>
+      </w:r>
+      <w:r>
+        <w:rPr>
+          <w:iCs/>
+          <w:color w:val="000000" w:themeColor="text1"/>
+          <w:lang w:val="en-GB"/>
+          <w14:shadow w14:blurRad="38100" w14:dist="19050" w14:dir="2700000" w14:sx="100000" w14:sy="100000" w14:kx="0" w14:ky="0" w14:algn="tl">
+            <w14:schemeClr w14:val="dk1">
+              <w14:alpha w14:val="60000"/>
+            </w14:schemeClr>
+          </w14:shadow>
+          <w14:textOutline w14:w="0" w14:cap="flat" w14:cmpd="sng" w14:algn="ctr">
+            <w14:noFill/>
+            <w14:prstDash w14:val="solid"/>
+            <w14:round/>
+          </w14:textOutline>
+        </w:rPr>
+        <w:t>16</w:t>
+      </w:r>
+      <w:r>
+        <w:rPr>
+          <w:iCs/>
+          <w:color w:val="000000" w:themeColor="text1"/>
+          <w:lang w:val="en-GB"/>
+          <w14:shadow w14:blurRad="38100" w14:dist="19050" w14:dir="2700000" w14:sx="100000" w14:sy="100000" w14:kx="0" w14:ky="0" w14:algn="tl">
+            <w14:schemeClr w14:val="dk1">
+              <w14:alpha w14:val="60000"/>
+            </w14:schemeClr>
+          </w14:shadow>
+          <w14:textOutline w14:w="0" w14:cap="flat" w14:cmpd="sng" w14:algn="ctr">
+            <w14:noFill/>
+            <w14:prstDash w14:val="solid"/>
+            <w14:round/>
+          </w14:textOutline>
+        </w:rPr>
+        <w:t>}}</w:t>
+      </w:r>
+    </w:p>
+    <w:p>
+      <w:pPr>
+        <w:pStyle w:val="Textkrper"/>
+        <w:kinsoku w:val="0"/>
+        <w:overflowPunct w:val="0"/>
+        <w:spacing w:after="240"/>
+        <w:ind w:right="-35"/>
+        <w:jc w:val="both"/>
+        <w:rPr>
           <w:i/>
           <w:color w:val="4AA55B"/>
           <w:lang w:val="en-GB"/>
@@ -1572,18 +2257,194 @@
         <w:ind w:right="-35"/>
         <w:jc w:val="both"/>
         <w:rPr>
-          <w:i/>
-          <w:color w:val="4AA55B"/>
-          <w:lang w:val="en-GB"/>
-        </w:rPr>
-      </w:pPr>
-      <w:r>
-        <w:rPr>
-          <w:i/>
-          <w:color w:val="4AA55B"/>
-          <w:lang w:val="en-GB"/>
-        </w:rPr>
-        <w:t>Is there a need for a data access committee (e.g. to evaluate/approve access requests to personal/sensitive data)?</w:t>
+          <w:iCs/>
+          <w:color w:val="000000" w:themeColor="text1"/>
+          <w:lang w:val="en-GB"/>
+          <w14:shadow w14:blurRad="38100" w14:dist="19050" w14:dir="2700000" w14:sx="100000" w14:sy="100000" w14:kx="0" w14:ky="0" w14:algn="tl">
+            <w14:schemeClr w14:val="dk1">
+              <w14:alpha w14:val="60000"/>
+            </w14:schemeClr>
+          </w14:shadow>
+          <w14:textOutline w14:w="0" w14:cap="flat" w14:cmpd="sng" w14:algn="ctr">
+            <w14:noFill/>
+            <w14:prstDash w14:val="solid"/>
+            <w14:round/>
+          </w14:textOutline>
+        </w:rPr>
+      </w:pPr>
+      <w:r>
+        <w:rPr>
+          <w:iCs/>
+          <w:color w:val="000000" w:themeColor="text1"/>
+          <w:lang w:val="en-GB"/>
+          <w14:shadow w14:blurRad="38100" w14:dist="19050" w14:dir="2700000" w14:sx="100000" w14:sy="100000" w14:kx="0" w14:ky="0" w14:algn="tl">
+            <w14:schemeClr w14:val="dk1">
+              <w14:alpha w14:val="60000"/>
+            </w14:schemeClr>
+          </w14:shadow>
+          <w14:textOutline w14:w="0" w14:cap="flat" w14:cmpd="sng" w14:algn="ctr">
+            <w14:noFill/>
+            <w14:prstDash w14:val="solid"/>
+            <w14:round/>
+          </w14:textOutline>
+        </w:rPr>
+        <w:t>{{Answer</w:t>
+      </w:r>
+      <w:r>
+        <w:rPr>
+          <w:iCs/>
+          <w:color w:val="000000" w:themeColor="text1"/>
+          <w:lang w:val="en-GB"/>
+          <w14:shadow w14:blurRad="38100" w14:dist="19050" w14:dir="2700000" w14:sx="100000" w14:sy="100000" w14:kx="0" w14:ky="0" w14:algn="tl">
+            <w14:schemeClr w14:val="dk1">
+              <w14:alpha w14:val="60000"/>
+            </w14:schemeClr>
+          </w14:shadow>
+          <w14:textOutline w14:w="0" w14:cap="flat" w14:cmpd="sng" w14:algn="ctr">
+            <w14:noFill/>
+            <w14:prstDash w14:val="solid"/>
+            <w14:round/>
+          </w14:textOutline>
+        </w:rPr>
+        <w:t>17</w:t>
+      </w:r>
+      <w:r>
+        <w:rPr>
+          <w:iCs/>
+          <w:color w:val="000000" w:themeColor="text1"/>
+          <w:lang w:val="en-GB"/>
+          <w14:shadow w14:blurRad="38100" w14:dist="19050" w14:dir="2700000" w14:sx="100000" w14:sy="100000" w14:kx="0" w14:ky="0" w14:algn="tl">
+            <w14:schemeClr w14:val="dk1">
+              <w14:alpha w14:val="60000"/>
+            </w14:schemeClr>
+          </w14:shadow>
+          <w14:textOutline w14:w="0" w14:cap="flat" w14:cmpd="sng" w14:algn="ctr">
+            <w14:noFill/>
+            <w14:prstDash w14:val="solid"/>
+            <w14:round/>
+          </w14:textOutline>
+        </w:rPr>
+        <w:t>}}</w:t>
+      </w:r>
+    </w:p>
+    <w:p>
+      <w:pPr>
+        <w:pStyle w:val="Textkrper"/>
+        <w:kinsoku w:val="0"/>
+        <w:overflowPunct w:val="0"/>
+        <w:spacing w:after="240"/>
+        <w:ind w:right="-35"/>
+        <w:jc w:val="both"/>
+        <w:rPr>
+          <w:i/>
+          <w:color w:val="4AA55B"/>
+          <w:lang w:val="en-GB"/>
+        </w:rPr>
+      </w:pPr>
+      <w:r>
+        <w:rPr>
+          <w:i/>
+          <w:color w:val="4AA55B"/>
+          <w:lang w:val="en-GB"/>
+        </w:rPr>
+        <w:t>Is there a need for a data access committee (</w:t>
+      </w:r>
+      <w:proofErr w:type="gramStart"/>
+      <w:r>
+        <w:rPr>
+          <w:i/>
+          <w:color w:val="4AA55B"/>
+          <w:lang w:val="en-GB"/>
+        </w:rPr>
+        <w:t>e.g.</w:t>
+      </w:r>
+      <w:proofErr w:type="gramEnd"/>
+      <w:r>
+        <w:rPr>
+          <w:i/>
+          <w:color w:val="4AA55B"/>
+          <w:lang w:val="en-GB"/>
+        </w:rPr>
+        <w:t xml:space="preserve"> to evaluate/approve access requests to personal/sensitive data)?</w:t>
+      </w:r>
+    </w:p>
+    <w:p>
+      <w:pPr>
+        <w:pStyle w:val="Textkrper"/>
+        <w:kinsoku w:val="0"/>
+        <w:overflowPunct w:val="0"/>
+        <w:spacing w:after="240"/>
+        <w:ind w:right="-35"/>
+        <w:jc w:val="both"/>
+        <w:rPr>
+          <w:iCs/>
+          <w:color w:val="000000" w:themeColor="text1"/>
+          <w:lang w:val="en-GB"/>
+          <w14:shadow w14:blurRad="38100" w14:dist="19050" w14:dir="2700000" w14:sx="100000" w14:sy="100000" w14:kx="0" w14:ky="0" w14:algn="tl">
+            <w14:schemeClr w14:val="dk1">
+              <w14:alpha w14:val="60000"/>
+            </w14:schemeClr>
+          </w14:shadow>
+          <w14:textOutline w14:w="0" w14:cap="flat" w14:cmpd="sng" w14:algn="ctr">
+            <w14:noFill/>
+            <w14:prstDash w14:val="solid"/>
+            <w14:round/>
+          </w14:textOutline>
+        </w:rPr>
+      </w:pPr>
+      <w:r>
+        <w:rPr>
+          <w:iCs/>
+          <w:color w:val="000000" w:themeColor="text1"/>
+          <w:lang w:val="en-GB"/>
+          <w14:shadow w14:blurRad="38100" w14:dist="19050" w14:dir="2700000" w14:sx="100000" w14:sy="100000" w14:kx="0" w14:ky="0" w14:algn="tl">
+            <w14:schemeClr w14:val="dk1">
+              <w14:alpha w14:val="60000"/>
+            </w14:schemeClr>
+          </w14:shadow>
+          <w14:textOutline w14:w="0" w14:cap="flat" w14:cmpd="sng" w14:algn="ctr">
+            <w14:noFill/>
+            <w14:prstDash w14:val="solid"/>
+            <w14:round/>
+          </w14:textOutline>
+        </w:rPr>
+        <w:t>{{Answer</w:t>
+      </w:r>
+      <w:r>
+        <w:rPr>
+          <w:iCs/>
+          <w:color w:val="000000" w:themeColor="text1"/>
+          <w:lang w:val="en-GB"/>
+          <w14:shadow w14:blurRad="38100" w14:dist="19050" w14:dir="2700000" w14:sx="100000" w14:sy="100000" w14:kx="0" w14:ky="0" w14:algn="tl">
+            <w14:schemeClr w14:val="dk1">
+              <w14:alpha w14:val="60000"/>
+            </w14:schemeClr>
+          </w14:shadow>
+          <w14:textOutline w14:w="0" w14:cap="flat" w14:cmpd="sng" w14:algn="ctr">
+            <w14:noFill/>
+            <w14:prstDash w14:val="solid"/>
+            <w14:round/>
+          </w14:textOutline>
+        </w:rPr>
+        <w:t>18</w:t>
+      </w:r>
+      <w:r>
+        <w:rPr>
+          <w:iCs/>
+          <w:color w:val="000000" w:themeColor="text1"/>
+          <w:lang w:val="en-GB"/>
+          <w14:shadow w14:blurRad="38100" w14:dist="19050" w14:dir="2700000" w14:sx="100000" w14:sy="100000" w14:kx="0" w14:ky="0" w14:algn="tl">
+            <w14:schemeClr w14:val="dk1">
+              <w14:alpha w14:val="60000"/>
+            </w14:schemeClr>
+          </w14:shadow>
+          <w14:textOutline w14:w="0" w14:cap="flat" w14:cmpd="sng" w14:algn="ctr">
+            <w14:noFill/>
+            <w14:prstDash w14:val="solid"/>
+            <w14:round/>
+          </w14:textOutline>
+        </w:rPr>
+        <w:t>}}</w:t>
       </w:r>
     </w:p>
     <w:p>
@@ -1606,6 +2467,7 @@
           <w:i/>
           <w:lang w:val="en-GB"/>
         </w:rPr>
+        <w:lastRenderedPageBreak/>
         <w:t>Metadata:</w:t>
       </w:r>
     </w:p>
@@ -1641,6 +2503,85 @@
         <w:ind w:right="-35"/>
         <w:jc w:val="both"/>
         <w:rPr>
+          <w:iCs/>
+          <w:color w:val="000000" w:themeColor="text1"/>
+          <w:lang w:val="en-GB"/>
+          <w14:shadow w14:blurRad="38100" w14:dist="19050" w14:dir="2700000" w14:sx="100000" w14:sy="100000" w14:kx="0" w14:ky="0" w14:algn="tl">
+            <w14:schemeClr w14:val="dk1">
+              <w14:alpha w14:val="60000"/>
+            </w14:schemeClr>
+          </w14:shadow>
+          <w14:textOutline w14:w="0" w14:cap="flat" w14:cmpd="sng" w14:algn="ctr">
+            <w14:noFill/>
+            <w14:prstDash w14:val="solid"/>
+            <w14:round/>
+          </w14:textOutline>
+        </w:rPr>
+      </w:pPr>
+      <w:r>
+        <w:rPr>
+          <w:iCs/>
+          <w:color w:val="000000" w:themeColor="text1"/>
+          <w:lang w:val="en-GB"/>
+          <w14:shadow w14:blurRad="38100" w14:dist="19050" w14:dir="2700000" w14:sx="100000" w14:sy="100000" w14:kx="0" w14:ky="0" w14:algn="tl">
+            <w14:schemeClr w14:val="dk1">
+              <w14:alpha w14:val="60000"/>
+            </w14:schemeClr>
+          </w14:shadow>
+          <w14:textOutline w14:w="0" w14:cap="flat" w14:cmpd="sng" w14:algn="ctr">
+            <w14:noFill/>
+            <w14:prstDash w14:val="solid"/>
+            <w14:round/>
+          </w14:textOutline>
+        </w:rPr>
+        <w:t>{{Answer</w:t>
+      </w:r>
+      <w:r>
+        <w:rPr>
+          <w:iCs/>
+          <w:color w:val="000000" w:themeColor="text1"/>
+          <w:lang w:val="en-GB"/>
+          <w14:shadow w14:blurRad="38100" w14:dist="19050" w14:dir="2700000" w14:sx="100000" w14:sy="100000" w14:kx="0" w14:ky="0" w14:algn="tl">
+            <w14:schemeClr w14:val="dk1">
+              <w14:alpha w14:val="60000"/>
+            </w14:schemeClr>
+          </w14:shadow>
+          <w14:textOutline w14:w="0" w14:cap="flat" w14:cmpd="sng" w14:algn="ctr">
+            <w14:noFill/>
+            <w14:prstDash w14:val="solid"/>
+            <w14:round/>
+          </w14:textOutline>
+        </w:rPr>
+        <w:t>1</w:t>
+      </w:r>
+      <w:r>
+        <w:rPr>
+          <w:iCs/>
+          <w:color w:val="000000" w:themeColor="text1"/>
+          <w:lang w:val="en-GB"/>
+          <w14:shadow w14:blurRad="38100" w14:dist="19050" w14:dir="2700000" w14:sx="100000" w14:sy="100000" w14:kx="0" w14:ky="0" w14:algn="tl">
+            <w14:schemeClr w14:val="dk1">
+              <w14:alpha w14:val="60000"/>
+            </w14:schemeClr>
+          </w14:shadow>
+          <w14:textOutline w14:w="0" w14:cap="flat" w14:cmpd="sng" w14:algn="ctr">
+            <w14:noFill/>
+            <w14:prstDash w14:val="solid"/>
+            <w14:round/>
+          </w14:textOutline>
+        </w:rPr>
+        <w:t>9}}</w:t>
+      </w:r>
+    </w:p>
+    <w:p>
+      <w:pPr>
+        <w:pStyle w:val="Textkrper"/>
+        <w:kinsoku w:val="0"/>
+        <w:overflowPunct w:val="0"/>
+        <w:spacing w:after="240"/>
+        <w:ind w:right="-35"/>
+        <w:jc w:val="both"/>
+        <w:rPr>
           <w:i/>
           <w:color w:val="4AA55B"/>
           <w:lang w:val="en-GB"/>
@@ -1664,18 +2605,194 @@
         <w:ind w:right="-35"/>
         <w:jc w:val="both"/>
         <w:rPr>
-          <w:i/>
-          <w:color w:val="4AA55B"/>
-          <w:lang w:val="en-GB"/>
-        </w:rPr>
-      </w:pPr>
-      <w:r>
-        <w:rPr>
-          <w:i/>
-          <w:color w:val="4AA55B"/>
-          <w:lang w:val="en-GB"/>
-        </w:rPr>
-        <w:t>Will documentation or reference about any software be needed to access or read the data be included? Will it be possible to include the relevant software (e.g. in open source code)?</w:t>
+          <w:iCs/>
+          <w:color w:val="000000" w:themeColor="text1"/>
+          <w:lang w:val="en-GB"/>
+          <w14:shadow w14:blurRad="38100" w14:dist="19050" w14:dir="2700000" w14:sx="100000" w14:sy="100000" w14:kx="0" w14:ky="0" w14:algn="tl">
+            <w14:schemeClr w14:val="dk1">
+              <w14:alpha w14:val="60000"/>
+            </w14:schemeClr>
+          </w14:shadow>
+          <w14:textOutline w14:w="0" w14:cap="flat" w14:cmpd="sng" w14:algn="ctr">
+            <w14:noFill/>
+            <w14:prstDash w14:val="solid"/>
+            <w14:round/>
+          </w14:textOutline>
+        </w:rPr>
+      </w:pPr>
+      <w:r>
+        <w:rPr>
+          <w:iCs/>
+          <w:color w:val="000000" w:themeColor="text1"/>
+          <w:lang w:val="en-GB"/>
+          <w14:shadow w14:blurRad="38100" w14:dist="19050" w14:dir="2700000" w14:sx="100000" w14:sy="100000" w14:kx="0" w14:ky="0" w14:algn="tl">
+            <w14:schemeClr w14:val="dk1">
+              <w14:alpha w14:val="60000"/>
+            </w14:schemeClr>
+          </w14:shadow>
+          <w14:textOutline w14:w="0" w14:cap="flat" w14:cmpd="sng" w14:algn="ctr">
+            <w14:noFill/>
+            <w14:prstDash w14:val="solid"/>
+            <w14:round/>
+          </w14:textOutline>
+        </w:rPr>
+        <w:t>{{Answer</w:t>
+      </w:r>
+      <w:r>
+        <w:rPr>
+          <w:iCs/>
+          <w:color w:val="000000" w:themeColor="text1"/>
+          <w:lang w:val="en-GB"/>
+          <w14:shadow w14:blurRad="38100" w14:dist="19050" w14:dir="2700000" w14:sx="100000" w14:sy="100000" w14:kx="0" w14:ky="0" w14:algn="tl">
+            <w14:schemeClr w14:val="dk1">
+              <w14:alpha w14:val="60000"/>
+            </w14:schemeClr>
+          </w14:shadow>
+          <w14:textOutline w14:w="0" w14:cap="flat" w14:cmpd="sng" w14:algn="ctr">
+            <w14:noFill/>
+            <w14:prstDash w14:val="solid"/>
+            <w14:round/>
+          </w14:textOutline>
+        </w:rPr>
+        <w:t>20</w:t>
+      </w:r>
+      <w:r>
+        <w:rPr>
+          <w:iCs/>
+          <w:color w:val="000000" w:themeColor="text1"/>
+          <w:lang w:val="en-GB"/>
+          <w14:shadow w14:blurRad="38100" w14:dist="19050" w14:dir="2700000" w14:sx="100000" w14:sy="100000" w14:kx="0" w14:ky="0" w14:algn="tl">
+            <w14:schemeClr w14:val="dk1">
+              <w14:alpha w14:val="60000"/>
+            </w14:schemeClr>
+          </w14:shadow>
+          <w14:textOutline w14:w="0" w14:cap="flat" w14:cmpd="sng" w14:algn="ctr">
+            <w14:noFill/>
+            <w14:prstDash w14:val="solid"/>
+            <w14:round/>
+          </w14:textOutline>
+        </w:rPr>
+        <w:t>}}</w:t>
+      </w:r>
+    </w:p>
+    <w:p>
+      <w:pPr>
+        <w:pStyle w:val="Textkrper"/>
+        <w:kinsoku w:val="0"/>
+        <w:overflowPunct w:val="0"/>
+        <w:spacing w:after="240"/>
+        <w:ind w:right="-35"/>
+        <w:jc w:val="both"/>
+        <w:rPr>
+          <w:i/>
+          <w:color w:val="4AA55B"/>
+          <w:lang w:val="en-GB"/>
+        </w:rPr>
+      </w:pPr>
+      <w:r>
+        <w:rPr>
+          <w:i/>
+          <w:color w:val="4AA55B"/>
+          <w:lang w:val="en-GB"/>
+        </w:rPr>
+        <w:t>Will documentation or reference about any software be needed to access or read the data be included? Will it be possible to include the relevant software (</w:t>
+      </w:r>
+      <w:proofErr w:type="gramStart"/>
+      <w:r>
+        <w:rPr>
+          <w:i/>
+          <w:color w:val="4AA55B"/>
+          <w:lang w:val="en-GB"/>
+        </w:rPr>
+        <w:t>e.g.</w:t>
+      </w:r>
+      <w:proofErr w:type="gramEnd"/>
+      <w:r>
+        <w:rPr>
+          <w:i/>
+          <w:color w:val="4AA55B"/>
+          <w:lang w:val="en-GB"/>
+        </w:rPr>
+        <w:t xml:space="preserve"> in open source code)?</w:t>
+      </w:r>
+    </w:p>
+    <w:p>
+      <w:pPr>
+        <w:pStyle w:val="Textkrper"/>
+        <w:kinsoku w:val="0"/>
+        <w:overflowPunct w:val="0"/>
+        <w:spacing w:after="240"/>
+        <w:ind w:right="-35"/>
+        <w:jc w:val="both"/>
+        <w:rPr>
+          <w:iCs/>
+          <w:color w:val="000000" w:themeColor="text1"/>
+          <w:lang w:val="en-GB"/>
+          <w14:shadow w14:blurRad="38100" w14:dist="19050" w14:dir="2700000" w14:sx="100000" w14:sy="100000" w14:kx="0" w14:ky="0" w14:algn="tl">
+            <w14:schemeClr w14:val="dk1">
+              <w14:alpha w14:val="60000"/>
+            </w14:schemeClr>
+          </w14:shadow>
+          <w14:textOutline w14:w="0" w14:cap="flat" w14:cmpd="sng" w14:algn="ctr">
+            <w14:noFill/>
+            <w14:prstDash w14:val="solid"/>
+            <w14:round/>
+          </w14:textOutline>
+        </w:rPr>
+      </w:pPr>
+      <w:r>
+        <w:rPr>
+          <w:iCs/>
+          <w:color w:val="000000" w:themeColor="text1"/>
+          <w:lang w:val="en-GB"/>
+          <w14:shadow w14:blurRad="38100" w14:dist="19050" w14:dir="2700000" w14:sx="100000" w14:sy="100000" w14:kx="0" w14:ky="0" w14:algn="tl">
+            <w14:schemeClr w14:val="dk1">
+              <w14:alpha w14:val="60000"/>
+            </w14:schemeClr>
+          </w14:shadow>
+          <w14:textOutline w14:w="0" w14:cap="flat" w14:cmpd="sng" w14:algn="ctr">
+            <w14:noFill/>
+            <w14:prstDash w14:val="solid"/>
+            <w14:round/>
+          </w14:textOutline>
+        </w:rPr>
+        <w:t>{{Answer</w:t>
+      </w:r>
+      <w:r>
+        <w:rPr>
+          <w:iCs/>
+          <w:color w:val="000000" w:themeColor="text1"/>
+          <w:lang w:val="en-GB"/>
+          <w14:shadow w14:blurRad="38100" w14:dist="19050" w14:dir="2700000" w14:sx="100000" w14:sy="100000" w14:kx="0" w14:ky="0" w14:algn="tl">
+            <w14:schemeClr w14:val="dk1">
+              <w14:alpha w14:val="60000"/>
+            </w14:schemeClr>
+          </w14:shadow>
+          <w14:textOutline w14:w="0" w14:cap="flat" w14:cmpd="sng" w14:algn="ctr">
+            <w14:noFill/>
+            <w14:prstDash w14:val="solid"/>
+            <w14:round/>
+          </w14:textOutline>
+        </w:rPr>
+        <w:t>21</w:t>
+      </w:r>
+      <w:r>
+        <w:rPr>
+          <w:iCs/>
+          <w:color w:val="000000" w:themeColor="text1"/>
+          <w:lang w:val="en-GB"/>
+          <w14:shadow w14:blurRad="38100" w14:dist="19050" w14:dir="2700000" w14:sx="100000" w14:sy="100000" w14:kx="0" w14:ky="0" w14:algn="tl">
+            <w14:schemeClr w14:val="dk1">
+              <w14:alpha w14:val="60000"/>
+            </w14:schemeClr>
+          </w14:shadow>
+          <w14:textOutline w14:w="0" w14:cap="flat" w14:cmpd="sng" w14:algn="ctr">
+            <w14:noFill/>
+            <w14:prstDash w14:val="solid"/>
+            <w14:round/>
+          </w14:textOutline>
+        </w:rPr>
+        <w:t>}}</w:t>
       </w:r>
     </w:p>
     <w:p>
@@ -1727,197 +2844,857 @@
         <w:ind w:right="-35"/>
         <w:jc w:val="both"/>
         <w:rPr>
-          <w:i/>
-          <w:color w:val="4AA55B"/>
-          <w:lang w:val="en-GB"/>
-        </w:rPr>
-      </w:pPr>
-      <w:r>
-        <w:rPr>
-          <w:i/>
-          <w:color w:val="4AA55B"/>
-          <w:lang w:val="en-GB"/>
-        </w:rPr>
-        <w:t xml:space="preserve">In case it is unavoidable that you use uncommon or generate project specific ontologies or vocabularies, will </w:t>
-      </w:r>
-      <w:r>
-        <w:rPr>
-          <w:i/>
-          <w:color w:val="4AA55B"/>
-          <w:lang w:val="en-GB"/>
+          <w:iCs/>
+          <w:color w:val="000000" w:themeColor="text1"/>
+          <w:lang w:val="en-GB"/>
+          <w14:shadow w14:blurRad="38100" w14:dist="19050" w14:dir="2700000" w14:sx="100000" w14:sy="100000" w14:kx="0" w14:ky="0" w14:algn="tl">
+            <w14:schemeClr w14:val="dk1">
+              <w14:alpha w14:val="60000"/>
+            </w14:schemeClr>
+          </w14:shadow>
+          <w14:textOutline w14:w="0" w14:cap="flat" w14:cmpd="sng" w14:algn="ctr">
+            <w14:noFill/>
+            <w14:prstDash w14:val="solid"/>
+            <w14:round/>
+          </w14:textOutline>
+        </w:rPr>
+      </w:pPr>
+      <w:r>
+        <w:rPr>
+          <w:iCs/>
+          <w:color w:val="000000" w:themeColor="text1"/>
+          <w:lang w:val="en-GB"/>
+          <w14:shadow w14:blurRad="38100" w14:dist="19050" w14:dir="2700000" w14:sx="100000" w14:sy="100000" w14:kx="0" w14:ky="0" w14:algn="tl">
+            <w14:schemeClr w14:val="dk1">
+              <w14:alpha w14:val="60000"/>
+            </w14:schemeClr>
+          </w14:shadow>
+          <w14:textOutline w14:w="0" w14:cap="flat" w14:cmpd="sng" w14:algn="ctr">
+            <w14:noFill/>
+            <w14:prstDash w14:val="solid"/>
+            <w14:round/>
+          </w14:textOutline>
+        </w:rPr>
+        <w:t>{{Answer</w:t>
+      </w:r>
+      <w:r>
+        <w:rPr>
+          <w:iCs/>
+          <w:color w:val="000000" w:themeColor="text1"/>
+          <w:lang w:val="en-GB"/>
+          <w14:shadow w14:blurRad="38100" w14:dist="19050" w14:dir="2700000" w14:sx="100000" w14:sy="100000" w14:kx="0" w14:ky="0" w14:algn="tl">
+            <w14:schemeClr w14:val="dk1">
+              <w14:alpha w14:val="60000"/>
+            </w14:schemeClr>
+          </w14:shadow>
+          <w14:textOutline w14:w="0" w14:cap="flat" w14:cmpd="sng" w14:algn="ctr">
+            <w14:noFill/>
+            <w14:prstDash w14:val="solid"/>
+            <w14:round/>
+          </w14:textOutline>
+        </w:rPr>
+        <w:t>22</w:t>
+      </w:r>
+      <w:r>
+        <w:rPr>
+          <w:iCs/>
+          <w:color w:val="000000" w:themeColor="text1"/>
+          <w:lang w:val="en-GB"/>
+          <w14:shadow w14:blurRad="38100" w14:dist="19050" w14:dir="2700000" w14:sx="100000" w14:sy="100000" w14:kx="0" w14:ky="0" w14:algn="tl">
+            <w14:schemeClr w14:val="dk1">
+              <w14:alpha w14:val="60000"/>
+            </w14:schemeClr>
+          </w14:shadow>
+          <w14:textOutline w14:w="0" w14:cap="flat" w14:cmpd="sng" w14:algn="ctr">
+            <w14:noFill/>
+            <w14:prstDash w14:val="solid"/>
+            <w14:round/>
+          </w14:textOutline>
+        </w:rPr>
+        <w:t>}}</w:t>
+      </w:r>
+    </w:p>
+    <w:p>
+      <w:pPr>
+        <w:pStyle w:val="Textkrper"/>
+        <w:kinsoku w:val="0"/>
+        <w:overflowPunct w:val="0"/>
+        <w:spacing w:after="240"/>
+        <w:ind w:right="-35"/>
+        <w:jc w:val="both"/>
+        <w:rPr>
+          <w:i/>
+          <w:color w:val="4AA55B"/>
+          <w:lang w:val="en-GB"/>
+        </w:rPr>
+      </w:pPr>
+      <w:r>
+        <w:rPr>
+          <w:i/>
+          <w:color w:val="4AA55B"/>
+          <w:lang w:val="en-GB"/>
+        </w:rPr>
+        <w:t>In case it is unavoidable that you use uncommon or generate project specific ontologies or vocabularies, will you provide mappings to more commonly used ontologies? Will you openly publish the generated ontologies or vocabularies to allow reusing, refining or extending them?</w:t>
+      </w:r>
+    </w:p>
+    <w:p>
+      <w:pPr>
+        <w:pStyle w:val="Textkrper"/>
+        <w:kinsoku w:val="0"/>
+        <w:overflowPunct w:val="0"/>
+        <w:spacing w:after="240"/>
+        <w:ind w:right="-35"/>
+        <w:jc w:val="both"/>
+        <w:rPr>
+          <w:iCs/>
+          <w:color w:val="000000" w:themeColor="text1"/>
+          <w:lang w:val="en-GB"/>
+          <w14:shadow w14:blurRad="38100" w14:dist="19050" w14:dir="2700000" w14:sx="100000" w14:sy="100000" w14:kx="0" w14:ky="0" w14:algn="tl">
+            <w14:schemeClr w14:val="dk1">
+              <w14:alpha w14:val="60000"/>
+            </w14:schemeClr>
+          </w14:shadow>
+          <w14:textOutline w14:w="0" w14:cap="flat" w14:cmpd="sng" w14:algn="ctr">
+            <w14:noFill/>
+            <w14:prstDash w14:val="solid"/>
+            <w14:round/>
+          </w14:textOutline>
+        </w:rPr>
+      </w:pPr>
+      <w:r>
+        <w:rPr>
+          <w:iCs/>
+          <w:color w:val="000000" w:themeColor="text1"/>
+          <w:lang w:val="en-GB"/>
+          <w14:shadow w14:blurRad="38100" w14:dist="19050" w14:dir="2700000" w14:sx="100000" w14:sy="100000" w14:kx="0" w14:ky="0" w14:algn="tl">
+            <w14:schemeClr w14:val="dk1">
+              <w14:alpha w14:val="60000"/>
+            </w14:schemeClr>
+          </w14:shadow>
+          <w14:textOutline w14:w="0" w14:cap="flat" w14:cmpd="sng" w14:algn="ctr">
+            <w14:noFill/>
+            <w14:prstDash w14:val="solid"/>
+            <w14:round/>
+          </w14:textOutline>
+        </w:rPr>
+        <w:t>{{Answer</w:t>
+      </w:r>
+      <w:r>
+        <w:rPr>
+          <w:iCs/>
+          <w:color w:val="000000" w:themeColor="text1"/>
+          <w:lang w:val="en-GB"/>
+          <w14:shadow w14:blurRad="38100" w14:dist="19050" w14:dir="2700000" w14:sx="100000" w14:sy="100000" w14:kx="0" w14:ky="0" w14:algn="tl">
+            <w14:schemeClr w14:val="dk1">
+              <w14:alpha w14:val="60000"/>
+            </w14:schemeClr>
+          </w14:shadow>
+          <w14:textOutline w14:w="0" w14:cap="flat" w14:cmpd="sng" w14:algn="ctr">
+            <w14:noFill/>
+            <w14:prstDash w14:val="solid"/>
+            <w14:round/>
+          </w14:textOutline>
+        </w:rPr>
+        <w:t>23</w:t>
+      </w:r>
+      <w:r>
+        <w:rPr>
+          <w:iCs/>
+          <w:color w:val="000000" w:themeColor="text1"/>
+          <w:lang w:val="en-GB"/>
+          <w14:shadow w14:blurRad="38100" w14:dist="19050" w14:dir="2700000" w14:sx="100000" w14:sy="100000" w14:kx="0" w14:ky="0" w14:algn="tl">
+            <w14:schemeClr w14:val="dk1">
+              <w14:alpha w14:val="60000"/>
+            </w14:schemeClr>
+          </w14:shadow>
+          <w14:textOutline w14:w="0" w14:cap="flat" w14:cmpd="sng" w14:algn="ctr">
+            <w14:noFill/>
+            <w14:prstDash w14:val="solid"/>
+            <w14:round/>
+          </w14:textOutline>
+        </w:rPr>
+        <w:t>}}</w:t>
+      </w:r>
+    </w:p>
+    <w:p>
+      <w:pPr>
+        <w:pStyle w:val="Textkrper"/>
+        <w:kinsoku w:val="0"/>
+        <w:overflowPunct w:val="0"/>
+        <w:spacing w:after="240"/>
+        <w:ind w:right="-35"/>
+        <w:jc w:val="both"/>
+        <w:rPr>
+          <w:i/>
+          <w:color w:val="4AA55B"/>
+          <w:lang w:val="en-GB"/>
+        </w:rPr>
+      </w:pPr>
+      <w:r>
+        <w:rPr>
+          <w:i/>
+          <w:color w:val="4AA55B"/>
+          <w:lang w:val="en-GB"/>
+        </w:rPr>
+        <w:t>Will your data include qualified references</w:t>
+      </w:r>
+      <w:r>
+        <w:rPr>
+          <w:i/>
+          <w:color w:val="4AA55B"/>
+          <w:lang w:val="en-GB"/>
+        </w:rPr>
+        <w:footnoteReference w:id="2"/>
+      </w:r>
+      <w:r>
+        <w:rPr>
+          <w:i/>
+          <w:color w:val="4AA55B"/>
+          <w:lang w:val="en-GB"/>
+        </w:rPr>
+        <w:t xml:space="preserve"> to other data (</w:t>
+      </w:r>
+      <w:proofErr w:type="gramStart"/>
+      <w:r>
+        <w:rPr>
+          <w:i/>
+          <w:color w:val="4AA55B"/>
+          <w:lang w:val="en-GB"/>
+        </w:rPr>
+        <w:t>e.g.</w:t>
+      </w:r>
+      <w:proofErr w:type="gramEnd"/>
+      <w:r>
+        <w:rPr>
+          <w:i/>
+          <w:color w:val="4AA55B"/>
+          <w:lang w:val="en-GB"/>
+        </w:rPr>
+        <w:t xml:space="preserve"> other data from your project, or datasets from previous research)?</w:t>
+      </w:r>
+    </w:p>
+    <w:p>
+      <w:pPr>
+        <w:pStyle w:val="Textkrper"/>
+        <w:kinsoku w:val="0"/>
+        <w:overflowPunct w:val="0"/>
+        <w:spacing w:after="240"/>
+        <w:ind w:right="-35"/>
+        <w:jc w:val="both"/>
+        <w:rPr>
+          <w:iCs/>
+          <w:color w:val="000000" w:themeColor="text1"/>
+          <w:lang w:val="en-GB"/>
+          <w14:shadow w14:blurRad="38100" w14:dist="19050" w14:dir="2700000" w14:sx="100000" w14:sy="100000" w14:kx="0" w14:ky="0" w14:algn="tl">
+            <w14:schemeClr w14:val="dk1">
+              <w14:alpha w14:val="60000"/>
+            </w14:schemeClr>
+          </w14:shadow>
+          <w14:textOutline w14:w="0" w14:cap="flat" w14:cmpd="sng" w14:algn="ctr">
+            <w14:noFill/>
+            <w14:prstDash w14:val="solid"/>
+            <w14:round/>
+          </w14:textOutline>
+        </w:rPr>
+      </w:pPr>
+      <w:r>
+        <w:rPr>
+          <w:iCs/>
+          <w:color w:val="000000" w:themeColor="text1"/>
+          <w:lang w:val="en-GB"/>
+          <w14:shadow w14:blurRad="38100" w14:dist="19050" w14:dir="2700000" w14:sx="100000" w14:sy="100000" w14:kx="0" w14:ky="0" w14:algn="tl">
+            <w14:schemeClr w14:val="dk1">
+              <w14:alpha w14:val="60000"/>
+            </w14:schemeClr>
+          </w14:shadow>
+          <w14:textOutline w14:w="0" w14:cap="flat" w14:cmpd="sng" w14:algn="ctr">
+            <w14:noFill/>
+            <w14:prstDash w14:val="solid"/>
+            <w14:round/>
+          </w14:textOutline>
+        </w:rPr>
+        <w:t>{{Answer</w:t>
+      </w:r>
+      <w:r>
+        <w:rPr>
+          <w:iCs/>
+          <w:color w:val="000000" w:themeColor="text1"/>
+          <w:lang w:val="en-GB"/>
+          <w14:shadow w14:blurRad="38100" w14:dist="19050" w14:dir="2700000" w14:sx="100000" w14:sy="100000" w14:kx="0" w14:ky="0" w14:algn="tl">
+            <w14:schemeClr w14:val="dk1">
+              <w14:alpha w14:val="60000"/>
+            </w14:schemeClr>
+          </w14:shadow>
+          <w14:textOutline w14:w="0" w14:cap="flat" w14:cmpd="sng" w14:algn="ctr">
+            <w14:noFill/>
+            <w14:prstDash w14:val="solid"/>
+            <w14:round/>
+          </w14:textOutline>
+        </w:rPr>
+        <w:t>24</w:t>
+      </w:r>
+      <w:r>
+        <w:rPr>
+          <w:iCs/>
+          <w:color w:val="000000" w:themeColor="text1"/>
+          <w:lang w:val="en-GB"/>
+          <w14:shadow w14:blurRad="38100" w14:dist="19050" w14:dir="2700000" w14:sx="100000" w14:sy="100000" w14:kx="0" w14:ky="0" w14:algn="tl">
+            <w14:schemeClr w14:val="dk1">
+              <w14:alpha w14:val="60000"/>
+            </w14:schemeClr>
+          </w14:shadow>
+          <w14:textOutline w14:w="0" w14:cap="flat" w14:cmpd="sng" w14:algn="ctr">
+            <w14:noFill/>
+            <w14:prstDash w14:val="solid"/>
+            <w14:round/>
+          </w14:textOutline>
+        </w:rPr>
+        <w:t>}}</w:t>
+      </w:r>
+    </w:p>
+    <w:p>
+      <w:pPr>
+        <w:pStyle w:val="berschrift3"/>
+      </w:pPr>
+      <w:r>
+        <w:t>Increase data re-use</w:t>
+      </w:r>
+    </w:p>
+    <w:p>
+      <w:pPr>
+        <w:pStyle w:val="Textkrper"/>
+        <w:kinsoku w:val="0"/>
+        <w:overflowPunct w:val="0"/>
+        <w:spacing w:after="240"/>
+        <w:ind w:right="-35"/>
+        <w:jc w:val="both"/>
+        <w:rPr>
+          <w:i/>
+          <w:color w:val="4AA55B"/>
+          <w:lang w:val="en-GB"/>
+        </w:rPr>
+      </w:pPr>
+      <w:r>
+        <w:rPr>
+          <w:i/>
+          <w:color w:val="4AA55B"/>
+          <w:lang w:val="en-GB"/>
+        </w:rPr>
+        <w:t>How will you provide documentation needed to validate data analysis and facilitate data re-use (</w:t>
+      </w:r>
+      <w:proofErr w:type="gramStart"/>
+      <w:r>
+        <w:rPr>
+          <w:i/>
+          <w:color w:val="4AA55B"/>
+          <w:lang w:val="en-GB"/>
+        </w:rPr>
+        <w:t>e.g.</w:t>
+      </w:r>
+      <w:proofErr w:type="gramEnd"/>
+      <w:r>
+        <w:rPr>
+          <w:i/>
+          <w:color w:val="4AA55B"/>
+          <w:lang w:val="en-GB"/>
+        </w:rPr>
+        <w:t xml:space="preserve"> readme files with information on methodology, codebooks, data cleaning, analyses, variable definitions, units of measurement, etc.)?</w:t>
+      </w:r>
+    </w:p>
+    <w:p>
+      <w:pPr>
+        <w:pStyle w:val="Textkrper"/>
+        <w:kinsoku w:val="0"/>
+        <w:overflowPunct w:val="0"/>
+        <w:spacing w:after="240"/>
+        <w:ind w:right="-35"/>
+        <w:jc w:val="both"/>
+        <w:rPr>
+          <w:iCs/>
+          <w:color w:val="000000" w:themeColor="text1"/>
+          <w:lang w:val="en-GB"/>
+          <w14:shadow w14:blurRad="38100" w14:dist="19050" w14:dir="2700000" w14:sx="100000" w14:sy="100000" w14:kx="0" w14:ky="0" w14:algn="tl">
+            <w14:schemeClr w14:val="dk1">
+              <w14:alpha w14:val="60000"/>
+            </w14:schemeClr>
+          </w14:shadow>
+          <w14:textOutline w14:w="0" w14:cap="flat" w14:cmpd="sng" w14:algn="ctr">
+            <w14:noFill/>
+            <w14:prstDash w14:val="solid"/>
+            <w14:round/>
+          </w14:textOutline>
+        </w:rPr>
+      </w:pPr>
+      <w:r>
+        <w:rPr>
+          <w:iCs/>
+          <w:color w:val="000000" w:themeColor="text1"/>
+          <w:lang w:val="en-GB"/>
+          <w14:shadow w14:blurRad="38100" w14:dist="19050" w14:dir="2700000" w14:sx="100000" w14:sy="100000" w14:kx="0" w14:ky="0" w14:algn="tl">
+            <w14:schemeClr w14:val="dk1">
+              <w14:alpha w14:val="60000"/>
+            </w14:schemeClr>
+          </w14:shadow>
+          <w14:textOutline w14:w="0" w14:cap="flat" w14:cmpd="sng" w14:algn="ctr">
+            <w14:noFill/>
+            <w14:prstDash w14:val="solid"/>
+            <w14:round/>
+          </w14:textOutline>
+        </w:rPr>
+        <w:t>{{Answer</w:t>
+      </w:r>
+      <w:r>
+        <w:rPr>
+          <w:iCs/>
+          <w:color w:val="000000" w:themeColor="text1"/>
+          <w:lang w:val="en-GB"/>
+          <w14:shadow w14:blurRad="38100" w14:dist="19050" w14:dir="2700000" w14:sx="100000" w14:sy="100000" w14:kx="0" w14:ky="0" w14:algn="tl">
+            <w14:schemeClr w14:val="dk1">
+              <w14:alpha w14:val="60000"/>
+            </w14:schemeClr>
+          </w14:shadow>
+          <w14:textOutline w14:w="0" w14:cap="flat" w14:cmpd="sng" w14:algn="ctr">
+            <w14:noFill/>
+            <w14:prstDash w14:val="solid"/>
+            <w14:round/>
+          </w14:textOutline>
+        </w:rPr>
+        <w:t>25</w:t>
+      </w:r>
+      <w:r>
+        <w:rPr>
+          <w:iCs/>
+          <w:color w:val="000000" w:themeColor="text1"/>
+          <w:lang w:val="en-GB"/>
+          <w14:shadow w14:blurRad="38100" w14:dist="19050" w14:dir="2700000" w14:sx="100000" w14:sy="100000" w14:kx="0" w14:ky="0" w14:algn="tl">
+            <w14:schemeClr w14:val="dk1">
+              <w14:alpha w14:val="60000"/>
+            </w14:schemeClr>
+          </w14:shadow>
+          <w14:textOutline w14:w="0" w14:cap="flat" w14:cmpd="sng" w14:algn="ctr">
+            <w14:noFill/>
+            <w14:prstDash w14:val="solid"/>
+            <w14:round/>
+          </w14:textOutline>
+        </w:rPr>
+        <w:t>}}</w:t>
+      </w:r>
+    </w:p>
+    <w:p>
+      <w:pPr>
+        <w:pStyle w:val="Textkrper"/>
+        <w:kinsoku w:val="0"/>
+        <w:overflowPunct w:val="0"/>
+        <w:spacing w:after="240"/>
+        <w:ind w:right="-35"/>
+        <w:jc w:val="both"/>
+        <w:rPr>
+          <w:i/>
+          <w:color w:val="4AA55B"/>
+          <w:lang w:val="en-GB"/>
+        </w:rPr>
+      </w:pPr>
+      <w:r>
+        <w:rPr>
+          <w:i/>
+          <w:color w:val="4AA55B"/>
+          <w:lang w:val="en-GB"/>
+        </w:rPr>
+        <w:t>Will your data be made freely available in the public domain to permit the widest re-use possible? Will your data be licensed using standard reuse licenses, in line with the obligations set out in the Grant Agreement?</w:t>
+      </w:r>
+    </w:p>
+    <w:p>
+      <w:pPr>
+        <w:pStyle w:val="Textkrper"/>
+        <w:kinsoku w:val="0"/>
+        <w:overflowPunct w:val="0"/>
+        <w:spacing w:after="240"/>
+        <w:ind w:right="-35"/>
+        <w:jc w:val="both"/>
+        <w:rPr>
+          <w:iCs/>
+          <w:color w:val="000000" w:themeColor="text1"/>
+          <w:lang w:val="en-GB"/>
+          <w14:shadow w14:blurRad="38100" w14:dist="19050" w14:dir="2700000" w14:sx="100000" w14:sy="100000" w14:kx="0" w14:ky="0" w14:algn="tl">
+            <w14:schemeClr w14:val="dk1">
+              <w14:alpha w14:val="60000"/>
+            </w14:schemeClr>
+          </w14:shadow>
+          <w14:textOutline w14:w="0" w14:cap="flat" w14:cmpd="sng" w14:algn="ctr">
+            <w14:noFill/>
+            <w14:prstDash w14:val="solid"/>
+            <w14:round/>
+          </w14:textOutline>
+        </w:rPr>
+      </w:pPr>
+      <w:r>
+        <w:rPr>
+          <w:iCs/>
+          <w:color w:val="000000" w:themeColor="text1"/>
+          <w:lang w:val="en-GB"/>
+          <w14:shadow w14:blurRad="38100" w14:dist="19050" w14:dir="2700000" w14:sx="100000" w14:sy="100000" w14:kx="0" w14:ky="0" w14:algn="tl">
+            <w14:schemeClr w14:val="dk1">
+              <w14:alpha w14:val="60000"/>
+            </w14:schemeClr>
+          </w14:shadow>
+          <w14:textOutline w14:w="0" w14:cap="flat" w14:cmpd="sng" w14:algn="ctr">
+            <w14:noFill/>
+            <w14:prstDash w14:val="solid"/>
+            <w14:round/>
+          </w14:textOutline>
+        </w:rPr>
+        <w:t>{{Answer</w:t>
+      </w:r>
+      <w:r>
+        <w:rPr>
+          <w:iCs/>
+          <w:color w:val="000000" w:themeColor="text1"/>
+          <w:lang w:val="en-GB"/>
+          <w14:shadow w14:blurRad="38100" w14:dist="19050" w14:dir="2700000" w14:sx="100000" w14:sy="100000" w14:kx="0" w14:ky="0" w14:algn="tl">
+            <w14:schemeClr w14:val="dk1">
+              <w14:alpha w14:val="60000"/>
+            </w14:schemeClr>
+          </w14:shadow>
+          <w14:textOutline w14:w="0" w14:cap="flat" w14:cmpd="sng" w14:algn="ctr">
+            <w14:noFill/>
+            <w14:prstDash w14:val="solid"/>
+            <w14:round/>
+          </w14:textOutline>
+        </w:rPr>
+        <w:t>26</w:t>
+      </w:r>
+      <w:r>
+        <w:rPr>
+          <w:iCs/>
+          <w:color w:val="000000" w:themeColor="text1"/>
+          <w:lang w:val="en-GB"/>
+          <w14:shadow w14:blurRad="38100" w14:dist="19050" w14:dir="2700000" w14:sx="100000" w14:sy="100000" w14:kx="0" w14:ky="0" w14:algn="tl">
+            <w14:schemeClr w14:val="dk1">
+              <w14:alpha w14:val="60000"/>
+            </w14:schemeClr>
+          </w14:shadow>
+          <w14:textOutline w14:w="0" w14:cap="flat" w14:cmpd="sng" w14:algn="ctr">
+            <w14:noFill/>
+            <w14:prstDash w14:val="solid"/>
+            <w14:round/>
+          </w14:textOutline>
+        </w:rPr>
+        <w:t>}}</w:t>
+      </w:r>
+    </w:p>
+    <w:p>
+      <w:pPr>
+        <w:pStyle w:val="Textkrper"/>
+        <w:kinsoku w:val="0"/>
+        <w:overflowPunct w:val="0"/>
+        <w:spacing w:after="240"/>
+        <w:ind w:right="-35"/>
+        <w:jc w:val="both"/>
+        <w:rPr>
+          <w:i/>
+          <w:color w:val="4AA55B"/>
+          <w:lang w:val="en-GB"/>
+        </w:rPr>
+      </w:pPr>
+      <w:r>
+        <w:rPr>
+          <w:i/>
+          <w:color w:val="4AA55B"/>
+          <w:lang w:val="en-GB"/>
+        </w:rPr>
+        <w:t>Will the data produced in the project be useable by third parties, in particular after the end of the project?</w:t>
+      </w:r>
+    </w:p>
+    <w:p>
+      <w:pPr>
+        <w:pStyle w:val="Textkrper"/>
+        <w:kinsoku w:val="0"/>
+        <w:overflowPunct w:val="0"/>
+        <w:spacing w:after="240"/>
+        <w:ind w:right="-35"/>
+        <w:jc w:val="both"/>
+        <w:rPr>
+          <w:iCs/>
+          <w:color w:val="000000" w:themeColor="text1"/>
+          <w:lang w:val="en-GB"/>
+          <w14:shadow w14:blurRad="38100" w14:dist="19050" w14:dir="2700000" w14:sx="100000" w14:sy="100000" w14:kx="0" w14:ky="0" w14:algn="tl">
+            <w14:schemeClr w14:val="dk1">
+              <w14:alpha w14:val="60000"/>
+            </w14:schemeClr>
+          </w14:shadow>
+          <w14:textOutline w14:w="0" w14:cap="flat" w14:cmpd="sng" w14:algn="ctr">
+            <w14:noFill/>
+            <w14:prstDash w14:val="solid"/>
+            <w14:round/>
+          </w14:textOutline>
+        </w:rPr>
+      </w:pPr>
+      <w:r>
+        <w:rPr>
+          <w:iCs/>
+          <w:color w:val="000000" w:themeColor="text1"/>
+          <w:lang w:val="en-GB"/>
+          <w14:shadow w14:blurRad="38100" w14:dist="19050" w14:dir="2700000" w14:sx="100000" w14:sy="100000" w14:kx="0" w14:ky="0" w14:algn="tl">
+            <w14:schemeClr w14:val="dk1">
+              <w14:alpha w14:val="60000"/>
+            </w14:schemeClr>
+          </w14:shadow>
+          <w14:textOutline w14:w="0" w14:cap="flat" w14:cmpd="sng" w14:algn="ctr">
+            <w14:noFill/>
+            <w14:prstDash w14:val="solid"/>
+            <w14:round/>
+          </w14:textOutline>
+        </w:rPr>
+        <w:t>{{Answer</w:t>
+      </w:r>
+      <w:r>
+        <w:rPr>
+          <w:iCs/>
+          <w:color w:val="000000" w:themeColor="text1"/>
+          <w:lang w:val="en-GB"/>
+          <w14:shadow w14:blurRad="38100" w14:dist="19050" w14:dir="2700000" w14:sx="100000" w14:sy="100000" w14:kx="0" w14:ky="0" w14:algn="tl">
+            <w14:schemeClr w14:val="dk1">
+              <w14:alpha w14:val="60000"/>
+            </w14:schemeClr>
+          </w14:shadow>
+          <w14:textOutline w14:w="0" w14:cap="flat" w14:cmpd="sng" w14:algn="ctr">
+            <w14:noFill/>
+            <w14:prstDash w14:val="solid"/>
+            <w14:round/>
+          </w14:textOutline>
+        </w:rPr>
+        <w:t>27</w:t>
+      </w:r>
+      <w:r>
+        <w:rPr>
+          <w:iCs/>
+          <w:color w:val="000000" w:themeColor="text1"/>
+          <w:lang w:val="en-GB"/>
+          <w14:shadow w14:blurRad="38100" w14:dist="19050" w14:dir="2700000" w14:sx="100000" w14:sy="100000" w14:kx="0" w14:ky="0" w14:algn="tl">
+            <w14:schemeClr w14:val="dk1">
+              <w14:alpha w14:val="60000"/>
+            </w14:schemeClr>
+          </w14:shadow>
+          <w14:textOutline w14:w="0" w14:cap="flat" w14:cmpd="sng" w14:algn="ctr">
+            <w14:noFill/>
+            <w14:prstDash w14:val="solid"/>
+            <w14:round/>
+          </w14:textOutline>
+        </w:rPr>
+        <w:t>}}</w:t>
+      </w:r>
+    </w:p>
+    <w:p>
+      <w:pPr>
+        <w:pStyle w:val="Textkrper"/>
+        <w:kinsoku w:val="0"/>
+        <w:overflowPunct w:val="0"/>
+        <w:spacing w:after="240"/>
+        <w:ind w:right="-35"/>
+        <w:jc w:val="both"/>
+        <w:rPr>
+          <w:i/>
+          <w:color w:val="4AA55B"/>
+          <w:lang w:val="en-GB"/>
+        </w:rPr>
+      </w:pPr>
+      <w:r>
+        <w:rPr>
+          <w:i/>
+          <w:color w:val="4AA55B"/>
+          <w:lang w:val="en-GB"/>
+        </w:rPr>
+        <w:t>Will the provenance of the data be thoroughly documented using the appropriate standards?</w:t>
+      </w:r>
+    </w:p>
+    <w:p>
+      <w:pPr>
+        <w:pStyle w:val="Textkrper"/>
+        <w:kinsoku w:val="0"/>
+        <w:overflowPunct w:val="0"/>
+        <w:spacing w:after="240"/>
+        <w:ind w:right="-35"/>
+        <w:jc w:val="both"/>
+        <w:rPr>
+          <w:iCs/>
+          <w:color w:val="000000" w:themeColor="text1"/>
+          <w:lang w:val="en-GB"/>
+          <w14:shadow w14:blurRad="38100" w14:dist="19050" w14:dir="2700000" w14:sx="100000" w14:sy="100000" w14:kx="0" w14:ky="0" w14:algn="tl">
+            <w14:schemeClr w14:val="dk1">
+              <w14:alpha w14:val="60000"/>
+            </w14:schemeClr>
+          </w14:shadow>
+          <w14:textOutline w14:w="0" w14:cap="flat" w14:cmpd="sng" w14:algn="ctr">
+            <w14:noFill/>
+            <w14:prstDash w14:val="solid"/>
+            <w14:round/>
+          </w14:textOutline>
+        </w:rPr>
+      </w:pPr>
+      <w:r>
+        <w:rPr>
+          <w:iCs/>
+          <w:color w:val="000000" w:themeColor="text1"/>
+          <w:lang w:val="en-GB"/>
+          <w14:shadow w14:blurRad="38100" w14:dist="19050" w14:dir="2700000" w14:sx="100000" w14:sy="100000" w14:kx="0" w14:ky="0" w14:algn="tl">
+            <w14:schemeClr w14:val="dk1">
+              <w14:alpha w14:val="60000"/>
+            </w14:schemeClr>
+          </w14:shadow>
+          <w14:textOutline w14:w="0" w14:cap="flat" w14:cmpd="sng" w14:algn="ctr">
+            <w14:noFill/>
+            <w14:prstDash w14:val="solid"/>
+            <w14:round/>
+          </w14:textOutline>
+        </w:rPr>
+        <w:t>{{Answer</w:t>
+      </w:r>
+      <w:r>
+        <w:rPr>
+          <w:iCs/>
+          <w:color w:val="000000" w:themeColor="text1"/>
+          <w:lang w:val="en-GB"/>
+          <w14:shadow w14:blurRad="38100" w14:dist="19050" w14:dir="2700000" w14:sx="100000" w14:sy="100000" w14:kx="0" w14:ky="0" w14:algn="tl">
+            <w14:schemeClr w14:val="dk1">
+              <w14:alpha w14:val="60000"/>
+            </w14:schemeClr>
+          </w14:shadow>
+          <w14:textOutline w14:w="0" w14:cap="flat" w14:cmpd="sng" w14:algn="ctr">
+            <w14:noFill/>
+            <w14:prstDash w14:val="solid"/>
+            <w14:round/>
+          </w14:textOutline>
+        </w:rPr>
+        <w:t>28</w:t>
+      </w:r>
+      <w:r>
+        <w:rPr>
+          <w:iCs/>
+          <w:color w:val="000000" w:themeColor="text1"/>
+          <w:lang w:val="en-GB"/>
+          <w14:shadow w14:blurRad="38100" w14:dist="19050" w14:dir="2700000" w14:sx="100000" w14:sy="100000" w14:kx="0" w14:ky="0" w14:algn="tl">
+            <w14:schemeClr w14:val="dk1">
+              <w14:alpha w14:val="60000"/>
+            </w14:schemeClr>
+          </w14:shadow>
+          <w14:textOutline w14:w="0" w14:cap="flat" w14:cmpd="sng" w14:algn="ctr">
+            <w14:noFill/>
+            <w14:prstDash w14:val="solid"/>
+            <w14:round/>
+          </w14:textOutline>
+        </w:rPr>
+        <w:t>}}</w:t>
+      </w:r>
+    </w:p>
+    <w:p>
+      <w:pPr>
+        <w:pStyle w:val="Textkrper"/>
+        <w:kinsoku w:val="0"/>
+        <w:overflowPunct w:val="0"/>
+        <w:spacing w:after="240"/>
+        <w:ind w:right="-35"/>
+        <w:jc w:val="both"/>
+        <w:rPr>
+          <w:i/>
+          <w:color w:val="4AA55B"/>
+          <w:lang w:val="en-GB"/>
+        </w:rPr>
+      </w:pPr>
+      <w:r>
+        <w:rPr>
+          <w:i/>
+          <w:color w:val="4AA55B"/>
+          <w:lang w:val="en-GB"/>
+        </w:rPr>
+        <w:t>Describe all relevant d</w:t>
+      </w:r>
+      <w:r>
+        <w:rPr>
+          <w:i/>
+          <w:color w:val="4AA55B"/>
+          <w:lang w:val="en-GB"/>
+        </w:rPr>
+        <w:t>ata quality assurance processes.</w:t>
+      </w:r>
+    </w:p>
+    <w:p>
+      <w:pPr>
+        <w:pStyle w:val="Textkrper"/>
+        <w:kinsoku w:val="0"/>
+        <w:overflowPunct w:val="0"/>
+        <w:spacing w:after="240"/>
+        <w:ind w:right="-35"/>
+        <w:jc w:val="both"/>
+        <w:rPr>
+          <w:iCs/>
+          <w:color w:val="000000" w:themeColor="text1"/>
+          <w:lang w:val="en-GB"/>
+          <w14:shadow w14:blurRad="38100" w14:dist="19050" w14:dir="2700000" w14:sx="100000" w14:sy="100000" w14:kx="0" w14:ky="0" w14:algn="tl">
+            <w14:schemeClr w14:val="dk1">
+              <w14:alpha w14:val="60000"/>
+            </w14:schemeClr>
+          </w14:shadow>
+          <w14:textOutline w14:w="0" w14:cap="flat" w14:cmpd="sng" w14:algn="ctr">
+            <w14:noFill/>
+            <w14:prstDash w14:val="solid"/>
+            <w14:round/>
+          </w14:textOutline>
+        </w:rPr>
+      </w:pPr>
+      <w:r>
+        <w:rPr>
+          <w:iCs/>
+          <w:color w:val="000000" w:themeColor="text1"/>
+          <w:lang w:val="en-GB"/>
+          <w14:shadow w14:blurRad="38100" w14:dist="19050" w14:dir="2700000" w14:sx="100000" w14:sy="100000" w14:kx="0" w14:ky="0" w14:algn="tl">
+            <w14:schemeClr w14:val="dk1">
+              <w14:alpha w14:val="60000"/>
+            </w14:schemeClr>
+          </w14:shadow>
+          <w14:textOutline w14:w="0" w14:cap="flat" w14:cmpd="sng" w14:algn="ctr">
+            <w14:noFill/>
+            <w14:prstDash w14:val="solid"/>
+            <w14:round/>
+          </w14:textOutline>
         </w:rPr>
         <w:lastRenderedPageBreak/>
-        <w:t>you provide mappings to more commonly used ontologies? Will you openly publish the generated ontologies or vocabularies to allow reusing, refining or extending them?</w:t>
-      </w:r>
-    </w:p>
-    <w:p>
-      <w:pPr>
-        <w:pStyle w:val="Textkrper"/>
-        <w:kinsoku w:val="0"/>
-        <w:overflowPunct w:val="0"/>
-        <w:spacing w:after="240"/>
-        <w:ind w:right="-35"/>
-        <w:jc w:val="both"/>
-        <w:rPr>
-          <w:i/>
-          <w:color w:val="4AA55B"/>
-          <w:lang w:val="en-GB"/>
-        </w:rPr>
-      </w:pPr>
-      <w:r>
-        <w:rPr>
-          <w:i/>
-          <w:color w:val="4AA55B"/>
-          <w:lang w:val="en-GB"/>
-        </w:rPr>
-        <w:t>Will your data include qualified references</w:t>
-      </w:r>
-      <w:r>
-        <w:rPr>
-          <w:i/>
-          <w:color w:val="4AA55B"/>
-          <w:lang w:val="en-GB"/>
-        </w:rPr>
-        <w:footnoteReference w:id="2"/>
-      </w:r>
-      <w:r>
-        <w:rPr>
-          <w:i/>
-          <w:color w:val="4AA55B"/>
-          <w:lang w:val="en-GB"/>
-        </w:rPr>
-        <w:t xml:space="preserve"> to other data (e.g. other data from your project, or datasets from previous research)?</w:t>
-      </w:r>
-    </w:p>
-    <w:p>
-      <w:pPr>
-        <w:pStyle w:val="berschrift3"/>
-      </w:pPr>
-      <w:r>
-        <w:t>Increase data re-use</w:t>
-      </w:r>
-    </w:p>
-    <w:p>
-      <w:pPr>
-        <w:pStyle w:val="Textkrper"/>
-        <w:kinsoku w:val="0"/>
-        <w:overflowPunct w:val="0"/>
-        <w:spacing w:after="240"/>
-        <w:ind w:right="-35"/>
-        <w:jc w:val="both"/>
-        <w:rPr>
-          <w:i/>
-          <w:color w:val="4AA55B"/>
-          <w:lang w:val="en-GB"/>
-        </w:rPr>
-      </w:pPr>
-      <w:r>
-        <w:rPr>
-          <w:i/>
-          <w:color w:val="4AA55B"/>
-          <w:lang w:val="en-GB"/>
-        </w:rPr>
-        <w:t>How will you provide documentation needed to validate data analysis and facilitate data re-use (e.g. readme files with information on methodology, codebooks, data cleaning, analyses, variable definitions, units of measurement, etc.)?</w:t>
-      </w:r>
-    </w:p>
-    <w:p>
-      <w:pPr>
-        <w:pStyle w:val="Textkrper"/>
-        <w:kinsoku w:val="0"/>
-        <w:overflowPunct w:val="0"/>
-        <w:spacing w:after="240"/>
-        <w:ind w:right="-35"/>
-        <w:jc w:val="both"/>
-        <w:rPr>
-          <w:i/>
-          <w:color w:val="4AA55B"/>
-          <w:lang w:val="en-GB"/>
-        </w:rPr>
-      </w:pPr>
-      <w:r>
-        <w:rPr>
-          <w:i/>
-          <w:color w:val="4AA55B"/>
-          <w:lang w:val="en-GB"/>
-        </w:rPr>
-        <w:t>Will your data be made freely available in the public domain to permit the widest re-use possible? Will your data be licensed using standard reuse licenses, in line with the obligations set out in the Grant Agreement?</w:t>
-      </w:r>
-    </w:p>
-    <w:p>
-      <w:pPr>
-        <w:pStyle w:val="Textkrper"/>
-        <w:kinsoku w:val="0"/>
-        <w:overflowPunct w:val="0"/>
-        <w:spacing w:after="240"/>
-        <w:ind w:right="-35"/>
-        <w:jc w:val="both"/>
-        <w:rPr>
-          <w:i/>
-          <w:color w:val="4AA55B"/>
-          <w:lang w:val="en-GB"/>
-        </w:rPr>
-      </w:pPr>
-      <w:r>
-        <w:rPr>
-          <w:i/>
-          <w:color w:val="4AA55B"/>
-          <w:lang w:val="en-GB"/>
-        </w:rPr>
-        <w:t>Will the data produced in the project be useable by third parties, in particular after the end of the project?</w:t>
-      </w:r>
-    </w:p>
-    <w:p>
-      <w:pPr>
-        <w:pStyle w:val="Textkrper"/>
-        <w:kinsoku w:val="0"/>
-        <w:overflowPunct w:val="0"/>
-        <w:spacing w:after="240"/>
-        <w:ind w:right="-35"/>
-        <w:jc w:val="both"/>
-        <w:rPr>
-          <w:i/>
-          <w:color w:val="4AA55B"/>
-          <w:lang w:val="en-GB"/>
-        </w:rPr>
-      </w:pPr>
-      <w:r>
-        <w:rPr>
-          <w:i/>
-          <w:color w:val="4AA55B"/>
-          <w:lang w:val="en-GB"/>
-        </w:rPr>
-        <w:t>Will the provenance of the data be thoroughly documented using the appropriate standards?</w:t>
-      </w:r>
-    </w:p>
-    <w:p>
-      <w:pPr>
-        <w:pStyle w:val="Textkrper"/>
-        <w:kinsoku w:val="0"/>
-        <w:overflowPunct w:val="0"/>
-        <w:spacing w:after="240"/>
-        <w:ind w:right="-35"/>
-        <w:jc w:val="both"/>
-        <w:rPr>
-          <w:i/>
-          <w:color w:val="4AA55B"/>
-          <w:lang w:val="en-GB"/>
-        </w:rPr>
-      </w:pPr>
-      <w:r>
-        <w:rPr>
-          <w:i/>
-          <w:color w:val="4AA55B"/>
-          <w:lang w:val="en-GB"/>
-        </w:rPr>
-        <w:t>Describe all relevant d</w:t>
-      </w:r>
-      <w:r>
-        <w:rPr>
-          <w:i/>
-          <w:color w:val="4AA55B"/>
-          <w:lang w:val="en-GB"/>
-        </w:rPr>
-        <w:t>ata quality assurance processes.</w:t>
+        <w:t>{{Answer</w:t>
+      </w:r>
+      <w:r>
+        <w:rPr>
+          <w:iCs/>
+          <w:color w:val="000000" w:themeColor="text1"/>
+          <w:lang w:val="en-GB"/>
+          <w14:shadow w14:blurRad="38100" w14:dist="19050" w14:dir="2700000" w14:sx="100000" w14:sy="100000" w14:kx="0" w14:ky="0" w14:algn="tl">
+            <w14:schemeClr w14:val="dk1">
+              <w14:alpha w14:val="60000"/>
+            </w14:schemeClr>
+          </w14:shadow>
+          <w14:textOutline w14:w="0" w14:cap="flat" w14:cmpd="sng" w14:algn="ctr">
+            <w14:noFill/>
+            <w14:prstDash w14:val="solid"/>
+            <w14:round/>
+          </w14:textOutline>
+        </w:rPr>
+        <w:t>2</w:t>
+      </w:r>
+      <w:r>
+        <w:rPr>
+          <w:iCs/>
+          <w:color w:val="000000" w:themeColor="text1"/>
+          <w:lang w:val="en-GB"/>
+          <w14:shadow w14:blurRad="38100" w14:dist="19050" w14:dir="2700000" w14:sx="100000" w14:sy="100000" w14:kx="0" w14:ky="0" w14:algn="tl">
+            <w14:schemeClr w14:val="dk1">
+              <w14:alpha w14:val="60000"/>
+            </w14:schemeClr>
+          </w14:shadow>
+          <w14:textOutline w14:w="0" w14:cap="flat" w14:cmpd="sng" w14:algn="ctr">
+            <w14:noFill/>
+            <w14:prstDash w14:val="solid"/>
+            <w14:round/>
+          </w14:textOutline>
+        </w:rPr>
+        <w:t>9}}</w:t>
       </w:r>
     </w:p>
     <w:p>
@@ -1945,6 +3722,85 @@
     </w:p>
     <w:p>
       <w:pPr>
+        <w:pStyle w:val="Textkrper"/>
+        <w:kinsoku w:val="0"/>
+        <w:overflowPunct w:val="0"/>
+        <w:spacing w:after="240"/>
+        <w:ind w:right="-35"/>
+        <w:jc w:val="both"/>
+        <w:rPr>
+          <w:iCs/>
+          <w:color w:val="000000" w:themeColor="text1"/>
+          <w:lang w:val="en-GB"/>
+          <w14:shadow w14:blurRad="38100" w14:dist="19050" w14:dir="2700000" w14:sx="100000" w14:sy="100000" w14:kx="0" w14:ky="0" w14:algn="tl">
+            <w14:schemeClr w14:val="dk1">
+              <w14:alpha w14:val="60000"/>
+            </w14:schemeClr>
+          </w14:shadow>
+          <w14:textOutline w14:w="0" w14:cap="flat" w14:cmpd="sng" w14:algn="ctr">
+            <w14:noFill/>
+            <w14:prstDash w14:val="solid"/>
+            <w14:round/>
+          </w14:textOutline>
+        </w:rPr>
+      </w:pPr>
+      <w:r>
+        <w:rPr>
+          <w:iCs/>
+          <w:color w:val="000000" w:themeColor="text1"/>
+          <w:lang w:val="en-GB"/>
+          <w14:shadow w14:blurRad="38100" w14:dist="19050" w14:dir="2700000" w14:sx="100000" w14:sy="100000" w14:kx="0" w14:ky="0" w14:algn="tl">
+            <w14:schemeClr w14:val="dk1">
+              <w14:alpha w14:val="60000"/>
+            </w14:schemeClr>
+          </w14:shadow>
+          <w14:textOutline w14:w="0" w14:cap="flat" w14:cmpd="sng" w14:algn="ctr">
+            <w14:noFill/>
+            <w14:prstDash w14:val="solid"/>
+            <w14:round/>
+          </w14:textOutline>
+        </w:rPr>
+        <w:t>{{Answer</w:t>
+      </w:r>
+      <w:r>
+        <w:rPr>
+          <w:iCs/>
+          <w:color w:val="000000" w:themeColor="text1"/>
+          <w:lang w:val="en-GB"/>
+          <w14:shadow w14:blurRad="38100" w14:dist="19050" w14:dir="2700000" w14:sx="100000" w14:sy="100000" w14:kx="0" w14:ky="0" w14:algn="tl">
+            <w14:schemeClr w14:val="dk1">
+              <w14:alpha w14:val="60000"/>
+            </w14:schemeClr>
+          </w14:shadow>
+          <w14:textOutline w14:w="0" w14:cap="flat" w14:cmpd="sng" w14:algn="ctr">
+            <w14:noFill/>
+            <w14:prstDash w14:val="solid"/>
+            <w14:round/>
+          </w14:textOutline>
+        </w:rPr>
+        <w:t>30</w:t>
+      </w:r>
+      <w:r>
+        <w:rPr>
+          <w:iCs/>
+          <w:color w:val="000000" w:themeColor="text1"/>
+          <w:lang w:val="en-GB"/>
+          <w14:shadow w14:blurRad="38100" w14:dist="19050" w14:dir="2700000" w14:sx="100000" w14:sy="100000" w14:kx="0" w14:ky="0" w14:algn="tl">
+            <w14:schemeClr w14:val="dk1">
+              <w14:alpha w14:val="60000"/>
+            </w14:schemeClr>
+          </w14:shadow>
+          <w14:textOutline w14:w="0" w14:cap="flat" w14:cmpd="sng" w14:algn="ctr">
+            <w14:noFill/>
+            <w14:prstDash w14:val="solid"/>
+            <w14:round/>
+          </w14:textOutline>
+        </w:rPr>
+        <w:t>}}</w:t>
+      </w:r>
+    </w:p>
+    <w:p>
+      <w:pPr>
         <w:pStyle w:val="berschrift2"/>
       </w:pPr>
       <w:bookmarkStart w:id="7" w:name="_Toc69311945"/>
@@ -1973,7 +3829,104 @@
           <w:color w:val="4AA55B"/>
           <w:lang w:val="en-GB"/>
         </w:rPr>
-        <w:t>In addition to the management of data, beneficiaries should also consider and plan for the management of other research outputs that may be generated or re-used throughout their projects. Such outputs can be either digital (e.g. software, workflows, protocols, models, etc.) or physical (e.g. new materials, antibodies, reagents, samples, etc.).</w:t>
+        <w:t>In addition to the management of data, beneficiaries should also consider and plan for the management of other research outputs that may be generated or re-used throughout their projects. Such outputs can be either digital (</w:t>
+      </w:r>
+      <w:proofErr w:type="gramStart"/>
+      <w:r>
+        <w:rPr>
+          <w:i/>
+          <w:color w:val="4AA55B"/>
+          <w:lang w:val="en-GB"/>
+        </w:rPr>
+        <w:t>e.g.</w:t>
+      </w:r>
+      <w:proofErr w:type="gramEnd"/>
+      <w:r>
+        <w:rPr>
+          <w:i/>
+          <w:color w:val="4AA55B"/>
+          <w:lang w:val="en-GB"/>
+        </w:rPr>
+        <w:t xml:space="preserve"> software, workflows, protocols, models, etc.) or physical (e.g. new materials, antibodies, reagents, samples, etc.).</w:t>
+      </w:r>
+    </w:p>
+    <w:p>
+      <w:pPr>
+        <w:pStyle w:val="Textkrper"/>
+        <w:kinsoku w:val="0"/>
+        <w:overflowPunct w:val="0"/>
+        <w:spacing w:after="240"/>
+        <w:ind w:right="-35"/>
+        <w:jc w:val="both"/>
+        <w:rPr>
+          <w:iCs/>
+          <w:color w:val="000000" w:themeColor="text1"/>
+          <w:lang w:val="en-GB"/>
+          <w14:shadow w14:blurRad="38100" w14:dist="19050" w14:dir="2700000" w14:sx="100000" w14:sy="100000" w14:kx="0" w14:ky="0" w14:algn="tl">
+            <w14:schemeClr w14:val="dk1">
+              <w14:alpha w14:val="60000"/>
+            </w14:schemeClr>
+          </w14:shadow>
+          <w14:textOutline w14:w="0" w14:cap="flat" w14:cmpd="sng" w14:algn="ctr">
+            <w14:noFill/>
+            <w14:prstDash w14:val="solid"/>
+            <w14:round/>
+          </w14:textOutline>
+        </w:rPr>
+      </w:pPr>
+      <w:r>
+        <w:rPr>
+          <w:iCs/>
+          <w:color w:val="000000" w:themeColor="text1"/>
+          <w:lang w:val="en-GB"/>
+          <w14:shadow w14:blurRad="38100" w14:dist="19050" w14:dir="2700000" w14:sx="100000" w14:sy="100000" w14:kx="0" w14:ky="0" w14:algn="tl">
+            <w14:schemeClr w14:val="dk1">
+              <w14:alpha w14:val="60000"/>
+            </w14:schemeClr>
+          </w14:shadow>
+          <w14:textOutline w14:w="0" w14:cap="flat" w14:cmpd="sng" w14:algn="ctr">
+            <w14:noFill/>
+            <w14:prstDash w14:val="solid"/>
+            <w14:round/>
+          </w14:textOutline>
+        </w:rPr>
+        <w:t>{{Answer</w:t>
+      </w:r>
+      <w:r>
+        <w:rPr>
+          <w:iCs/>
+          <w:color w:val="000000" w:themeColor="text1"/>
+          <w:lang w:val="en-GB"/>
+          <w14:shadow w14:blurRad="38100" w14:dist="19050" w14:dir="2700000" w14:sx="100000" w14:sy="100000" w14:kx="0" w14:ky="0" w14:algn="tl">
+            <w14:schemeClr w14:val="dk1">
+              <w14:alpha w14:val="60000"/>
+            </w14:schemeClr>
+          </w14:shadow>
+          <w14:textOutline w14:w="0" w14:cap="flat" w14:cmpd="sng" w14:algn="ctr">
+            <w14:noFill/>
+            <w14:prstDash w14:val="solid"/>
+            <w14:round/>
+          </w14:textOutline>
+        </w:rPr>
+        <w:t>31</w:t>
+      </w:r>
+      <w:r>
+        <w:rPr>
+          <w:iCs/>
+          <w:color w:val="000000" w:themeColor="text1"/>
+          <w:lang w:val="en-GB"/>
+          <w14:shadow w14:blurRad="38100" w14:dist="19050" w14:dir="2700000" w14:sx="100000" w14:sy="100000" w14:kx="0" w14:ky="0" w14:algn="tl">
+            <w14:schemeClr w14:val="dk1">
+              <w14:alpha w14:val="60000"/>
+            </w14:schemeClr>
+          </w14:shadow>
+          <w14:textOutline w14:w="0" w14:cap="flat" w14:cmpd="sng" w14:algn="ctr">
+            <w14:noFill/>
+            <w14:prstDash w14:val="solid"/>
+            <w14:round/>
+          </w14:textOutline>
+        </w:rPr>
+        <w:t>}}</w:t>
       </w:r>
     </w:p>
     <w:p>
@@ -2001,6 +3954,85 @@
     </w:p>
     <w:p>
       <w:pPr>
+        <w:pStyle w:val="Textkrper"/>
+        <w:kinsoku w:val="0"/>
+        <w:overflowPunct w:val="0"/>
+        <w:spacing w:after="240"/>
+        <w:ind w:right="-35"/>
+        <w:jc w:val="both"/>
+        <w:rPr>
+          <w:iCs/>
+          <w:color w:val="000000" w:themeColor="text1"/>
+          <w:lang w:val="en-GB"/>
+          <w14:shadow w14:blurRad="38100" w14:dist="19050" w14:dir="2700000" w14:sx="100000" w14:sy="100000" w14:kx="0" w14:ky="0" w14:algn="tl">
+            <w14:schemeClr w14:val="dk1">
+              <w14:alpha w14:val="60000"/>
+            </w14:schemeClr>
+          </w14:shadow>
+          <w14:textOutline w14:w="0" w14:cap="flat" w14:cmpd="sng" w14:algn="ctr">
+            <w14:noFill/>
+            <w14:prstDash w14:val="solid"/>
+            <w14:round/>
+          </w14:textOutline>
+        </w:rPr>
+      </w:pPr>
+      <w:r>
+        <w:rPr>
+          <w:iCs/>
+          <w:color w:val="000000" w:themeColor="text1"/>
+          <w:lang w:val="en-GB"/>
+          <w14:shadow w14:blurRad="38100" w14:dist="19050" w14:dir="2700000" w14:sx="100000" w14:sy="100000" w14:kx="0" w14:ky="0" w14:algn="tl">
+            <w14:schemeClr w14:val="dk1">
+              <w14:alpha w14:val="60000"/>
+            </w14:schemeClr>
+          </w14:shadow>
+          <w14:textOutline w14:w="0" w14:cap="flat" w14:cmpd="sng" w14:algn="ctr">
+            <w14:noFill/>
+            <w14:prstDash w14:val="solid"/>
+            <w14:round/>
+          </w14:textOutline>
+        </w:rPr>
+        <w:t>{{Answer</w:t>
+      </w:r>
+      <w:r>
+        <w:rPr>
+          <w:iCs/>
+          <w:color w:val="000000" w:themeColor="text1"/>
+          <w:lang w:val="en-GB"/>
+          <w14:shadow w14:blurRad="38100" w14:dist="19050" w14:dir="2700000" w14:sx="100000" w14:sy="100000" w14:kx="0" w14:ky="0" w14:algn="tl">
+            <w14:schemeClr w14:val="dk1">
+              <w14:alpha w14:val="60000"/>
+            </w14:schemeClr>
+          </w14:shadow>
+          <w14:textOutline w14:w="0" w14:cap="flat" w14:cmpd="sng" w14:algn="ctr">
+            <w14:noFill/>
+            <w14:prstDash w14:val="solid"/>
+            <w14:round/>
+          </w14:textOutline>
+        </w:rPr>
+        <w:t>32</w:t>
+      </w:r>
+      <w:r>
+        <w:rPr>
+          <w:iCs/>
+          <w:color w:val="000000" w:themeColor="text1"/>
+          <w:lang w:val="en-GB"/>
+          <w14:shadow w14:blurRad="38100" w14:dist="19050" w14:dir="2700000" w14:sx="100000" w14:sy="100000" w14:kx="0" w14:ky="0" w14:algn="tl">
+            <w14:schemeClr w14:val="dk1">
+              <w14:alpha w14:val="60000"/>
+            </w14:schemeClr>
+          </w14:shadow>
+          <w14:textOutline w14:w="0" w14:cap="flat" w14:cmpd="sng" w14:algn="ctr">
+            <w14:noFill/>
+            <w14:prstDash w14:val="solid"/>
+            <w14:round/>
+          </w14:textOutline>
+        </w:rPr>
+        <w:t>}}</w:t>
+      </w:r>
+    </w:p>
+    <w:p>
+      <w:pPr>
         <w:pStyle w:val="berschrift2"/>
       </w:pPr>
       <w:bookmarkStart w:id="8" w:name="_Toc69311946"/>
@@ -2038,7 +4070,96 @@
           <w:color w:val="4AA55B"/>
           <w:lang w:val="en-GB"/>
         </w:rPr>
-        <w:t>What will the costs be for making data or other research outputs FAIR in your project (e.g. direct and indirect costs related to storage, archiving, re-use, security, etc.) ?</w:t>
+        <w:t>What will the costs be for making data or other research outputs FAIR in your project (e.g. direct and indirect costs related to storage, archiving, re-use, security, etc.</w:t>
+      </w:r>
+      <w:proofErr w:type="gramStart"/>
+      <w:r>
+        <w:rPr>
+          <w:i/>
+          <w:color w:val="4AA55B"/>
+          <w:lang w:val="en-GB"/>
+        </w:rPr>
+        <w:t>) ?</w:t>
+      </w:r>
+      <w:proofErr w:type="gramEnd"/>
+    </w:p>
+    <w:p>
+      <w:pPr>
+        <w:pStyle w:val="Textkrper"/>
+        <w:kinsoku w:val="0"/>
+        <w:overflowPunct w:val="0"/>
+        <w:spacing w:after="240"/>
+        <w:ind w:right="-35"/>
+        <w:jc w:val="both"/>
+        <w:rPr>
+          <w:iCs/>
+          <w:color w:val="000000" w:themeColor="text1"/>
+          <w:lang w:val="en-GB"/>
+          <w14:shadow w14:blurRad="38100" w14:dist="19050" w14:dir="2700000" w14:sx="100000" w14:sy="100000" w14:kx="0" w14:ky="0" w14:algn="tl">
+            <w14:schemeClr w14:val="dk1">
+              <w14:alpha w14:val="60000"/>
+            </w14:schemeClr>
+          </w14:shadow>
+          <w14:textOutline w14:w="0" w14:cap="flat" w14:cmpd="sng" w14:algn="ctr">
+            <w14:noFill/>
+            <w14:prstDash w14:val="solid"/>
+            <w14:round/>
+          </w14:textOutline>
+        </w:rPr>
+      </w:pPr>
+      <w:r>
+        <w:rPr>
+          <w:iCs/>
+          <w:color w:val="000000" w:themeColor="text1"/>
+          <w:lang w:val="en-GB"/>
+          <w14:shadow w14:blurRad="38100" w14:dist="19050" w14:dir="2700000" w14:sx="100000" w14:sy="100000" w14:kx="0" w14:ky="0" w14:algn="tl">
+            <w14:schemeClr w14:val="dk1">
+              <w14:alpha w14:val="60000"/>
+            </w14:schemeClr>
+          </w14:shadow>
+          <w14:textOutline w14:w="0" w14:cap="flat" w14:cmpd="sng" w14:algn="ctr">
+            <w14:noFill/>
+            <w14:prstDash w14:val="solid"/>
+            <w14:round/>
+          </w14:textOutline>
+        </w:rPr>
+        <w:t>{{Answer</w:t>
+      </w:r>
+      <w:r>
+        <w:rPr>
+          <w:iCs/>
+          <w:color w:val="000000" w:themeColor="text1"/>
+          <w:lang w:val="en-GB"/>
+          <w14:shadow w14:blurRad="38100" w14:dist="19050" w14:dir="2700000" w14:sx="100000" w14:sy="100000" w14:kx="0" w14:ky="0" w14:algn="tl">
+            <w14:schemeClr w14:val="dk1">
+              <w14:alpha w14:val="60000"/>
+            </w14:schemeClr>
+          </w14:shadow>
+          <w14:textOutline w14:w="0" w14:cap="flat" w14:cmpd="sng" w14:algn="ctr">
+            <w14:noFill/>
+            <w14:prstDash w14:val="solid"/>
+            <w14:round/>
+          </w14:textOutline>
+        </w:rPr>
+        <w:t>33</w:t>
+      </w:r>
+      <w:r>
+        <w:rPr>
+          <w:iCs/>
+          <w:color w:val="000000" w:themeColor="text1"/>
+          <w:lang w:val="en-GB"/>
+          <w14:shadow w14:blurRad="38100" w14:dist="19050" w14:dir="2700000" w14:sx="100000" w14:sy="100000" w14:kx="0" w14:ky="0" w14:algn="tl">
+            <w14:schemeClr w14:val="dk1">
+              <w14:alpha w14:val="60000"/>
+            </w14:schemeClr>
+          </w14:shadow>
+          <w14:textOutline w14:w="0" w14:cap="flat" w14:cmpd="sng" w14:algn="ctr">
+            <w14:noFill/>
+            <w14:prstDash w14:val="solid"/>
+            <w14:round/>
+          </w14:textOutline>
+        </w:rPr>
+        <w:t>}}</w:t>
       </w:r>
     </w:p>
     <w:p>
@@ -2073,6 +4194,85 @@
         <w:ind w:right="-35"/>
         <w:jc w:val="both"/>
         <w:rPr>
+          <w:iCs/>
+          <w:color w:val="000000" w:themeColor="text1"/>
+          <w:lang w:val="en-GB"/>
+          <w14:shadow w14:blurRad="38100" w14:dist="19050" w14:dir="2700000" w14:sx="100000" w14:sy="100000" w14:kx="0" w14:ky="0" w14:algn="tl">
+            <w14:schemeClr w14:val="dk1">
+              <w14:alpha w14:val="60000"/>
+            </w14:schemeClr>
+          </w14:shadow>
+          <w14:textOutline w14:w="0" w14:cap="flat" w14:cmpd="sng" w14:algn="ctr">
+            <w14:noFill/>
+            <w14:prstDash w14:val="solid"/>
+            <w14:round/>
+          </w14:textOutline>
+        </w:rPr>
+      </w:pPr>
+      <w:r>
+        <w:rPr>
+          <w:iCs/>
+          <w:color w:val="000000" w:themeColor="text1"/>
+          <w:lang w:val="en-GB"/>
+          <w14:shadow w14:blurRad="38100" w14:dist="19050" w14:dir="2700000" w14:sx="100000" w14:sy="100000" w14:kx="0" w14:ky="0" w14:algn="tl">
+            <w14:schemeClr w14:val="dk1">
+              <w14:alpha w14:val="60000"/>
+            </w14:schemeClr>
+          </w14:shadow>
+          <w14:textOutline w14:w="0" w14:cap="flat" w14:cmpd="sng" w14:algn="ctr">
+            <w14:noFill/>
+            <w14:prstDash w14:val="solid"/>
+            <w14:round/>
+          </w14:textOutline>
+        </w:rPr>
+        <w:t>{{Answer</w:t>
+      </w:r>
+      <w:r>
+        <w:rPr>
+          <w:iCs/>
+          <w:color w:val="000000" w:themeColor="text1"/>
+          <w:lang w:val="en-GB"/>
+          <w14:shadow w14:blurRad="38100" w14:dist="19050" w14:dir="2700000" w14:sx="100000" w14:sy="100000" w14:kx="0" w14:ky="0" w14:algn="tl">
+            <w14:schemeClr w14:val="dk1">
+              <w14:alpha w14:val="60000"/>
+            </w14:schemeClr>
+          </w14:shadow>
+          <w14:textOutline w14:w="0" w14:cap="flat" w14:cmpd="sng" w14:algn="ctr">
+            <w14:noFill/>
+            <w14:prstDash w14:val="solid"/>
+            <w14:round/>
+          </w14:textOutline>
+        </w:rPr>
+        <w:t>34</w:t>
+      </w:r>
+      <w:r>
+        <w:rPr>
+          <w:iCs/>
+          <w:color w:val="000000" w:themeColor="text1"/>
+          <w:lang w:val="en-GB"/>
+          <w14:shadow w14:blurRad="38100" w14:dist="19050" w14:dir="2700000" w14:sx="100000" w14:sy="100000" w14:kx="0" w14:ky="0" w14:algn="tl">
+            <w14:schemeClr w14:val="dk1">
+              <w14:alpha w14:val="60000"/>
+            </w14:schemeClr>
+          </w14:shadow>
+          <w14:textOutline w14:w="0" w14:cap="flat" w14:cmpd="sng" w14:algn="ctr">
+            <w14:noFill/>
+            <w14:prstDash w14:val="solid"/>
+            <w14:round/>
+          </w14:textOutline>
+        </w:rPr>
+        <w:t>}}</w:t>
+      </w:r>
+    </w:p>
+    <w:p>
+      <w:pPr>
+        <w:pStyle w:val="Textkrper"/>
+        <w:kinsoku w:val="0"/>
+        <w:overflowPunct w:val="0"/>
+        <w:spacing w:after="240"/>
+        <w:ind w:right="-35"/>
+        <w:jc w:val="both"/>
+        <w:rPr>
           <w:i/>
           <w:color w:val="4AA55B"/>
           <w:lang w:val="en-GB"/>
@@ -2096,6 +4296,85 @@
         <w:ind w:right="-35"/>
         <w:jc w:val="both"/>
         <w:rPr>
+          <w:iCs/>
+          <w:color w:val="000000" w:themeColor="text1"/>
+          <w:lang w:val="en-GB"/>
+          <w14:shadow w14:blurRad="38100" w14:dist="19050" w14:dir="2700000" w14:sx="100000" w14:sy="100000" w14:kx="0" w14:ky="0" w14:algn="tl">
+            <w14:schemeClr w14:val="dk1">
+              <w14:alpha w14:val="60000"/>
+            </w14:schemeClr>
+          </w14:shadow>
+          <w14:textOutline w14:w="0" w14:cap="flat" w14:cmpd="sng" w14:algn="ctr">
+            <w14:noFill/>
+            <w14:prstDash w14:val="solid"/>
+            <w14:round/>
+          </w14:textOutline>
+        </w:rPr>
+      </w:pPr>
+      <w:r>
+        <w:rPr>
+          <w:iCs/>
+          <w:color w:val="000000" w:themeColor="text1"/>
+          <w:lang w:val="en-GB"/>
+          <w14:shadow w14:blurRad="38100" w14:dist="19050" w14:dir="2700000" w14:sx="100000" w14:sy="100000" w14:kx="0" w14:ky="0" w14:algn="tl">
+            <w14:schemeClr w14:val="dk1">
+              <w14:alpha w14:val="60000"/>
+            </w14:schemeClr>
+          </w14:shadow>
+          <w14:textOutline w14:w="0" w14:cap="flat" w14:cmpd="sng" w14:algn="ctr">
+            <w14:noFill/>
+            <w14:prstDash w14:val="solid"/>
+            <w14:round/>
+          </w14:textOutline>
+        </w:rPr>
+        <w:t>{{Answer</w:t>
+      </w:r>
+      <w:r>
+        <w:rPr>
+          <w:iCs/>
+          <w:color w:val="000000" w:themeColor="text1"/>
+          <w:lang w:val="en-GB"/>
+          <w14:shadow w14:blurRad="38100" w14:dist="19050" w14:dir="2700000" w14:sx="100000" w14:sy="100000" w14:kx="0" w14:ky="0" w14:algn="tl">
+            <w14:schemeClr w14:val="dk1">
+              <w14:alpha w14:val="60000"/>
+            </w14:schemeClr>
+          </w14:shadow>
+          <w14:textOutline w14:w="0" w14:cap="flat" w14:cmpd="sng" w14:algn="ctr">
+            <w14:noFill/>
+            <w14:prstDash w14:val="solid"/>
+            <w14:round/>
+          </w14:textOutline>
+        </w:rPr>
+        <w:t>35</w:t>
+      </w:r>
+      <w:r>
+        <w:rPr>
+          <w:iCs/>
+          <w:color w:val="000000" w:themeColor="text1"/>
+          <w:lang w:val="en-GB"/>
+          <w14:shadow w14:blurRad="38100" w14:dist="19050" w14:dir="2700000" w14:sx="100000" w14:sy="100000" w14:kx="0" w14:ky="0" w14:algn="tl">
+            <w14:schemeClr w14:val="dk1">
+              <w14:alpha w14:val="60000"/>
+            </w14:schemeClr>
+          </w14:shadow>
+          <w14:textOutline w14:w="0" w14:cap="flat" w14:cmpd="sng" w14:algn="ctr">
+            <w14:noFill/>
+            <w14:prstDash w14:val="solid"/>
+            <w14:round/>
+          </w14:textOutline>
+        </w:rPr>
+        <w:t>}}</w:t>
+      </w:r>
+    </w:p>
+    <w:p>
+      <w:pPr>
+        <w:pStyle w:val="Textkrper"/>
+        <w:kinsoku w:val="0"/>
+        <w:overflowPunct w:val="0"/>
+        <w:spacing w:after="240"/>
+        <w:ind w:right="-35"/>
+        <w:jc w:val="both"/>
+        <w:rPr>
           <w:i/>
           <w:color w:val="4AA55B"/>
           <w:lang w:val="en-GB"/>
@@ -2112,6 +4391,85 @@
     </w:p>
     <w:p>
       <w:pPr>
+        <w:pStyle w:val="Textkrper"/>
+        <w:kinsoku w:val="0"/>
+        <w:overflowPunct w:val="0"/>
+        <w:spacing w:after="240"/>
+        <w:ind w:right="-35"/>
+        <w:jc w:val="both"/>
+        <w:rPr>
+          <w:iCs/>
+          <w:color w:val="000000" w:themeColor="text1"/>
+          <w:lang w:val="en-GB"/>
+          <w14:shadow w14:blurRad="38100" w14:dist="19050" w14:dir="2700000" w14:sx="100000" w14:sy="100000" w14:kx="0" w14:ky="0" w14:algn="tl">
+            <w14:schemeClr w14:val="dk1">
+              <w14:alpha w14:val="60000"/>
+            </w14:schemeClr>
+          </w14:shadow>
+          <w14:textOutline w14:w="0" w14:cap="flat" w14:cmpd="sng" w14:algn="ctr">
+            <w14:noFill/>
+            <w14:prstDash w14:val="solid"/>
+            <w14:round/>
+          </w14:textOutline>
+        </w:rPr>
+      </w:pPr>
+      <w:r>
+        <w:rPr>
+          <w:iCs/>
+          <w:color w:val="000000" w:themeColor="text1"/>
+          <w:lang w:val="en-GB"/>
+          <w14:shadow w14:blurRad="38100" w14:dist="19050" w14:dir="2700000" w14:sx="100000" w14:sy="100000" w14:kx="0" w14:ky="0" w14:algn="tl">
+            <w14:schemeClr w14:val="dk1">
+              <w14:alpha w14:val="60000"/>
+            </w14:schemeClr>
+          </w14:shadow>
+          <w14:textOutline w14:w="0" w14:cap="flat" w14:cmpd="sng" w14:algn="ctr">
+            <w14:noFill/>
+            <w14:prstDash w14:val="solid"/>
+            <w14:round/>
+          </w14:textOutline>
+        </w:rPr>
+        <w:t>{{Answer</w:t>
+      </w:r>
+      <w:r>
+        <w:rPr>
+          <w:iCs/>
+          <w:color w:val="000000" w:themeColor="text1"/>
+          <w:lang w:val="en-GB"/>
+          <w14:shadow w14:blurRad="38100" w14:dist="19050" w14:dir="2700000" w14:sx="100000" w14:sy="100000" w14:kx="0" w14:ky="0" w14:algn="tl">
+            <w14:schemeClr w14:val="dk1">
+              <w14:alpha w14:val="60000"/>
+            </w14:schemeClr>
+          </w14:shadow>
+          <w14:textOutline w14:w="0" w14:cap="flat" w14:cmpd="sng" w14:algn="ctr">
+            <w14:noFill/>
+            <w14:prstDash w14:val="solid"/>
+            <w14:round/>
+          </w14:textOutline>
+        </w:rPr>
+        <w:t>36</w:t>
+      </w:r>
+      <w:r>
+        <w:rPr>
+          <w:iCs/>
+          <w:color w:val="000000" w:themeColor="text1"/>
+          <w:lang w:val="en-GB"/>
+          <w14:shadow w14:blurRad="38100" w14:dist="19050" w14:dir="2700000" w14:sx="100000" w14:sy="100000" w14:kx="0" w14:ky="0" w14:algn="tl">
+            <w14:schemeClr w14:val="dk1">
+              <w14:alpha w14:val="60000"/>
+            </w14:schemeClr>
+          </w14:shadow>
+          <w14:textOutline w14:w="0" w14:cap="flat" w14:cmpd="sng" w14:algn="ctr">
+            <w14:noFill/>
+            <w14:prstDash w14:val="solid"/>
+            <w14:round/>
+          </w14:textOutline>
+        </w:rPr>
+        <w:t>}}</w:t>
+      </w:r>
+    </w:p>
+    <w:p>
+      <w:pPr>
         <w:pStyle w:val="berschrift2"/>
       </w:pPr>
       <w:bookmarkStart w:id="9" w:name="_Toc69311947"/>
@@ -2161,6 +4519,85 @@
         <w:ind w:right="-35"/>
         <w:jc w:val="both"/>
         <w:rPr>
+          <w:iCs/>
+          <w:color w:val="000000" w:themeColor="text1"/>
+          <w:lang w:val="en-GB"/>
+          <w14:shadow w14:blurRad="38100" w14:dist="19050" w14:dir="2700000" w14:sx="100000" w14:sy="100000" w14:kx="0" w14:ky="0" w14:algn="tl">
+            <w14:schemeClr w14:val="dk1">
+              <w14:alpha w14:val="60000"/>
+            </w14:schemeClr>
+          </w14:shadow>
+          <w14:textOutline w14:w="0" w14:cap="flat" w14:cmpd="sng" w14:algn="ctr">
+            <w14:noFill/>
+            <w14:prstDash w14:val="solid"/>
+            <w14:round/>
+          </w14:textOutline>
+        </w:rPr>
+      </w:pPr>
+      <w:r>
+        <w:rPr>
+          <w:iCs/>
+          <w:color w:val="000000" w:themeColor="text1"/>
+          <w:lang w:val="en-GB"/>
+          <w14:shadow w14:blurRad="38100" w14:dist="19050" w14:dir="2700000" w14:sx="100000" w14:sy="100000" w14:kx="0" w14:ky="0" w14:algn="tl">
+            <w14:schemeClr w14:val="dk1">
+              <w14:alpha w14:val="60000"/>
+            </w14:schemeClr>
+          </w14:shadow>
+          <w14:textOutline w14:w="0" w14:cap="flat" w14:cmpd="sng" w14:algn="ctr">
+            <w14:noFill/>
+            <w14:prstDash w14:val="solid"/>
+            <w14:round/>
+          </w14:textOutline>
+        </w:rPr>
+        <w:t>{{Answer</w:t>
+      </w:r>
+      <w:r>
+        <w:rPr>
+          <w:iCs/>
+          <w:color w:val="000000" w:themeColor="text1"/>
+          <w:lang w:val="en-GB"/>
+          <w14:shadow w14:blurRad="38100" w14:dist="19050" w14:dir="2700000" w14:sx="100000" w14:sy="100000" w14:kx="0" w14:ky="0" w14:algn="tl">
+            <w14:schemeClr w14:val="dk1">
+              <w14:alpha w14:val="60000"/>
+            </w14:schemeClr>
+          </w14:shadow>
+          <w14:textOutline w14:w="0" w14:cap="flat" w14:cmpd="sng" w14:algn="ctr">
+            <w14:noFill/>
+            <w14:prstDash w14:val="solid"/>
+            <w14:round/>
+          </w14:textOutline>
+        </w:rPr>
+        <w:t>37</w:t>
+      </w:r>
+      <w:r>
+        <w:rPr>
+          <w:iCs/>
+          <w:color w:val="000000" w:themeColor="text1"/>
+          <w:lang w:val="en-GB"/>
+          <w14:shadow w14:blurRad="38100" w14:dist="19050" w14:dir="2700000" w14:sx="100000" w14:sy="100000" w14:kx="0" w14:ky="0" w14:algn="tl">
+            <w14:schemeClr w14:val="dk1">
+              <w14:alpha w14:val="60000"/>
+            </w14:schemeClr>
+          </w14:shadow>
+          <w14:textOutline w14:w="0" w14:cap="flat" w14:cmpd="sng" w14:algn="ctr">
+            <w14:noFill/>
+            <w14:prstDash w14:val="solid"/>
+            <w14:round/>
+          </w14:textOutline>
+        </w:rPr>
+        <w:t>}}</w:t>
+      </w:r>
+    </w:p>
+    <w:p>
+      <w:pPr>
+        <w:pStyle w:val="Textkrper"/>
+        <w:kinsoku w:val="0"/>
+        <w:overflowPunct w:val="0"/>
+        <w:spacing w:after="240"/>
+        <w:ind w:right="-35"/>
+        <w:jc w:val="both"/>
+        <w:rPr>
           <w:i/>
           <w:color w:val="4AA55B"/>
           <w:lang w:val="en-GB"/>
@@ -2173,6 +4610,85 @@
           <w:lang w:val="en-GB"/>
         </w:rPr>
         <w:t>Will the data be safely stored in trusted repositories for long term preservation and curation?</w:t>
+      </w:r>
+    </w:p>
+    <w:p>
+      <w:pPr>
+        <w:pStyle w:val="Textkrper"/>
+        <w:kinsoku w:val="0"/>
+        <w:overflowPunct w:val="0"/>
+        <w:spacing w:after="240"/>
+        <w:ind w:right="-35"/>
+        <w:jc w:val="both"/>
+        <w:rPr>
+          <w:iCs/>
+          <w:color w:val="000000" w:themeColor="text1"/>
+          <w:lang w:val="en-GB"/>
+          <w14:shadow w14:blurRad="38100" w14:dist="19050" w14:dir="2700000" w14:sx="100000" w14:sy="100000" w14:kx="0" w14:ky="0" w14:algn="tl">
+            <w14:schemeClr w14:val="dk1">
+              <w14:alpha w14:val="60000"/>
+            </w14:schemeClr>
+          </w14:shadow>
+          <w14:textOutline w14:w="0" w14:cap="flat" w14:cmpd="sng" w14:algn="ctr">
+            <w14:noFill/>
+            <w14:prstDash w14:val="solid"/>
+            <w14:round/>
+          </w14:textOutline>
+        </w:rPr>
+      </w:pPr>
+      <w:r>
+        <w:rPr>
+          <w:iCs/>
+          <w:color w:val="000000" w:themeColor="text1"/>
+          <w:lang w:val="en-GB"/>
+          <w14:shadow w14:blurRad="38100" w14:dist="19050" w14:dir="2700000" w14:sx="100000" w14:sy="100000" w14:kx="0" w14:ky="0" w14:algn="tl">
+            <w14:schemeClr w14:val="dk1">
+              <w14:alpha w14:val="60000"/>
+            </w14:schemeClr>
+          </w14:shadow>
+          <w14:textOutline w14:w="0" w14:cap="flat" w14:cmpd="sng" w14:algn="ctr">
+            <w14:noFill/>
+            <w14:prstDash w14:val="solid"/>
+            <w14:round/>
+          </w14:textOutline>
+        </w:rPr>
+        <w:t>{{Answer</w:t>
+      </w:r>
+      <w:r>
+        <w:rPr>
+          <w:iCs/>
+          <w:color w:val="000000" w:themeColor="text1"/>
+          <w:lang w:val="en-GB"/>
+          <w14:shadow w14:blurRad="38100" w14:dist="19050" w14:dir="2700000" w14:sx="100000" w14:sy="100000" w14:kx="0" w14:ky="0" w14:algn="tl">
+            <w14:schemeClr w14:val="dk1">
+              <w14:alpha w14:val="60000"/>
+            </w14:schemeClr>
+          </w14:shadow>
+          <w14:textOutline w14:w="0" w14:cap="flat" w14:cmpd="sng" w14:algn="ctr">
+            <w14:noFill/>
+            <w14:prstDash w14:val="solid"/>
+            <w14:round/>
+          </w14:textOutline>
+        </w:rPr>
+        <w:t>38</w:t>
+      </w:r>
+      <w:r>
+        <w:rPr>
+          <w:iCs/>
+          <w:color w:val="000000" w:themeColor="text1"/>
+          <w:lang w:val="en-GB"/>
+          <w14:shadow w14:blurRad="38100" w14:dist="19050" w14:dir="2700000" w14:sx="100000" w14:sy="100000" w14:kx="0" w14:ky="0" w14:algn="tl">
+            <w14:schemeClr w14:val="dk1">
+              <w14:alpha w14:val="60000"/>
+            </w14:schemeClr>
+          </w14:shadow>
+          <w14:textOutline w14:w="0" w14:cap="flat" w14:cmpd="sng" w14:algn="ctr">
+            <w14:noFill/>
+            <w14:prstDash w14:val="solid"/>
+            <w14:round/>
+          </w14:textOutline>
+        </w:rPr>
+        <w:t>}}</w:t>
       </w:r>
     </w:p>
     <w:p>
@@ -2209,23 +4725,146 @@
           <w:color w:val="4AA55B"/>
           <w:lang w:val="en-GB"/>
         </w:rPr>
-        <w:t>Are there, or could there be, any ethics or legal issues that can have an impact on data sharing? These can also be discussed in the context of the ethics review. If relevant, include references to ethics deliverables and ethics chapter in the Description of the Action (DoA).</w:t>
-      </w:r>
-    </w:p>
-    <w:p>
-      <w:pPr>
-        <w:pStyle w:val="Textkrper"/>
-        <w:kinsoku w:val="0"/>
-        <w:overflowPunct w:val="0"/>
-        <w:spacing w:after="240"/>
-        <w:ind w:right="-35"/>
-        <w:jc w:val="both"/>
-        <w:rPr>
-          <w:i/>
-          <w:color w:val="4AA55B"/>
-          <w:lang w:val="en-GB"/>
-        </w:rPr>
-      </w:pPr>
+        <w:t>Are there, or could there be, any ethics or legal issues that can have an impact on data sharing? These can also be discussed in the context of the ethics review. If relevant, include references to ethics deliverables and ethics chapter in the Description of the Action (</w:t>
+      </w:r>
+      <w:proofErr w:type="spellStart"/>
+      <w:r>
+        <w:rPr>
+          <w:i/>
+          <w:color w:val="4AA55B"/>
+          <w:lang w:val="en-GB"/>
+        </w:rPr>
+        <w:t>DoA</w:t>
+      </w:r>
+      <w:proofErr w:type="spellEnd"/>
+      <w:r>
+        <w:rPr>
+          <w:i/>
+          <w:color w:val="4AA55B"/>
+          <w:lang w:val="en-GB"/>
+        </w:rPr>
+        <w:t>).</w:t>
+      </w:r>
+    </w:p>
+    <w:p>
+      <w:pPr>
+        <w:pStyle w:val="Textkrper"/>
+        <w:kinsoku w:val="0"/>
+        <w:overflowPunct w:val="0"/>
+        <w:spacing w:after="240"/>
+        <w:ind w:right="-35"/>
+        <w:jc w:val="both"/>
+        <w:rPr>
+          <w:iCs/>
+          <w:color w:val="000000" w:themeColor="text1"/>
+          <w:lang w:val="en-GB"/>
+          <w14:shadow w14:blurRad="38100" w14:dist="19050" w14:dir="2700000" w14:sx="100000" w14:sy="100000" w14:kx="0" w14:ky="0" w14:algn="tl">
+            <w14:schemeClr w14:val="dk1">
+              <w14:alpha w14:val="60000"/>
+            </w14:schemeClr>
+          </w14:shadow>
+          <w14:textOutline w14:w="0" w14:cap="flat" w14:cmpd="sng" w14:algn="ctr">
+            <w14:noFill/>
+            <w14:prstDash w14:val="solid"/>
+            <w14:round/>
+          </w14:textOutline>
+        </w:rPr>
+      </w:pPr>
+      <w:r>
+        <w:rPr>
+          <w:iCs/>
+          <w:color w:val="000000" w:themeColor="text1"/>
+          <w:lang w:val="en-GB"/>
+          <w14:shadow w14:blurRad="38100" w14:dist="19050" w14:dir="2700000" w14:sx="100000" w14:sy="100000" w14:kx="0" w14:ky="0" w14:algn="tl">
+            <w14:schemeClr w14:val="dk1">
+              <w14:alpha w14:val="60000"/>
+            </w14:schemeClr>
+          </w14:shadow>
+          <w14:textOutline w14:w="0" w14:cap="flat" w14:cmpd="sng" w14:algn="ctr">
+            <w14:noFill/>
+            <w14:prstDash w14:val="solid"/>
+            <w14:round/>
+          </w14:textOutline>
+        </w:rPr>
+        <w:t>{{Answer</w:t>
+      </w:r>
+      <w:r>
+        <w:rPr>
+          <w:iCs/>
+          <w:color w:val="000000" w:themeColor="text1"/>
+          <w:lang w:val="en-GB"/>
+          <w14:shadow w14:blurRad="38100" w14:dist="19050" w14:dir="2700000" w14:sx="100000" w14:sy="100000" w14:kx="0" w14:ky="0" w14:algn="tl">
+            <w14:schemeClr w14:val="dk1">
+              <w14:alpha w14:val="60000"/>
+            </w14:schemeClr>
+          </w14:shadow>
+          <w14:textOutline w14:w="0" w14:cap="flat" w14:cmpd="sng" w14:algn="ctr">
+            <w14:noFill/>
+            <w14:prstDash w14:val="solid"/>
+            <w14:round/>
+          </w14:textOutline>
+        </w:rPr>
+        <w:t>39</w:t>
+      </w:r>
+      <w:r>
+        <w:rPr>
+          <w:iCs/>
+          <w:color w:val="000000" w:themeColor="text1"/>
+          <w:lang w:val="en-GB"/>
+          <w14:shadow w14:blurRad="38100" w14:dist="19050" w14:dir="2700000" w14:sx="100000" w14:sy="100000" w14:kx="0" w14:ky="0" w14:algn="tl">
+            <w14:schemeClr w14:val="dk1">
+              <w14:alpha w14:val="60000"/>
+            </w14:schemeClr>
+          </w14:shadow>
+          <w14:textOutline w14:w="0" w14:cap="flat" w14:cmpd="sng" w14:algn="ctr">
+            <w14:noFill/>
+            <w14:prstDash w14:val="solid"/>
+            <w14:round/>
+          </w14:textOutline>
+        </w:rPr>
+        <w:t>}}</w:t>
+      </w:r>
+    </w:p>
+    <w:p>
+      <w:pPr>
+        <w:pStyle w:val="Textkrper"/>
+        <w:kinsoku w:val="0"/>
+        <w:overflowPunct w:val="0"/>
+        <w:spacing w:after="240"/>
+        <w:ind w:right="-35"/>
+        <w:jc w:val="both"/>
+        <w:rPr>
+          <w:i/>
+          <w:color w:val="4AA55B"/>
+          <w:lang w:val="en-GB"/>
+        </w:rPr>
+      </w:pPr>
+      <w:r>
+        <w:rPr>
+          <w:i/>
+          <w:color w:val="4AA55B"/>
+          <w:lang w:val="en-GB"/>
+        </w:rPr>
+        <w:t xml:space="preserve">Will informed consent for data sharing and </w:t>
+      </w:r>
+      <w:proofErr w:type="gramStart"/>
+      <w:r>
+        <w:rPr>
+          <w:i/>
+          <w:color w:val="4AA55B"/>
+          <w:lang w:val="en-GB"/>
+        </w:rPr>
+        <w:t>long term</w:t>
+      </w:r>
+      <w:proofErr w:type="gramEnd"/>
+      <w:r>
+        <w:rPr>
+          <w:i/>
+          <w:color w:val="4AA55B"/>
+          <w:lang w:val="en-GB"/>
+        </w:rPr>
+        <w:t xml:space="preserve"> preservation be included in questionnaires dealing with </w:t>
+      </w:r>
       <w:r>
         <w:rPr>
           <w:i/>
@@ -2233,7 +4872,86 @@
           <w:lang w:val="en-GB"/>
         </w:rPr>
         <w:lastRenderedPageBreak/>
-        <w:t>Will informed consent for data sharing and long term preservation be included in questionnaires dealing with personal data?</w:t>
+        <w:t>personal data?</w:t>
+      </w:r>
+    </w:p>
+    <w:p>
+      <w:pPr>
+        <w:pStyle w:val="Textkrper"/>
+        <w:kinsoku w:val="0"/>
+        <w:overflowPunct w:val="0"/>
+        <w:spacing w:after="240"/>
+        <w:ind w:right="-35"/>
+        <w:jc w:val="both"/>
+        <w:rPr>
+          <w:iCs/>
+          <w:color w:val="000000" w:themeColor="text1"/>
+          <w:lang w:val="en-GB"/>
+          <w14:shadow w14:blurRad="38100" w14:dist="19050" w14:dir="2700000" w14:sx="100000" w14:sy="100000" w14:kx="0" w14:ky="0" w14:algn="tl">
+            <w14:schemeClr w14:val="dk1">
+              <w14:alpha w14:val="60000"/>
+            </w14:schemeClr>
+          </w14:shadow>
+          <w14:textOutline w14:w="0" w14:cap="flat" w14:cmpd="sng" w14:algn="ctr">
+            <w14:noFill/>
+            <w14:prstDash w14:val="solid"/>
+            <w14:round/>
+          </w14:textOutline>
+        </w:rPr>
+      </w:pPr>
+      <w:r>
+        <w:rPr>
+          <w:iCs/>
+          <w:color w:val="000000" w:themeColor="text1"/>
+          <w:lang w:val="en-GB"/>
+          <w14:shadow w14:blurRad="38100" w14:dist="19050" w14:dir="2700000" w14:sx="100000" w14:sy="100000" w14:kx="0" w14:ky="0" w14:algn="tl">
+            <w14:schemeClr w14:val="dk1">
+              <w14:alpha w14:val="60000"/>
+            </w14:schemeClr>
+          </w14:shadow>
+          <w14:textOutline w14:w="0" w14:cap="flat" w14:cmpd="sng" w14:algn="ctr">
+            <w14:noFill/>
+            <w14:prstDash w14:val="solid"/>
+            <w14:round/>
+          </w14:textOutline>
+        </w:rPr>
+        <w:t>{{Answer</w:t>
+      </w:r>
+      <w:r>
+        <w:rPr>
+          <w:iCs/>
+          <w:color w:val="000000" w:themeColor="text1"/>
+          <w:lang w:val="en-GB"/>
+          <w14:shadow w14:blurRad="38100" w14:dist="19050" w14:dir="2700000" w14:sx="100000" w14:sy="100000" w14:kx="0" w14:ky="0" w14:algn="tl">
+            <w14:schemeClr w14:val="dk1">
+              <w14:alpha w14:val="60000"/>
+            </w14:schemeClr>
+          </w14:shadow>
+          <w14:textOutline w14:w="0" w14:cap="flat" w14:cmpd="sng" w14:algn="ctr">
+            <w14:noFill/>
+            <w14:prstDash w14:val="solid"/>
+            <w14:round/>
+          </w14:textOutline>
+        </w:rPr>
+        <w:t>40</w:t>
+      </w:r>
+      <w:r>
+        <w:rPr>
+          <w:iCs/>
+          <w:color w:val="000000" w:themeColor="text1"/>
+          <w:lang w:val="en-GB"/>
+          <w14:shadow w14:blurRad="38100" w14:dist="19050" w14:dir="2700000" w14:sx="100000" w14:sy="100000" w14:kx="0" w14:ky="0" w14:algn="tl">
+            <w14:schemeClr w14:val="dk1">
+              <w14:alpha w14:val="60000"/>
+            </w14:schemeClr>
+          </w14:shadow>
+          <w14:textOutline w14:w="0" w14:cap="flat" w14:cmpd="sng" w14:algn="ctr">
+            <w14:noFill/>
+            <w14:prstDash w14:val="solid"/>
+            <w14:round/>
+          </w14:textOutline>
+        </w:rPr>
+        <w:t>}}</w:t>
       </w:r>
     </w:p>
     <w:p>
@@ -2276,6 +4994,85 @@
           <w:lang w:val="en-GB"/>
         </w:rPr>
         <w:t>Do you, or will you, make use of other national/funder/sectorial/departmental procedures for data management? If yes, which ones (please list and briefly describe them)?</w:t>
+      </w:r>
+    </w:p>
+    <w:p>
+      <w:pPr>
+        <w:pStyle w:val="Textkrper"/>
+        <w:kinsoku w:val="0"/>
+        <w:overflowPunct w:val="0"/>
+        <w:spacing w:after="240"/>
+        <w:ind w:right="-35"/>
+        <w:jc w:val="both"/>
+        <w:rPr>
+          <w:iCs/>
+          <w:color w:val="000000" w:themeColor="text1"/>
+          <w:lang w:val="en-GB"/>
+          <w14:shadow w14:blurRad="38100" w14:dist="19050" w14:dir="2700000" w14:sx="100000" w14:sy="100000" w14:kx="0" w14:ky="0" w14:algn="tl">
+            <w14:schemeClr w14:val="dk1">
+              <w14:alpha w14:val="60000"/>
+            </w14:schemeClr>
+          </w14:shadow>
+          <w14:textOutline w14:w="0" w14:cap="flat" w14:cmpd="sng" w14:algn="ctr">
+            <w14:noFill/>
+            <w14:prstDash w14:val="solid"/>
+            <w14:round/>
+          </w14:textOutline>
+        </w:rPr>
+      </w:pPr>
+      <w:r>
+        <w:rPr>
+          <w:iCs/>
+          <w:color w:val="000000" w:themeColor="text1"/>
+          <w:lang w:val="en-GB"/>
+          <w14:shadow w14:blurRad="38100" w14:dist="19050" w14:dir="2700000" w14:sx="100000" w14:sy="100000" w14:kx="0" w14:ky="0" w14:algn="tl">
+            <w14:schemeClr w14:val="dk1">
+              <w14:alpha w14:val="60000"/>
+            </w14:schemeClr>
+          </w14:shadow>
+          <w14:textOutline w14:w="0" w14:cap="flat" w14:cmpd="sng" w14:algn="ctr">
+            <w14:noFill/>
+            <w14:prstDash w14:val="solid"/>
+            <w14:round/>
+          </w14:textOutline>
+        </w:rPr>
+        <w:t>{{Answer</w:t>
+      </w:r>
+      <w:r>
+        <w:rPr>
+          <w:iCs/>
+          <w:color w:val="000000" w:themeColor="text1"/>
+          <w:lang w:val="en-GB"/>
+          <w14:shadow w14:blurRad="38100" w14:dist="19050" w14:dir="2700000" w14:sx="100000" w14:sy="100000" w14:kx="0" w14:ky="0" w14:algn="tl">
+            <w14:schemeClr w14:val="dk1">
+              <w14:alpha w14:val="60000"/>
+            </w14:schemeClr>
+          </w14:shadow>
+          <w14:textOutline w14:w="0" w14:cap="flat" w14:cmpd="sng" w14:algn="ctr">
+            <w14:noFill/>
+            <w14:prstDash w14:val="solid"/>
+            <w14:round/>
+          </w14:textOutline>
+        </w:rPr>
+        <w:t>41</w:t>
+      </w:r>
+      <w:r>
+        <w:rPr>
+          <w:iCs/>
+          <w:color w:val="000000" w:themeColor="text1"/>
+          <w:lang w:val="en-GB"/>
+          <w14:shadow w14:blurRad="38100" w14:dist="19050" w14:dir="2700000" w14:sx="100000" w14:sy="100000" w14:kx="0" w14:ky="0" w14:algn="tl">
+            <w14:schemeClr w14:val="dk1">
+              <w14:alpha w14:val="60000"/>
+            </w14:schemeClr>
+          </w14:shadow>
+          <w14:textOutline w14:w="0" w14:cap="flat" w14:cmpd="sng" w14:algn="ctr">
+            <w14:noFill/>
+            <w14:prstDash w14:val="solid"/>
+            <w14:round/>
+          </w14:textOutline>
+        </w:rPr>
+        <w:t>}}</w:t>
       </w:r>
     </w:p>
     <w:p>
@@ -2399,6 +5196,7 @@
               </w:rPr>
             </w:pPr>
             <w:bookmarkStart w:id="13" w:name="_Toc498002776"/>
+            <w:proofErr w:type="gramStart"/>
             <w:r>
               <w:rPr>
                 <w:rFonts w:eastAsia="Times New Roman" w:cs="Arial"/>
@@ -2412,6 +5210,7 @@
               <w:t>PUBLICATION  DATE</w:t>
             </w:r>
             <w:bookmarkEnd w:id="13"/>
+            <w:proofErr w:type="gramEnd"/>
           </w:p>
         </w:tc>
         <w:tc>
@@ -3050,7 +5849,29 @@
           <w:szCs w:val="18"/>
           <w:lang w:val="fr-BE"/>
         </w:rPr>
-        <w:t xml:space="preserve">(Source: </w:t>
+        <w:t>(</w:t>
+      </w:r>
+      <w:proofErr w:type="gramStart"/>
+      <w:r>
+        <w:rPr>
+          <w:rFonts w:ascii="Arial" w:hAnsi="Arial" w:cs="Arial"/>
+          <w:i/>
+          <w:sz w:val="16"/>
+          <w:szCs w:val="18"/>
+          <w:lang w:val="fr-BE"/>
+        </w:rPr>
+        <w:t>Source:</w:t>
+      </w:r>
+      <w:proofErr w:type="gramEnd"/>
+      <w:r>
+        <w:rPr>
+          <w:rFonts w:ascii="Arial" w:hAnsi="Arial" w:cs="Arial"/>
+          <w:i/>
+          <w:sz w:val="16"/>
+          <w:szCs w:val="18"/>
+          <w:lang w:val="fr-BE"/>
+        </w:rPr>
+        <w:t xml:space="preserve"> </w:t>
       </w:r>
       <w:hyperlink r:id="rId1" w:history="1">
         <w:r>
@@ -3124,7 +5945,23 @@
         <w:color w:val="808080"/>
         <w:sz w:val="16"/>
       </w:rPr>
-      <w:t xml:space="preserve"> (HE):V1.</w:t>
+      <w:t xml:space="preserve"> (HE</w:t>
+    </w:r>
+    <w:proofErr w:type="gramStart"/>
+    <w:r>
+      <w:rPr>
+        <w:color w:val="808080"/>
+        <w:sz w:val="16"/>
+      </w:rPr>
+      <w:t>):V</w:t>
+    </w:r>
+    <w:proofErr w:type="gramEnd"/>
+    <w:r>
+      <w:rPr>
+        <w:color w:val="808080"/>
+        <w:sz w:val="16"/>
+      </w:rPr>
+      <w:t>1.</w:t>
     </w:r>
     <w:r>
       <w:rPr>
@@ -3202,7 +6039,7 @@
         <v:path o:extrusionok="f" gradientshapeok="t" o:connecttype="rect"/>
         <o:lock v:ext="edit" aspectratio="t"/>
       </v:shapetype>
-      <v:shape id="_x0000_i1031" type="#_x0000_t75" style="width:13pt;height:13pt;visibility:visible;mso-wrap-style:square" o:bullet="t">
+      <v:shape id="_x0000_i1031" type="#_x0000_t75" style="width:12.75pt;height:12.75pt;visibility:visible;mso-wrap-style:square" o:bullet="t">
         <v:imagedata r:id="rId1" o:title=""/>
       </v:shape>
     </w:pict>
@@ -4540,6 +7377,36 @@
 </file>
 
 <file path=customXml/item1.xml><?xml version="1.0" encoding="utf-8"?>
+<?mso-contentType ?>
+<FormTemplates xmlns="http://schemas.microsoft.com/sharepoint/v3/contenttype/forms">
+  <Display>DocumentLibraryForm</Display>
+  <Edit>DocumentLibraryForm</Edit>
+  <New>DocumentLibraryForm</New>
+</FormTemplates>
+</file>
+
+<file path=customXml/item2.xml><?xml version="1.0" encoding="utf-8"?>
+<p:properties xmlns:p="http://schemas.microsoft.com/office/2006/metadata/properties" xmlns:xsi="http://www.w3.org/2001/XMLSchema-instance" xmlns:pc="http://schemas.microsoft.com/office/infopath/2007/PartnerControls">
+  <documentManagement>
+    <Order1 xmlns="084a5cd8-1559-4e94-ac72-b94fb9abc19e">41</Order1>
+    <DocComments xmlns="084a5cd8-1559-4e94-ac72-b94fb9abc19e">Deliverable to be available on Portal.</DocComments>
+    <DocPublversion xmlns="084a5cd8-1559-4e94-ac72-b94fb9abc19e" xsi:nil="true"/>
+    <DocInternalExternal xmlns="084a5cd8-1559-4e94-ac72-b94fb9abc19e">Internal &amp; external</DocInternalExternal>
+    <ProgrCategory xmlns="084a5cd8-1559-4e94-ac72-b94fb9abc19e">3. Customised reports &amp; forms</ProgrCategory>
+    <ProgrGroup xmlns="084a5cd8-1559-4e94-ac72-b94fb9abc19e">01 HORIZON and EURATOM</ProgrGroup>
+    <DocStatus xmlns="084a5cd8-1559-4e94-ac72-b94fb9abc19e">Ready</DocStatus>
+    <DocPublDestination xmlns="084a5cd8-1559-4e94-ac72-b94fb9abc19e" xsi:nil="true"/>
+    <DocPublProtocol xmlns="084a5cd8-1559-4e94-ac72-b94fb9abc19e">TPL2-5 Programme tpl - Reporting forms, etc</DocPublProtocol>
+    <DocOfficerComments xmlns="084a5cd8-1559-4e94-ac72-b94fb9abc19e" xsi:nil="true"/>
+    <DocPublDate xmlns="084a5cd8-1559-4e94-ac72-b94fb9abc19e" xsi:nil="true"/>
+    <ITcomments xmlns="084a5cd8-1559-4e94-ac72-b94fb9abc19e" xsi:nil="true"/>
+    <ITstatus xmlns="084a5cd8-1559-4e94-ac72-b94fb9abc19e" xsi:nil="true"/>
+    <s86b xmlns="58f75e61-ed07-41d3-a804-02f248e1fac3" xsi:nil="true"/>
+  </documentManagement>
+</p:properties>
+</file>
+
+<file path=customXml/item3.xml><?xml version="1.0" encoding="utf-8"?>
 <ct:contentTypeSchema xmlns:ct="http://schemas.microsoft.com/office/2006/metadata/contentType" xmlns:ma="http://schemas.microsoft.com/office/2006/metadata/properties/metaAttributes" ct:_="" ma:_="" ma:contentTypeName="EC Document" ma:contentTypeID="0x010100258AA79CEB83498886A3A086811232500015D68561EDF2314DA91E1210E4D82B5C" ma:contentTypeVersion="39" ma:contentTypeDescription="Create a new document in this library." ma:contentTypeScope="" ma:versionID="56462b34cf91810872ea278535c8525e">
   <xsd:schema xmlns:xsd="http://www.w3.org/2001/XMLSchema" xmlns:xs="http://www.w3.org/2001/XMLSchema" xmlns:p="http://schemas.microsoft.com/office/2006/metadata/properties" xmlns:ns2="084a5cd8-1559-4e94-ac72-b94fb9abc19e" xmlns:ns3="58f75e61-ed07-41d3-a804-02f248e1fac3" targetNamespace="http://schemas.microsoft.com/office/2006/metadata/properties" ma:root="true" ma:fieldsID="b43b5fa606abdfc14cc643bd86f7f459" ns2:_="" ns3:_="">
     <xsd:import namespace="084a5cd8-1559-4e94-ac72-b94fb9abc19e"/>
@@ -4889,37 +7756,26 @@
 </ct:contentTypeSchema>
 </file>
 
-<file path=customXml/item2.xml><?xml version="1.0" encoding="utf-8"?>
-<p:properties xmlns:p="http://schemas.microsoft.com/office/2006/metadata/properties" xmlns:xsi="http://www.w3.org/2001/XMLSchema-instance" xmlns:pc="http://schemas.microsoft.com/office/infopath/2007/PartnerControls">
-  <documentManagement>
-    <Order1 xmlns="084a5cd8-1559-4e94-ac72-b94fb9abc19e">41</Order1>
-    <DocComments xmlns="084a5cd8-1559-4e94-ac72-b94fb9abc19e">Deliverable to be available on Portal.</DocComments>
-    <DocPublversion xmlns="084a5cd8-1559-4e94-ac72-b94fb9abc19e" xsi:nil="true"/>
-    <DocInternalExternal xmlns="084a5cd8-1559-4e94-ac72-b94fb9abc19e">Internal &amp; external</DocInternalExternal>
-    <ProgrCategory xmlns="084a5cd8-1559-4e94-ac72-b94fb9abc19e">3. Customised reports &amp; forms</ProgrCategory>
-    <ProgrGroup xmlns="084a5cd8-1559-4e94-ac72-b94fb9abc19e">01 HORIZON and EURATOM</ProgrGroup>
-    <DocStatus xmlns="084a5cd8-1559-4e94-ac72-b94fb9abc19e">Ready</DocStatus>
-    <DocPublDestination xmlns="084a5cd8-1559-4e94-ac72-b94fb9abc19e" xsi:nil="true"/>
-    <DocPublProtocol xmlns="084a5cd8-1559-4e94-ac72-b94fb9abc19e">TPL2-5 Programme tpl - Reporting forms, etc</DocPublProtocol>
-    <DocOfficerComments xmlns="084a5cd8-1559-4e94-ac72-b94fb9abc19e" xsi:nil="true"/>
-    <DocPublDate xmlns="084a5cd8-1559-4e94-ac72-b94fb9abc19e" xsi:nil="true"/>
-    <ITcomments xmlns="084a5cd8-1559-4e94-ac72-b94fb9abc19e" xsi:nil="true"/>
-    <ITstatus xmlns="084a5cd8-1559-4e94-ac72-b94fb9abc19e" xsi:nil="true"/>
-    <s86b xmlns="58f75e61-ed07-41d3-a804-02f248e1fac3" xsi:nil="true"/>
-  </documentManagement>
-</p:properties>
+<file path=customXml/itemProps1.xml><?xml version="1.0" encoding="utf-8"?>
+<ds:datastoreItem xmlns:ds="http://schemas.openxmlformats.org/officeDocument/2006/customXml" ds:itemID="{E5ABEBC2-8F24-42D8-B0A5-1D2B76C15645}">
+  <ds:schemaRefs>
+    <ds:schemaRef ds:uri="http://schemas.microsoft.com/sharepoint/v3/contenttype/forms"/>
+  </ds:schemaRefs>
+</ds:datastoreItem>
 </file>
 
-<file path=customXml/item3.xml><?xml version="1.0" encoding="utf-8"?>
-<?mso-contentType ?>
-<FormTemplates xmlns="http://schemas.microsoft.com/sharepoint/v3/contenttype/forms">
-  <Display>DocumentLibraryForm</Display>
-  <Edit>DocumentLibraryForm</Edit>
-  <New>DocumentLibraryForm</New>
-</FormTemplates>
+<file path=customXml/itemProps2.xml><?xml version="1.0" encoding="utf-8"?>
+<ds:datastoreItem xmlns:ds="http://schemas.openxmlformats.org/officeDocument/2006/customXml" ds:itemID="{FA90FD41-FA76-42DA-A088-7C01AECDABAA}">
+  <ds:schemaRefs>
+    <ds:schemaRef ds:uri="http://schemas.microsoft.com/office/2006/metadata/properties"/>
+    <ds:schemaRef ds:uri="http://schemas.microsoft.com/office/infopath/2007/PartnerControls"/>
+    <ds:schemaRef ds:uri="084a5cd8-1559-4e94-ac72-b94fb9abc19e"/>
+    <ds:schemaRef ds:uri="58f75e61-ed07-41d3-a804-02f248e1fac3"/>
+  </ds:schemaRefs>
+</ds:datastoreItem>
 </file>
 
-<file path=customXml/itemProps1.xml><?xml version="1.0" encoding="utf-8"?>
+<file path=customXml/itemProps3.xml><?xml version="1.0" encoding="utf-8"?>
 <ds:datastoreItem xmlns:ds="http://schemas.openxmlformats.org/officeDocument/2006/customXml" ds:itemID="{4B1213AF-11B3-4386-96A6-1D4CE320A5B3}">
   <ds:schemaRefs>
     <ds:schemaRef ds:uri="http://schemas.microsoft.com/office/2006/metadata/contentType"/>
@@ -4936,23 +7792,4 @@
     <ds:schemaRef ds:uri="http://schemas.microsoft.com/internal/obd"/>
   </ds:schemaRefs>
 </ds:datastoreItem>
-</file>
-
-<file path=customXml/itemProps2.xml><?xml version="1.0" encoding="utf-8"?>
-<ds:datastoreItem xmlns:ds="http://schemas.openxmlformats.org/officeDocument/2006/customXml" ds:itemID="{FA90FD41-FA76-42DA-A088-7C01AECDABAA}">
-  <ds:schemaRefs>
-    <ds:schemaRef ds:uri="http://schemas.microsoft.com/office/2006/metadata/properties"/>
-    <ds:schemaRef ds:uri="http://schemas.microsoft.com/office/infopath/2007/PartnerControls"/>
-    <ds:schemaRef ds:uri="084a5cd8-1559-4e94-ac72-b94fb9abc19e"/>
-    <ds:schemaRef ds:uri="58f75e61-ed07-41d3-a804-02f248e1fac3"/>
-  </ds:schemaRefs>
-</ds:datastoreItem>
-</file>
-
-<file path=customXml/itemProps3.xml><?xml version="1.0" encoding="utf-8"?>
-<ds:datastoreItem xmlns:ds="http://schemas.openxmlformats.org/officeDocument/2006/customXml" ds:itemID="{E5ABEBC2-8F24-42D8-B0A5-1D2B76C15645}">
-  <ds:schemaRefs>
-    <ds:schemaRef ds:uri="http://schemas.microsoft.com/sharepoint/v3/contenttype/forms"/>
-  </ds:schemaRefs>
-</ds:datastoreItem>
 </file>
</xml_diff>

<commit_message>
adds answers 12, 13a, 13b
</commit_message>
<xml_diff>
--- a/src/rdmo_docx_export/exports/templates/horizon-template.docx
+++ b/src/rdmo_docx_export/exports/templates/horizon-template.docx
@@ -1516,7 +1516,7 @@
           <w:color w:val="4AA55B"/>
           <w:lang w:val="en-GB"/>
         </w:rPr>
-        <w:t xml:space="preserve">Does the repository ensure that the data is assigned an identifier? Will the repository resolve the identifier to a digital object? </w:t>
+        <w:t>Does the repository ensure that the data is assigned an identifier?</w:t>
       </w:r>
     </w:p>
     <w:p>
@@ -1524,10 +1524,10 @@
         <w:t>{{Answer</w:t>
       </w:r>
       <w:r>
-        <w:t>1</w:t>
-      </w:r>
-      <w:r>
-        <w:t>3</w:t>
+        <w:t>13</w:t>
+      </w:r>
+      <w:r>
+        <w:t>a</w:t>
       </w:r>
       <w:r>
         <w:t>}}</w:t>
@@ -1542,18 +1542,35 @@
         <w:ind w:right="-35"/>
         <w:jc w:val="both"/>
         <w:rPr>
-          <w:b/>
-          <w:i/>
-          <w:lang w:val="en-GB"/>
-        </w:rPr>
-      </w:pPr>
-      <w:r>
-        <w:rPr>
-          <w:b/>
-          <w:i/>
-          <w:lang w:val="en-GB"/>
-        </w:rPr>
-        <w:t>Data:</w:t>
+          <w:i/>
+          <w:color w:val="4AA55B"/>
+          <w:lang w:val="en-GB"/>
+        </w:rPr>
+      </w:pPr>
+      <w:r>
+        <w:rPr>
+          <w:i/>
+          <w:color w:val="4AA55B"/>
+          <w:lang w:val="en-GB"/>
+        </w:rPr>
+        <w:t xml:space="preserve">Will the repository resolve the identifier to a digital object? </w:t>
+      </w:r>
+    </w:p>
+    <w:p>
+      <w:r>
+        <w:t>{{Answer</w:t>
+      </w:r>
+      <w:r>
+        <w:t>1</w:t>
+      </w:r>
+      <w:r>
+        <w:t>3</w:t>
+      </w:r>
+      <w:r>
+        <w:t>b</w:t>
+      </w:r>
+      <w:r>
+        <w:t>}}</w:t>
       </w:r>
     </w:p>
     <w:p>
@@ -1565,18 +1582,41 @@
         <w:ind w:right="-35"/>
         <w:jc w:val="both"/>
         <w:rPr>
-          <w:i/>
-          <w:color w:val="4AA55B"/>
-          <w:lang w:val="en-GB"/>
-        </w:rPr>
-      </w:pPr>
-      <w:r>
-        <w:rPr>
-          <w:i/>
-          <w:color w:val="4AA55B"/>
-          <w:lang w:val="en-GB"/>
-        </w:rPr>
-        <w:t>Will all data be made openly available? If certain datasets cannot be shared (or need to be shared under restricted access conditions), explain why, clearly separating legal and contractual reasons from intentional restrictions. Note that in multi-beneficiary projects it is also possible for specific beneficiaries to keep their data closed if opening their data goes against their legitimate interests or other constraints as per the Grant Agreement.</w:t>
+          <w:b/>
+          <w:i/>
+          <w:lang w:val="en-GB"/>
+        </w:rPr>
+      </w:pPr>
+      <w:r>
+        <w:rPr>
+          <w:b/>
+          <w:i/>
+          <w:lang w:val="en-GB"/>
+        </w:rPr>
+        <w:t>Data:</w:t>
+      </w:r>
+    </w:p>
+    <w:p>
+      <w:pPr>
+        <w:pStyle w:val="Textkrper"/>
+        <w:kinsoku w:val="0"/>
+        <w:overflowPunct w:val="0"/>
+        <w:spacing w:after="240"/>
+        <w:ind w:right="-35"/>
+        <w:jc w:val="both"/>
+        <w:rPr>
+          <w:i/>
+          <w:color w:val="4AA55B"/>
+          <w:lang w:val="en-GB"/>
+        </w:rPr>
+      </w:pPr>
+      <w:r>
+        <w:rPr>
+          <w:i/>
+          <w:color w:val="4AA55B"/>
+          <w:lang w:val="en-GB"/>
+        </w:rPr>
+        <w:t>Will all data be made openly available?</w:t>
       </w:r>
     </w:p>
     <w:p>
@@ -1629,18 +1669,35 @@
     <w:p>
       <w:pPr>
         <w:pStyle w:val="Textkrper"/>
-        <w:spacing w:after="240"/>
-        <w:ind w:right="-35"/>
-        <w:jc w:val="both"/>
-        <w:rPr>
-          <w:u w:val="single"/>
-        </w:rPr>
-      </w:pPr>
-      <w:r>
+        <w:kinsoku w:val="0"/>
+        <w:overflowPunct w:val="0"/>
+        <w:spacing w:after="240"/>
+        <w:ind w:right="-35"/>
+        <w:jc w:val="both"/>
+        <w:rPr>
+          <w:i/>
+          <w:color w:val="4AA55B"/>
+          <w:lang w:val="en-GB"/>
+        </w:rPr>
+      </w:pPr>
+      <w:r>
+        <w:rPr>
+          <w:i/>
+          <w:color w:val="4AA55B"/>
+          <w:lang w:val="en-GB"/>
+        </w:rPr>
+        <w:t>If certain datasets cannot be shared (or need to be shared under restricted access conditions), explain why, clearly separating legal and contractual reasons from intentional restrictions. Note that in multi-beneficiary projects it is also possible for specific beneficiaries to keep their data closed if opening their data goes against their legitimate interests or other constraints as per the Grant Agreement.</w:t>
+      </w:r>
+    </w:p>
+    <w:p>
+      <w:pPr>
+        <w:pStyle w:val="Textkrper"/>
+        <w:spacing w:after="240"/>
+        <w:ind w:right="-35"/>
+        <w:jc w:val="both"/>
         <w:rPr>
           <w:iCs/>
           <w:color w:val="000000" w:themeColor="text1"/>
-          <w:u w:val="single"/>
           <w:lang w:val="en-GB"/>
           <w14:textOutline w14:w="0" w14:cap="flat" w14:cmpd="sng" w14:algn="ctr">
             <w14:noFill/>
@@ -1648,15 +1705,6 @@
             <w14:round/>
           </w14:textOutline>
         </w:rPr>
-        <w:t>Datasets which cannot be shared – voluntary restrictions</w:t>
-      </w:r>
-    </w:p>
-    <w:p>
-      <w:pPr>
-        <w:pStyle w:val="Textkrper"/>
-        <w:spacing w:after="240"/>
-        <w:ind w:right="-35"/>
-        <w:jc w:val="both"/>
       </w:pPr>
       <w:r>
         <w:rPr>
@@ -1701,6 +1749,686 @@
     <w:p>
       <w:pPr>
         <w:pStyle w:val="Textkrper"/>
+        <w:kinsoku w:val="0"/>
+        <w:overflowPunct w:val="0"/>
+        <w:spacing w:after="240"/>
+        <w:ind w:right="-35"/>
+        <w:jc w:val="both"/>
+        <w:rPr>
+          <w:i/>
+          <w:color w:val="4AA55B"/>
+          <w:lang w:val="en-GB"/>
+        </w:rPr>
+      </w:pPr>
+      <w:r>
+        <w:rPr>
+          <w:i/>
+          <w:color w:val="4AA55B"/>
+          <w:lang w:val="en-GB"/>
+        </w:rPr>
+        <w:t>If an embargo is applied to give time to publish or seek protection of the intellectual property (e.g. patents), specify why and how long this will apply, bearing in mind that research data should be made available as soon as possible.</w:t>
+      </w:r>
+    </w:p>
+    <w:p>
+      <w:r>
+        <w:t>{{Answer</w:t>
+      </w:r>
+      <w:r>
+        <w:t>15</w:t>
+      </w:r>
+      <w:r>
+        <w:t>}}</w:t>
+      </w:r>
+    </w:p>
+    <w:p>
+      <w:pPr>
+        <w:pStyle w:val="Textkrper"/>
+        <w:kinsoku w:val="0"/>
+        <w:overflowPunct w:val="0"/>
+        <w:spacing w:after="240"/>
+        <w:ind w:right="-35"/>
+        <w:jc w:val="both"/>
+        <w:rPr>
+          <w:i/>
+          <w:color w:val="4AA55B"/>
+          <w:lang w:val="en-GB"/>
+        </w:rPr>
+      </w:pPr>
+      <w:r>
+        <w:rPr>
+          <w:i/>
+          <w:color w:val="4AA55B"/>
+          <w:lang w:val="en-GB"/>
+        </w:rPr>
+        <w:t>Will the data be accessible through a free and standardized access protocol?</w:t>
+      </w:r>
+    </w:p>
+    <w:p>
+      <w:r>
+        <w:t>{{Answer</w:t>
+      </w:r>
+      <w:r>
+        <w:t>1</w:t>
+      </w:r>
+      <w:r>
+        <w:t>6</w:t>
+      </w:r>
+      <w:r>
+        <w:t>}}</w:t>
+      </w:r>
+    </w:p>
+    <w:p>
+      <w:pPr>
+        <w:pStyle w:val="Textkrper"/>
+        <w:kinsoku w:val="0"/>
+        <w:overflowPunct w:val="0"/>
+        <w:spacing w:after="240"/>
+        <w:ind w:right="-35"/>
+        <w:jc w:val="both"/>
+        <w:rPr>
+          <w:i/>
+          <w:color w:val="4AA55B"/>
+          <w:lang w:val="en-GB"/>
+        </w:rPr>
+      </w:pPr>
+      <w:r>
+        <w:rPr>
+          <w:i/>
+          <w:color w:val="4AA55B"/>
+          <w:lang w:val="en-GB"/>
+        </w:rPr>
+        <w:t>If there are restrictions on use, how will access be provided to the data, both during and after the end of the project?</w:t>
+      </w:r>
+    </w:p>
+    <w:p>
+      <w:r>
+        <w:t>{{Answer</w:t>
+      </w:r>
+      <w:r>
+        <w:t>1</w:t>
+      </w:r>
+      <w:r>
+        <w:t>7</w:t>
+      </w:r>
+      <w:r>
+        <w:t>}}</w:t>
+      </w:r>
+    </w:p>
+    <w:p>
+      <w:pPr>
+        <w:pStyle w:val="Textkrper"/>
+        <w:kinsoku w:val="0"/>
+        <w:overflowPunct w:val="0"/>
+        <w:spacing w:after="240"/>
+        <w:ind w:right="-35"/>
+        <w:jc w:val="both"/>
+        <w:rPr>
+          <w:i/>
+          <w:color w:val="4AA55B"/>
+          <w:lang w:val="en-GB"/>
+        </w:rPr>
+      </w:pPr>
+      <w:r>
+        <w:rPr>
+          <w:i/>
+          <w:color w:val="4AA55B"/>
+          <w:lang w:val="en-GB"/>
+        </w:rPr>
+        <w:t>How will the identity of the person accessing the data be ascertained?</w:t>
+      </w:r>
+    </w:p>
+    <w:p>
+      <w:r>
+        <w:lastRenderedPageBreak/>
+        <w:t>{{Answer</w:t>
+      </w:r>
+      <w:r>
+        <w:t>1</w:t>
+      </w:r>
+      <w:r>
+        <w:t>8</w:t>
+      </w:r>
+      <w:r>
+        <w:t>}}</w:t>
+      </w:r>
+    </w:p>
+    <w:p>
+      <w:pPr>
+        <w:pStyle w:val="Textkrper"/>
+        <w:kinsoku w:val="0"/>
+        <w:overflowPunct w:val="0"/>
+        <w:spacing w:after="240"/>
+        <w:ind w:right="-35"/>
+        <w:jc w:val="both"/>
+        <w:rPr>
+          <w:i/>
+          <w:color w:val="4AA55B"/>
+          <w:lang w:val="en-GB"/>
+        </w:rPr>
+      </w:pPr>
+      <w:r>
+        <w:rPr>
+          <w:i/>
+          <w:color w:val="4AA55B"/>
+          <w:lang w:val="en-GB"/>
+        </w:rPr>
+        <w:t>Is there a need for a data access committee (e.g. to evaluate/approve access requests to personal/sensitive data)?</w:t>
+      </w:r>
+    </w:p>
+    <w:p>
+      <w:r>
+        <w:t>{{Answer</w:t>
+      </w:r>
+      <w:r>
+        <w:t>1</w:t>
+      </w:r>
+      <w:r>
+        <w:t>9</w:t>
+      </w:r>
+      <w:r>
+        <w:t>}}</w:t>
+      </w:r>
+    </w:p>
+    <w:p>
+      <w:pPr>
+        <w:pStyle w:val="Textkrper"/>
+        <w:kinsoku w:val="0"/>
+        <w:overflowPunct w:val="0"/>
+        <w:spacing w:after="240"/>
+        <w:ind w:right="-35"/>
+        <w:jc w:val="both"/>
+        <w:rPr>
+          <w:b/>
+          <w:i/>
+          <w:lang w:val="en-GB"/>
+        </w:rPr>
+      </w:pPr>
+      <w:r>
+        <w:rPr>
+          <w:b/>
+          <w:i/>
+          <w:lang w:val="en-GB"/>
+        </w:rPr>
+        <w:t>Metadata:</w:t>
+      </w:r>
+    </w:p>
+    <w:p>
+      <w:pPr>
+        <w:pStyle w:val="Textkrper"/>
+        <w:kinsoku w:val="0"/>
+        <w:overflowPunct w:val="0"/>
+        <w:spacing w:after="240"/>
+        <w:ind w:right="-35"/>
+        <w:jc w:val="both"/>
+        <w:rPr>
+          <w:i/>
+          <w:color w:val="4AA55B"/>
+          <w:lang w:val="en-GB"/>
+        </w:rPr>
+      </w:pPr>
+      <w:r>
+        <w:rPr>
+          <w:i/>
+          <w:color w:val="4AA55B"/>
+          <w:lang w:val="en-GB"/>
+        </w:rPr>
+        <w:t>Will metadata be made openly available and licenced under a public domain dedication CC0, as per the Grant Agreement? If not, please clarify why. Will metadata contain information to enable the user to access the data?</w:t>
+      </w:r>
+    </w:p>
+    <w:p>
+      <w:r>
+        <w:t>{{Answer</w:t>
+      </w:r>
+      <w:r>
+        <w:t>20</w:t>
+      </w:r>
+      <w:r>
+        <w:t>}}</w:t>
+      </w:r>
+    </w:p>
+    <w:p>
+      <w:pPr>
+        <w:pStyle w:val="Textkrper"/>
+        <w:kinsoku w:val="0"/>
+        <w:overflowPunct w:val="0"/>
+        <w:spacing w:after="240"/>
+        <w:ind w:right="-35"/>
+        <w:jc w:val="both"/>
+        <w:rPr>
+          <w:i/>
+          <w:color w:val="4AA55B"/>
+          <w:lang w:val="en-GB"/>
+        </w:rPr>
+      </w:pPr>
+      <w:r>
+        <w:rPr>
+          <w:i/>
+          <w:color w:val="4AA55B"/>
+          <w:lang w:val="en-GB"/>
+        </w:rPr>
+        <w:t>How long will the data remain available and findable? Will metadata be guaranteed to remain available after data is no longer available?</w:t>
+      </w:r>
+    </w:p>
+    <w:p>
+      <w:r>
+        <w:t>{{Answer</w:t>
+      </w:r>
+      <w:r>
+        <w:t>2</w:t>
+      </w:r>
+      <w:r>
+        <w:t>1</w:t>
+      </w:r>
+      <w:r>
+        <w:t>}}</w:t>
+      </w:r>
+    </w:p>
+    <w:p>
+      <w:pPr>
+        <w:pStyle w:val="Textkrper"/>
+        <w:kinsoku w:val="0"/>
+        <w:overflowPunct w:val="0"/>
+        <w:spacing w:after="240"/>
+        <w:ind w:right="-35"/>
+        <w:jc w:val="both"/>
+        <w:rPr>
+          <w:i/>
+          <w:color w:val="4AA55B"/>
+          <w:lang w:val="en-GB"/>
+        </w:rPr>
+      </w:pPr>
+      <w:r>
+        <w:rPr>
+          <w:i/>
+          <w:color w:val="4AA55B"/>
+          <w:lang w:val="en-GB"/>
+        </w:rPr>
+        <w:t>Will documentation or reference about any software be needed to access or read the data be included? Will it be possible to include the relevant software (e.g. in open source code)?</w:t>
+      </w:r>
+    </w:p>
+    <w:p>
+      <w:r>
+        <w:t>{{Answer</w:t>
+      </w:r>
+      <w:r>
+        <w:t>2</w:t>
+      </w:r>
+      <w:r>
+        <w:t>2</w:t>
+      </w:r>
+      <w:r>
+        <w:t>}}</w:t>
+      </w:r>
+    </w:p>
+    <w:p>
+      <w:pPr>
+        <w:pStyle w:val="berschrift3"/>
+      </w:pPr>
+      <w:r>
+        <w:t>Making data</w:t>
+      </w:r>
+      <w:r>
+        <w:rPr>
+          <w:spacing w:val="-4"/>
+        </w:rPr>
+        <w:t xml:space="preserve"> </w:t>
+      </w:r>
+      <w:r>
+        <w:t>interoperable</w:t>
+      </w:r>
+    </w:p>
+    <w:p>
+      <w:pPr>
+        <w:pStyle w:val="Textkrper"/>
+        <w:kinsoku w:val="0"/>
+        <w:overflowPunct w:val="0"/>
+        <w:spacing w:after="240"/>
+        <w:ind w:right="-35"/>
+        <w:jc w:val="both"/>
+        <w:rPr>
+          <w:i/>
+          <w:color w:val="4AA55B"/>
+          <w:lang w:val="en-GB"/>
+        </w:rPr>
+      </w:pPr>
+      <w:r>
+        <w:rPr>
+          <w:i/>
+          <w:color w:val="4AA55B"/>
+          <w:lang w:val="en-GB"/>
+        </w:rPr>
+        <w:t xml:space="preserve">What data and metadata vocabularies, standards, formats or methodologies will you follow to make your data interoperable to allow data exchange and re-use within and across disciplines? Will you follow community-endorsed interoperability best practices? Which ones? </w:t>
+      </w:r>
+    </w:p>
+    <w:p>
+      <w:r>
+        <w:t>{{Answer</w:t>
+      </w:r>
+      <w:r>
+        <w:t>2</w:t>
+      </w:r>
+      <w:r>
+        <w:t>3</w:t>
+      </w:r>
+      <w:r>
+        <w:t>}}</w:t>
+      </w:r>
+    </w:p>
+    <w:p>
+      <w:pPr>
+        <w:pStyle w:val="Textkrper"/>
+        <w:kinsoku w:val="0"/>
+        <w:overflowPunct w:val="0"/>
+        <w:spacing w:after="240"/>
+        <w:ind w:right="-35"/>
+        <w:jc w:val="both"/>
+        <w:rPr>
+          <w:i/>
+          <w:color w:val="4AA55B"/>
+          <w:lang w:val="en-GB"/>
+        </w:rPr>
+      </w:pPr>
+      <w:r>
+        <w:rPr>
+          <w:i/>
+          <w:color w:val="4AA55B"/>
+          <w:lang w:val="en-GB"/>
+        </w:rPr>
+        <w:t>In case it is unavoidable that you use uncommon or generate project specific ontologies or vocabularies, will you provide mappings to more commonly used ontologies? Will you openly publish the generated ontologies or vocabularies to allow reusing, refining or extending them?</w:t>
+      </w:r>
+    </w:p>
+    <w:p>
+      <w:r>
+        <w:t>{{Answer</w:t>
+      </w:r>
+      <w:r>
+        <w:t>2</w:t>
+      </w:r>
+      <w:r>
+        <w:t>4</w:t>
+      </w:r>
+      <w:r>
+        <w:t>}}</w:t>
+      </w:r>
+    </w:p>
+    <w:p>
+      <w:pPr>
+        <w:pStyle w:val="Textkrper"/>
+        <w:kinsoku w:val="0"/>
+        <w:overflowPunct w:val="0"/>
+        <w:spacing w:after="240"/>
+        <w:ind w:right="-35"/>
+        <w:jc w:val="both"/>
+        <w:rPr>
+          <w:i/>
+          <w:color w:val="4AA55B"/>
+          <w:lang w:val="en-GB"/>
+        </w:rPr>
+      </w:pPr>
+      <w:r>
+        <w:rPr>
+          <w:i/>
+          <w:color w:val="4AA55B"/>
+          <w:lang w:val="en-GB"/>
+        </w:rPr>
+        <w:t>Will your data include qualified references</w:t>
+      </w:r>
+      <w:r>
+        <w:rPr>
+          <w:i/>
+          <w:color w:val="4AA55B"/>
+          <w:lang w:val="en-GB"/>
+        </w:rPr>
+        <w:footnoteReference w:id="2"/>
+      </w:r>
+      <w:r>
+        <w:rPr>
+          <w:i/>
+          <w:color w:val="4AA55B"/>
+          <w:lang w:val="en-GB"/>
+        </w:rPr>
+        <w:t xml:space="preserve"> to other data (e.g. other data from your project, or datasets from previous research)?</w:t>
+      </w:r>
+    </w:p>
+    <w:p>
+      <w:r>
+        <w:t>{{Answer</w:t>
+      </w:r>
+      <w:r>
+        <w:t>2</w:t>
+      </w:r>
+      <w:r>
+        <w:t>5</w:t>
+      </w:r>
+      <w:r>
+        <w:t>}}</w:t>
+      </w:r>
+    </w:p>
+    <w:p>
+      <w:pPr>
+        <w:pStyle w:val="berschrift3"/>
+      </w:pPr>
+      <w:r>
+        <w:t>Increase data re-use</w:t>
+      </w:r>
+    </w:p>
+    <w:p>
+      <w:pPr>
+        <w:pStyle w:val="Textkrper"/>
+        <w:kinsoku w:val="0"/>
+        <w:overflowPunct w:val="0"/>
+        <w:spacing w:after="240"/>
+        <w:ind w:right="-35"/>
+        <w:jc w:val="both"/>
+        <w:rPr>
+          <w:i/>
+          <w:color w:val="4AA55B"/>
+          <w:lang w:val="en-GB"/>
+        </w:rPr>
+      </w:pPr>
+      <w:r>
+        <w:rPr>
+          <w:i/>
+          <w:color w:val="4AA55B"/>
+          <w:lang w:val="en-GB"/>
+        </w:rPr>
+        <w:t>How will you provide documentation needed to validate data analysis and facilitate data re-use (e.g. readme files with information on methodology, codebooks, data cleaning, analyses, variable definitions, units of measurement, etc.)?</w:t>
+      </w:r>
+    </w:p>
+    <w:p>
+      <w:r>
+        <w:t>{{Answer</w:t>
+      </w:r>
+      <w:r>
+        <w:t>2</w:t>
+      </w:r>
+      <w:r>
+        <w:t>6</w:t>
+      </w:r>
+      <w:r>
+        <w:t>}}</w:t>
+      </w:r>
+    </w:p>
+    <w:p>
+      <w:pPr>
+        <w:pStyle w:val="Textkrper"/>
+        <w:kinsoku w:val="0"/>
+        <w:overflowPunct w:val="0"/>
+        <w:spacing w:after="240"/>
+        <w:ind w:right="-35"/>
+        <w:jc w:val="both"/>
+        <w:rPr>
+          <w:i/>
+          <w:color w:val="4AA55B"/>
+          <w:lang w:val="en-GB"/>
+        </w:rPr>
+      </w:pPr>
+      <w:r>
+        <w:rPr>
+          <w:i/>
+          <w:color w:val="4AA55B"/>
+          <w:lang w:val="en-GB"/>
+        </w:rPr>
+        <w:t>Will your data be made freely available in the public domain to permit the widest re-use possible? Will your data be licensed using standard reuse licenses, in line with the obligations set out in the Grant Agreement?</w:t>
+      </w:r>
+    </w:p>
+    <w:p>
+      <w:r>
+        <w:t>{{Answer</w:t>
+      </w:r>
+      <w:r>
+        <w:t>2</w:t>
+      </w:r>
+      <w:r>
+        <w:t>7</w:t>
+      </w:r>
+      <w:r>
+        <w:t>}}</w:t>
+      </w:r>
+    </w:p>
+    <w:p>
+      <w:pPr>
+        <w:pStyle w:val="Textkrper"/>
+        <w:kinsoku w:val="0"/>
+        <w:overflowPunct w:val="0"/>
+        <w:spacing w:after="240"/>
+        <w:ind w:right="-35"/>
+        <w:jc w:val="both"/>
+        <w:rPr>
+          <w:i/>
+          <w:color w:val="4AA55B"/>
+          <w:lang w:val="en-GB"/>
+        </w:rPr>
+      </w:pPr>
+      <w:r>
+        <w:rPr>
+          <w:i/>
+          <w:color w:val="4AA55B"/>
+          <w:lang w:val="en-GB"/>
+        </w:rPr>
+        <w:t>Will the data produced in the project be useable by third parties, in particular after the end of the project?</w:t>
+      </w:r>
+    </w:p>
+    <w:p>
+      <w:r>
+        <w:t>{{Answer</w:t>
+      </w:r>
+      <w:r>
+        <w:t>2</w:t>
+      </w:r>
+      <w:r>
+        <w:t>8</w:t>
+      </w:r>
+      <w:r>
+        <w:t>}}</w:t>
+      </w:r>
+    </w:p>
+    <w:p>
+      <w:pPr>
+        <w:pStyle w:val="Textkrper"/>
+        <w:kinsoku w:val="0"/>
+        <w:overflowPunct w:val="0"/>
+        <w:spacing w:after="240"/>
+        <w:ind w:right="-35"/>
+        <w:jc w:val="both"/>
+        <w:rPr>
+          <w:i/>
+          <w:color w:val="4AA55B"/>
+          <w:lang w:val="en-GB"/>
+        </w:rPr>
+      </w:pPr>
+      <w:r>
+        <w:rPr>
+          <w:i/>
+          <w:color w:val="4AA55B"/>
+          <w:lang w:val="en-GB"/>
+        </w:rPr>
+        <w:lastRenderedPageBreak/>
+        <w:t>Will the provenance of the data be thoroughly documented using the appropriate standards?</w:t>
+      </w:r>
+    </w:p>
+    <w:p>
+      <w:r>
+        <w:t>{{Answer</w:t>
+      </w:r>
+      <w:r>
+        <w:t>2</w:t>
+      </w:r>
+      <w:r>
+        <w:t>9</w:t>
+      </w:r>
+      <w:r>
+        <w:t>}}</w:t>
+      </w:r>
+    </w:p>
+    <w:p>
+      <w:pPr>
+        <w:pStyle w:val="Textkrper"/>
+        <w:kinsoku w:val="0"/>
+        <w:overflowPunct w:val="0"/>
+        <w:spacing w:after="240"/>
+        <w:ind w:right="-35"/>
+        <w:jc w:val="both"/>
+        <w:rPr>
+          <w:i/>
+          <w:color w:val="4AA55B"/>
+          <w:lang w:val="en-GB"/>
+        </w:rPr>
+      </w:pPr>
+      <w:r>
+        <w:rPr>
+          <w:i/>
+          <w:color w:val="4AA55B"/>
+          <w:lang w:val="en-GB"/>
+        </w:rPr>
+        <w:t>Describe all relevant d</w:t>
+      </w:r>
+      <w:r>
+        <w:rPr>
+          <w:i/>
+          <w:color w:val="4AA55B"/>
+          <w:lang w:val="en-GB"/>
+        </w:rPr>
+        <w:t>ata quality assurance processes.</w:t>
+      </w:r>
+    </w:p>
+    <w:p>
+      <w:r>
+        <w:t>{{Answer</w:t>
+      </w:r>
+      <w:r>
+        <w:t>30</w:t>
+      </w:r>
+      <w:r>
+        <w:t>}}</w:t>
+      </w:r>
+    </w:p>
+    <w:p>
+      <w:pPr>
+        <w:pStyle w:val="Textkrper"/>
+        <w:kinsoku w:val="0"/>
+        <w:overflowPunct w:val="0"/>
+        <w:spacing w:after="240"/>
+        <w:ind w:right="-35"/>
+        <w:jc w:val="both"/>
+        <w:rPr>
+          <w:i/>
+          <w:color w:val="4AA55B"/>
+          <w:lang w:val="en-GB"/>
+        </w:rPr>
+      </w:pPr>
+      <w:r>
+        <w:rPr>
+          <w:i/>
+          <w:color w:val="4AA55B"/>
+          <w:lang w:val="en-GB"/>
+        </w:rPr>
+        <w:t>Further to the FAIR principles, DMPs should also address research outputs other than data, and should carefully consider aspects related to the allocation of resources, data security and ethical aspects.</w:t>
+      </w:r>
+    </w:p>
+    <w:p>
+      <w:pPr>
+        <w:pStyle w:val="Textkrper"/>
         <w:spacing w:after="240"/>
         <w:ind w:right="-35"/>
         <w:jc w:val="both"/>
@@ -1708,6 +2436,7 @@
           <w:u w:val="single"/>
         </w:rPr>
       </w:pPr>
+      <w:bookmarkStart w:id="7" w:name="_Toc69311945"/>
       <w:r>
         <w:rPr>
           <w:iCs/>
@@ -1720,25 +2449,15 @@
             <w14:round/>
           </w14:textOutline>
         </w:rPr>
-        <w:t>Datasets which cannot be shared - legal / contractual reasons</w:t>
-      </w:r>
-    </w:p>
-    <w:p>
-      <w:pPr>
-        <w:pStyle w:val="Textkrper"/>
-        <w:spacing w:after="240"/>
-        <w:ind w:right="-35"/>
-        <w:jc w:val="both"/>
-        <w:rPr>
-          <w:iCs/>
-          <w:color w:val="000000" w:themeColor="text1"/>
-          <w:lang w:val="en-GB"/>
-          <w14:textOutline w14:w="0" w14:cap="flat" w14:cmpd="sng" w14:algn="ctr">
-            <w14:noFill/>
-            <w14:prstDash w14:val="solid"/>
-            <w14:round/>
-          </w14:textOutline>
-        </w:rPr>
+        <w:t>Allocation of resources</w:t>
+      </w:r>
+    </w:p>
+    <w:p>
+      <w:pPr>
+        <w:pStyle w:val="Textkrper"/>
+        <w:spacing w:after="240"/>
+        <w:ind w:right="-35"/>
+        <w:jc w:val="both"/>
       </w:pPr>
       <w:r>
         <w:rPr>
@@ -1777,687 +2496,7 @@
             <w14:round/>
           </w14:textOutline>
         </w:rPr>
-        <w:t>nswer14c}}</w:t>
-      </w:r>
-    </w:p>
-    <w:p>
-      <w:pPr>
-        <w:pStyle w:val="Textkrper"/>
-        <w:kinsoku w:val="0"/>
-        <w:overflowPunct w:val="0"/>
-        <w:spacing w:after="240"/>
-        <w:ind w:right="-35"/>
-        <w:jc w:val="both"/>
-        <w:rPr>
-          <w:i/>
-          <w:color w:val="4AA55B"/>
-          <w:lang w:val="en-GB"/>
-        </w:rPr>
-      </w:pPr>
-      <w:r>
-        <w:rPr>
-          <w:i/>
-          <w:color w:val="4AA55B"/>
-          <w:lang w:val="en-GB"/>
-        </w:rPr>
-        <w:t>If an embargo is applied to give time to publish or seek protection of the intellectual property (e.g. patents), specify why and how long this will apply, bearing in mind that research data should be made available as soon as possible.</w:t>
-      </w:r>
-    </w:p>
-    <w:p>
-      <w:r>
-        <w:t>{{Answer</w:t>
-      </w:r>
-      <w:r>
-        <w:t>15</w:t>
-      </w:r>
-      <w:r>
-        <w:t>}}</w:t>
-      </w:r>
-    </w:p>
-    <w:p>
-      <w:pPr>
-        <w:pStyle w:val="Textkrper"/>
-        <w:kinsoku w:val="0"/>
-        <w:overflowPunct w:val="0"/>
-        <w:spacing w:after="240"/>
-        <w:ind w:right="-35"/>
-        <w:jc w:val="both"/>
-        <w:rPr>
-          <w:i/>
-          <w:color w:val="4AA55B"/>
-          <w:lang w:val="en-GB"/>
-        </w:rPr>
-      </w:pPr>
-      <w:r>
-        <w:rPr>
-          <w:i/>
-          <w:color w:val="4AA55B"/>
-          <w:lang w:val="en-GB"/>
-        </w:rPr>
-        <w:t>Will the data be accessible through a free and standardized access protocol?</w:t>
-      </w:r>
-    </w:p>
-    <w:p>
-      <w:r>
-        <w:t>{{Answer</w:t>
-      </w:r>
-      <w:r>
-        <w:t>1</w:t>
-      </w:r>
-      <w:r>
-        <w:t>6</w:t>
-      </w:r>
-      <w:r>
-        <w:t>}}</w:t>
-      </w:r>
-    </w:p>
-    <w:p>
-      <w:pPr>
-        <w:pStyle w:val="Textkrper"/>
-        <w:kinsoku w:val="0"/>
-        <w:overflowPunct w:val="0"/>
-        <w:spacing w:after="240"/>
-        <w:ind w:right="-35"/>
-        <w:jc w:val="both"/>
-        <w:rPr>
-          <w:i/>
-          <w:color w:val="4AA55B"/>
-          <w:lang w:val="en-GB"/>
-        </w:rPr>
-      </w:pPr>
-      <w:r>
-        <w:rPr>
-          <w:i/>
-          <w:color w:val="4AA55B"/>
-          <w:lang w:val="en-GB"/>
-        </w:rPr>
-        <w:t>If there are restrictions on use, how will access be provided to the data, both during and after the end of the project?</w:t>
-      </w:r>
-    </w:p>
-    <w:p>
-      <w:r>
-        <w:t>{{Answer</w:t>
-      </w:r>
-      <w:r>
-        <w:t>1</w:t>
-      </w:r>
-      <w:r>
-        <w:t>7</w:t>
-      </w:r>
-      <w:r>
-        <w:t>}}</w:t>
-      </w:r>
-    </w:p>
-    <w:p>
-      <w:pPr>
-        <w:pStyle w:val="Textkrper"/>
-        <w:kinsoku w:val="0"/>
-        <w:overflowPunct w:val="0"/>
-        <w:spacing w:after="240"/>
-        <w:ind w:right="-35"/>
-        <w:jc w:val="both"/>
-        <w:rPr>
-          <w:i/>
-          <w:color w:val="4AA55B"/>
-          <w:lang w:val="en-GB"/>
-        </w:rPr>
-      </w:pPr>
-      <w:r>
-        <w:rPr>
-          <w:i/>
-          <w:color w:val="4AA55B"/>
-          <w:lang w:val="en-GB"/>
-        </w:rPr>
-        <w:lastRenderedPageBreak/>
-        <w:t>How will the identity of the person accessing the data be ascertained?</w:t>
-      </w:r>
-    </w:p>
-    <w:p>
-      <w:r>
-        <w:t>{{Answer</w:t>
-      </w:r>
-      <w:r>
-        <w:t>1</w:t>
-      </w:r>
-      <w:r>
-        <w:t>8</w:t>
-      </w:r>
-      <w:r>
-        <w:t>}}</w:t>
-      </w:r>
-    </w:p>
-    <w:p>
-      <w:pPr>
-        <w:pStyle w:val="Textkrper"/>
-        <w:kinsoku w:val="0"/>
-        <w:overflowPunct w:val="0"/>
-        <w:spacing w:after="240"/>
-        <w:ind w:right="-35"/>
-        <w:jc w:val="both"/>
-        <w:rPr>
-          <w:i/>
-          <w:color w:val="4AA55B"/>
-          <w:lang w:val="en-GB"/>
-        </w:rPr>
-      </w:pPr>
-      <w:r>
-        <w:rPr>
-          <w:i/>
-          <w:color w:val="4AA55B"/>
-          <w:lang w:val="en-GB"/>
-        </w:rPr>
-        <w:t>Is there a need for a data access committee (e.g. to evaluate/approve access requests to personal/sensitive data)?</w:t>
-      </w:r>
-    </w:p>
-    <w:p>
-      <w:r>
-        <w:t>{{Answer</w:t>
-      </w:r>
-      <w:r>
-        <w:t>1</w:t>
-      </w:r>
-      <w:r>
-        <w:t>9</w:t>
-      </w:r>
-      <w:r>
-        <w:t>}}</w:t>
-      </w:r>
-    </w:p>
-    <w:p>
-      <w:pPr>
-        <w:pStyle w:val="Textkrper"/>
-        <w:kinsoku w:val="0"/>
-        <w:overflowPunct w:val="0"/>
-        <w:spacing w:after="240"/>
-        <w:ind w:right="-35"/>
-        <w:jc w:val="both"/>
-        <w:rPr>
-          <w:b/>
-          <w:i/>
-          <w:lang w:val="en-GB"/>
-        </w:rPr>
-      </w:pPr>
-      <w:r>
-        <w:rPr>
-          <w:b/>
-          <w:i/>
-          <w:lang w:val="en-GB"/>
-        </w:rPr>
-        <w:t>Metadata:</w:t>
-      </w:r>
-    </w:p>
-    <w:p>
-      <w:pPr>
-        <w:pStyle w:val="Textkrper"/>
-        <w:kinsoku w:val="0"/>
-        <w:overflowPunct w:val="0"/>
-        <w:spacing w:after="240"/>
-        <w:ind w:right="-35"/>
-        <w:jc w:val="both"/>
-        <w:rPr>
-          <w:i/>
-          <w:color w:val="4AA55B"/>
-          <w:lang w:val="en-GB"/>
-        </w:rPr>
-      </w:pPr>
-      <w:r>
-        <w:rPr>
-          <w:i/>
-          <w:color w:val="4AA55B"/>
-          <w:lang w:val="en-GB"/>
-        </w:rPr>
-        <w:t>Will metadata be made openly available and licenced under a public domain dedication CC0, as per the Grant Agreement? If not, please clarify why. Will metadata contain information to enable the user to access the data?</w:t>
-      </w:r>
-    </w:p>
-    <w:p>
-      <w:r>
-        <w:t>{{Answer</w:t>
-      </w:r>
-      <w:r>
-        <w:t>20</w:t>
-      </w:r>
-      <w:r>
-        <w:t>}}</w:t>
-      </w:r>
-    </w:p>
-    <w:p>
-      <w:pPr>
-        <w:pStyle w:val="Textkrper"/>
-        <w:kinsoku w:val="0"/>
-        <w:overflowPunct w:val="0"/>
-        <w:spacing w:after="240"/>
-        <w:ind w:right="-35"/>
-        <w:jc w:val="both"/>
-        <w:rPr>
-          <w:i/>
-          <w:color w:val="4AA55B"/>
-          <w:lang w:val="en-GB"/>
-        </w:rPr>
-      </w:pPr>
-      <w:r>
-        <w:rPr>
-          <w:i/>
-          <w:color w:val="4AA55B"/>
-          <w:lang w:val="en-GB"/>
-        </w:rPr>
-        <w:t>How long will the data remain available and findable? Will metadata be guaranteed to remain available after data is no longer available?</w:t>
-      </w:r>
-    </w:p>
-    <w:p>
-      <w:r>
-        <w:t>{{Answer</w:t>
-      </w:r>
-      <w:r>
-        <w:t>2</w:t>
-      </w:r>
-      <w:r>
-        <w:t>1</w:t>
-      </w:r>
-      <w:r>
-        <w:t>}}</w:t>
-      </w:r>
-    </w:p>
-    <w:p>
-      <w:pPr>
-        <w:pStyle w:val="Textkrper"/>
-        <w:kinsoku w:val="0"/>
-        <w:overflowPunct w:val="0"/>
-        <w:spacing w:after="240"/>
-        <w:ind w:right="-35"/>
-        <w:jc w:val="both"/>
-        <w:rPr>
-          <w:i/>
-          <w:color w:val="4AA55B"/>
-          <w:lang w:val="en-GB"/>
-        </w:rPr>
-      </w:pPr>
-      <w:r>
-        <w:rPr>
-          <w:i/>
-          <w:color w:val="4AA55B"/>
-          <w:lang w:val="en-GB"/>
-        </w:rPr>
-        <w:t>Will documentation or reference about any software be needed to access or read the data be included? Will it be possible to include the relevant software (e.g. in open source code)?</w:t>
-      </w:r>
-    </w:p>
-    <w:p>
-      <w:r>
-        <w:t>{{Answer</w:t>
-      </w:r>
-      <w:r>
-        <w:t>2</w:t>
-      </w:r>
-      <w:r>
-        <w:t>2</w:t>
-      </w:r>
-      <w:r>
-        <w:t>}}</w:t>
-      </w:r>
-    </w:p>
-    <w:p>
-      <w:pPr>
-        <w:pStyle w:val="berschrift3"/>
-      </w:pPr>
-      <w:r>
-        <w:t>Making data</w:t>
-      </w:r>
-      <w:r>
-        <w:rPr>
-          <w:spacing w:val="-4"/>
-        </w:rPr>
-        <w:t xml:space="preserve"> </w:t>
-      </w:r>
-      <w:r>
-        <w:t>interoperable</w:t>
-      </w:r>
-    </w:p>
-    <w:p>
-      <w:pPr>
-        <w:pStyle w:val="Textkrper"/>
-        <w:kinsoku w:val="0"/>
-        <w:overflowPunct w:val="0"/>
-        <w:spacing w:after="240"/>
-        <w:ind w:right="-35"/>
-        <w:jc w:val="both"/>
-        <w:rPr>
-          <w:i/>
-          <w:color w:val="4AA55B"/>
-          <w:lang w:val="en-GB"/>
-        </w:rPr>
-      </w:pPr>
-      <w:r>
-        <w:rPr>
-          <w:i/>
-          <w:color w:val="4AA55B"/>
-          <w:lang w:val="en-GB"/>
-        </w:rPr>
-        <w:t xml:space="preserve">What data and metadata vocabularies, standards, formats or methodologies will you follow to make your data interoperable to allow data exchange and re-use within and across disciplines? Will you follow community-endorsed interoperability best practices? Which ones? </w:t>
-      </w:r>
-    </w:p>
-    <w:p>
-      <w:r>
-        <w:t>{{Answer</w:t>
-      </w:r>
-      <w:r>
-        <w:t>2</w:t>
-      </w:r>
-      <w:r>
-        <w:t>3</w:t>
-      </w:r>
-      <w:r>
-        <w:t>}}</w:t>
-      </w:r>
-    </w:p>
-    <w:p>
-      <w:pPr>
-        <w:pStyle w:val="Textkrper"/>
-        <w:kinsoku w:val="0"/>
-        <w:overflowPunct w:val="0"/>
-        <w:spacing w:after="240"/>
-        <w:ind w:right="-35"/>
-        <w:jc w:val="both"/>
-        <w:rPr>
-          <w:i/>
-          <w:color w:val="4AA55B"/>
-          <w:lang w:val="en-GB"/>
-        </w:rPr>
-      </w:pPr>
-      <w:r>
-        <w:rPr>
-          <w:i/>
-          <w:color w:val="4AA55B"/>
-          <w:lang w:val="en-GB"/>
-        </w:rPr>
-        <w:t>In case it is unavoidable that you use uncommon or generate project specific ontologies or vocabularies, will you provide mappings to more commonly used ontologies? Will you openly publish the generated ontologies or vocabularies to allow reusing, refining or extending them?</w:t>
-      </w:r>
-    </w:p>
-    <w:p>
-      <w:r>
-        <w:t>{{Answer</w:t>
-      </w:r>
-      <w:r>
-        <w:t>2</w:t>
-      </w:r>
-      <w:r>
-        <w:t>4</w:t>
-      </w:r>
-      <w:r>
-        <w:t>}}</w:t>
-      </w:r>
-    </w:p>
-    <w:p>
-      <w:pPr>
-        <w:pStyle w:val="Textkrper"/>
-        <w:kinsoku w:val="0"/>
-        <w:overflowPunct w:val="0"/>
-        <w:spacing w:after="240"/>
-        <w:ind w:right="-35"/>
-        <w:jc w:val="both"/>
-        <w:rPr>
-          <w:i/>
-          <w:color w:val="4AA55B"/>
-          <w:lang w:val="en-GB"/>
-        </w:rPr>
-      </w:pPr>
-      <w:r>
-        <w:rPr>
-          <w:i/>
-          <w:color w:val="4AA55B"/>
-          <w:lang w:val="en-GB"/>
-        </w:rPr>
-        <w:t>Will your data include qualified references</w:t>
-      </w:r>
-      <w:r>
-        <w:rPr>
-          <w:i/>
-          <w:color w:val="4AA55B"/>
-          <w:lang w:val="en-GB"/>
-        </w:rPr>
-        <w:footnoteReference w:id="2"/>
-      </w:r>
-      <w:r>
-        <w:rPr>
-          <w:i/>
-          <w:color w:val="4AA55B"/>
-          <w:lang w:val="en-GB"/>
-        </w:rPr>
-        <w:t xml:space="preserve"> to other data (e.g. other data from your project, or datasets from previous research)?</w:t>
-      </w:r>
-    </w:p>
-    <w:p>
-      <w:r>
-        <w:t>{{Answer</w:t>
-      </w:r>
-      <w:r>
-        <w:t>2</w:t>
-      </w:r>
-      <w:r>
-        <w:t>5</w:t>
-      </w:r>
-      <w:r>
-        <w:t>}}</w:t>
-      </w:r>
-    </w:p>
-    <w:p>
-      <w:pPr>
-        <w:pStyle w:val="berschrift3"/>
-      </w:pPr>
-      <w:r>
-        <w:t>Increase data re-use</w:t>
-      </w:r>
-    </w:p>
-    <w:p>
-      <w:pPr>
-        <w:pStyle w:val="Textkrper"/>
-        <w:kinsoku w:val="0"/>
-        <w:overflowPunct w:val="0"/>
-        <w:spacing w:after="240"/>
-        <w:ind w:right="-35"/>
-        <w:jc w:val="both"/>
-        <w:rPr>
-          <w:i/>
-          <w:color w:val="4AA55B"/>
-          <w:lang w:val="en-GB"/>
-        </w:rPr>
-      </w:pPr>
-      <w:r>
-        <w:rPr>
-          <w:i/>
-          <w:color w:val="4AA55B"/>
-          <w:lang w:val="en-GB"/>
-        </w:rPr>
-        <w:t>How will you provide documentation needed to validate data analysis and facilitate data re-use (e.g. readme files with information on methodology, codebooks, data cleaning, analyses, variable definitions, units of measurement, etc.)?</w:t>
-      </w:r>
-    </w:p>
-    <w:p>
-      <w:r>
-        <w:t>{{Answer</w:t>
-      </w:r>
-      <w:r>
-        <w:t>2</w:t>
-      </w:r>
-      <w:r>
-        <w:t>6</w:t>
-      </w:r>
-      <w:r>
-        <w:t>}}</w:t>
-      </w:r>
-    </w:p>
-    <w:p>
-      <w:pPr>
-        <w:pStyle w:val="Textkrper"/>
-        <w:kinsoku w:val="0"/>
-        <w:overflowPunct w:val="0"/>
-        <w:spacing w:after="240"/>
-        <w:ind w:right="-35"/>
-        <w:jc w:val="both"/>
-        <w:rPr>
-          <w:i/>
-          <w:color w:val="4AA55B"/>
-          <w:lang w:val="en-GB"/>
-        </w:rPr>
-      </w:pPr>
-      <w:r>
-        <w:rPr>
-          <w:i/>
-          <w:color w:val="4AA55B"/>
-          <w:lang w:val="en-GB"/>
-        </w:rPr>
-        <w:t>Will your data be made freely available in the public domain to permit the widest re-use possible? Will your data be licensed using standard reuse licenses, in line with the obligations set out in the Grant Agreement?</w:t>
-      </w:r>
-    </w:p>
-    <w:p>
-      <w:r>
-        <w:t>{{Answer</w:t>
-      </w:r>
-      <w:r>
-        <w:t>2</w:t>
-      </w:r>
-      <w:r>
-        <w:t>7</w:t>
-      </w:r>
-      <w:r>
-        <w:t>}}</w:t>
-      </w:r>
-    </w:p>
-    <w:p>
-      <w:pPr>
-        <w:pStyle w:val="Textkrper"/>
-        <w:kinsoku w:val="0"/>
-        <w:overflowPunct w:val="0"/>
-        <w:spacing w:after="240"/>
-        <w:ind w:right="-35"/>
-        <w:jc w:val="both"/>
-        <w:rPr>
-          <w:i/>
-          <w:color w:val="4AA55B"/>
-          <w:lang w:val="en-GB"/>
-        </w:rPr>
-      </w:pPr>
-      <w:r>
-        <w:rPr>
-          <w:i/>
-          <w:color w:val="4AA55B"/>
-          <w:lang w:val="en-GB"/>
-        </w:rPr>
-        <w:t>Will the data produced in the project be useable by third parties, in particular after the end of the project?</w:t>
-      </w:r>
-    </w:p>
-    <w:p>
-      <w:r>
-        <w:lastRenderedPageBreak/>
-        <w:t>{{Answer</w:t>
-      </w:r>
-      <w:r>
-        <w:t>2</w:t>
-      </w:r>
-      <w:r>
-        <w:t>8</w:t>
-      </w:r>
-      <w:r>
-        <w:t>}}</w:t>
-      </w:r>
-    </w:p>
-    <w:p>
-      <w:pPr>
-        <w:pStyle w:val="Textkrper"/>
-        <w:kinsoku w:val="0"/>
-        <w:overflowPunct w:val="0"/>
-        <w:spacing w:after="240"/>
-        <w:ind w:right="-35"/>
-        <w:jc w:val="both"/>
-        <w:rPr>
-          <w:i/>
-          <w:color w:val="4AA55B"/>
-          <w:lang w:val="en-GB"/>
-        </w:rPr>
-      </w:pPr>
-      <w:r>
-        <w:rPr>
-          <w:i/>
-          <w:color w:val="4AA55B"/>
-          <w:lang w:val="en-GB"/>
-        </w:rPr>
-        <w:t>Will the provenance of the data be thoroughly documented using the appropriate standards?</w:t>
-      </w:r>
-    </w:p>
-    <w:p>
-      <w:r>
-        <w:t>{{Answer</w:t>
-      </w:r>
-      <w:r>
-        <w:t>2</w:t>
-      </w:r>
-      <w:r>
-        <w:t>9</w:t>
-      </w:r>
-      <w:r>
-        <w:t>}}</w:t>
-      </w:r>
-    </w:p>
-    <w:p>
-      <w:pPr>
-        <w:pStyle w:val="Textkrper"/>
-        <w:kinsoku w:val="0"/>
-        <w:overflowPunct w:val="0"/>
-        <w:spacing w:after="240"/>
-        <w:ind w:right="-35"/>
-        <w:jc w:val="both"/>
-        <w:rPr>
-          <w:i/>
-          <w:color w:val="4AA55B"/>
-          <w:lang w:val="en-GB"/>
-        </w:rPr>
-      </w:pPr>
-      <w:r>
-        <w:rPr>
-          <w:i/>
-          <w:color w:val="4AA55B"/>
-          <w:lang w:val="en-GB"/>
-        </w:rPr>
-        <w:t>Describe all relevant d</w:t>
-      </w:r>
-      <w:r>
-        <w:rPr>
-          <w:i/>
-          <w:color w:val="4AA55B"/>
-          <w:lang w:val="en-GB"/>
-        </w:rPr>
-        <w:t>ata quality assurance processes.</w:t>
-      </w:r>
-    </w:p>
-    <w:p>
-      <w:r>
-        <w:t>{{Answer</w:t>
-      </w:r>
-      <w:r>
-        <w:t>30</w:t>
-      </w:r>
-      <w:r>
-        <w:t>}}</w:t>
-      </w:r>
-    </w:p>
-    <w:p>
-      <w:pPr>
-        <w:pStyle w:val="Textkrper"/>
-        <w:kinsoku w:val="0"/>
-        <w:overflowPunct w:val="0"/>
-        <w:spacing w:after="240"/>
-        <w:ind w:right="-35"/>
-        <w:jc w:val="both"/>
-        <w:rPr>
-          <w:i/>
-          <w:color w:val="4AA55B"/>
-          <w:lang w:val="en-GB"/>
-        </w:rPr>
-      </w:pPr>
-      <w:r>
-        <w:rPr>
-          <w:i/>
-          <w:color w:val="4AA55B"/>
-          <w:lang w:val="en-GB"/>
-        </w:rPr>
-        <w:t>Further to the FAIR principles, DMPs should also address research outputs other than data, and should carefully consider aspects related to the allocation of resources, data security and ethical aspects.</w:t>
+        <w:t>nswer31a}}</w:t>
       </w:r>
     </w:p>
     <w:p>
@@ -2470,7 +2509,6 @@
           <w:u w:val="single"/>
         </w:rPr>
       </w:pPr>
-      <w:bookmarkStart w:id="7" w:name="_Toc69311945"/>
       <w:r>
         <w:rPr>
           <w:iCs/>
@@ -2483,7 +2521,7 @@
             <w14:round/>
           </w14:textOutline>
         </w:rPr>
-        <w:t>Allocation of resources</w:t>
+        <w:t>Security of other research outputs</w:t>
       </w:r>
     </w:p>
     <w:p>
@@ -2530,7 +2568,7 @@
             <w14:round/>
           </w14:textOutline>
         </w:rPr>
-        <w:t>nswer31a}}</w:t>
+        <w:t>nswer31b}}</w:t>
       </w:r>
     </w:p>
     <w:p>
@@ -2555,15 +2593,25 @@
             <w14:round/>
           </w14:textOutline>
         </w:rPr>
-        <w:t>Security of other research outputs</w:t>
-      </w:r>
-    </w:p>
-    <w:p>
-      <w:pPr>
-        <w:pStyle w:val="Textkrper"/>
-        <w:spacing w:after="240"/>
-        <w:ind w:right="-35"/>
-        <w:jc w:val="both"/>
+        <w:t>Ethical aspects</w:t>
+      </w:r>
+    </w:p>
+    <w:p>
+      <w:pPr>
+        <w:pStyle w:val="Textkrper"/>
+        <w:spacing w:after="240"/>
+        <w:ind w:right="-35"/>
+        <w:jc w:val="both"/>
+        <w:rPr>
+          <w:iCs/>
+          <w:color w:val="000000" w:themeColor="text1"/>
+          <w:lang w:val="en-GB"/>
+          <w14:textOutline w14:w="0" w14:cap="flat" w14:cmpd="sng" w14:algn="ctr">
+            <w14:noFill/>
+            <w14:prstDash w14:val="solid"/>
+            <w14:round/>
+          </w14:textOutline>
+        </w:rPr>
       </w:pPr>
       <w:r>
         <w:rPr>
@@ -2602,7 +2650,296 @@
             <w14:round/>
           </w14:textOutline>
         </w:rPr>
-        <w:t>nswer31b}}</w:t>
+        <w:t>nswer31c}}</w:t>
+      </w:r>
+    </w:p>
+    <w:p>
+      <w:pPr>
+        <w:pStyle w:val="berschrift2"/>
+      </w:pPr>
+      <w:r>
+        <w:t>Other research outputs</w:t>
+      </w:r>
+      <w:bookmarkEnd w:id="7"/>
+    </w:p>
+    <w:p>
+      <w:pPr>
+        <w:pStyle w:val="Textkrper"/>
+        <w:kinsoku w:val="0"/>
+        <w:overflowPunct w:val="0"/>
+        <w:spacing w:after="240"/>
+        <w:ind w:right="-35"/>
+        <w:jc w:val="both"/>
+        <w:rPr>
+          <w:i/>
+          <w:color w:val="4AA55B"/>
+          <w:lang w:val="en-GB"/>
+        </w:rPr>
+      </w:pPr>
+      <w:r>
+        <w:rPr>
+          <w:i/>
+          <w:color w:val="4AA55B"/>
+          <w:lang w:val="en-GB"/>
+        </w:rPr>
+        <w:t>In addition to the management of data, beneficiaries should also consider and plan for the management of other research outputs that may be generated or re-used throughout their projects. Such outputs can be either digital (e.g. software, workflows, protocols, models, etc.) or physical (e.g. new materials, antibodies, reagents, samples, etc.).</w:t>
+      </w:r>
+    </w:p>
+    <w:p>
+      <w:r>
+        <w:t>{{Answer</w:t>
+      </w:r>
+      <w:r>
+        <w:t>32</w:t>
+      </w:r>
+      <w:r>
+        <w:t>}}</w:t>
+      </w:r>
+    </w:p>
+    <w:p>
+      <w:pPr>
+        <w:pStyle w:val="Textkrper"/>
+        <w:kinsoku w:val="0"/>
+        <w:overflowPunct w:val="0"/>
+        <w:spacing w:after="240"/>
+        <w:ind w:right="-35"/>
+        <w:jc w:val="both"/>
+        <w:rPr>
+          <w:i/>
+          <w:color w:val="4AA55B"/>
+          <w:lang w:val="en-GB"/>
+        </w:rPr>
+      </w:pPr>
+      <w:r>
+        <w:rPr>
+          <w:i/>
+          <w:color w:val="4AA55B"/>
+          <w:lang w:val="en-GB"/>
+        </w:rPr>
+        <w:t>Beneficiaries should consider which of the questions pertaining to FAIR data above, can apply to the management of other research outputs, and should strive to provide sufficient detail on how their research outputs will be managed and shared, or made available for re-use, in line with the FAIR principles.</w:t>
+      </w:r>
+    </w:p>
+    <w:p>
+      <w:r>
+        <w:t>{{Answer</w:t>
+      </w:r>
+      <w:r>
+        <w:t>3</w:t>
+      </w:r>
+      <w:r>
+        <w:t>3</w:t>
+      </w:r>
+      <w:r>
+        <w:t>}}</w:t>
+      </w:r>
+    </w:p>
+    <w:p>
+      <w:pPr>
+        <w:pStyle w:val="berschrift2"/>
+      </w:pPr>
+      <w:bookmarkStart w:id="8" w:name="_Toc69311946"/>
+      <w:r>
+        <w:t>Allocation of</w:t>
+      </w:r>
+      <w:r>
+        <w:rPr>
+          <w:spacing w:val="-3"/>
+        </w:rPr>
+        <w:t xml:space="preserve"> </w:t>
+      </w:r>
+      <w:r>
+        <w:t>resources</w:t>
+      </w:r>
+      <w:bookmarkEnd w:id="8"/>
+    </w:p>
+    <w:p>
+      <w:pPr>
+        <w:pStyle w:val="Textkrper"/>
+        <w:kinsoku w:val="0"/>
+        <w:overflowPunct w:val="0"/>
+        <w:spacing w:after="240"/>
+        <w:ind w:right="-35"/>
+        <w:jc w:val="both"/>
+        <w:rPr>
+          <w:i/>
+          <w:color w:val="4AA55B"/>
+          <w:lang w:val="en-GB"/>
+        </w:rPr>
+      </w:pPr>
+      <w:r>
+        <w:rPr>
+          <w:i/>
+          <w:color w:val="4AA55B"/>
+          <w:lang w:val="en-GB"/>
+        </w:rPr>
+        <w:t>What will the costs be for making data or other research outputs FAIR in your project (e.g. direct and indirect costs related to storage, archiving, re-use, security, etc.) ?</w:t>
+      </w:r>
+    </w:p>
+    <w:p>
+      <w:r>
+        <w:t>{{Answer</w:t>
+      </w:r>
+      <w:r>
+        <w:t>3</w:t>
+      </w:r>
+      <w:r>
+        <w:t>4</w:t>
+      </w:r>
+      <w:r>
+        <w:t>}}</w:t>
+      </w:r>
+    </w:p>
+    <w:p>
+      <w:pPr>
+        <w:pStyle w:val="Textkrper"/>
+        <w:kinsoku w:val="0"/>
+        <w:overflowPunct w:val="0"/>
+        <w:spacing w:after="240"/>
+        <w:ind w:right="-35"/>
+        <w:jc w:val="both"/>
+        <w:rPr>
+          <w:i/>
+          <w:color w:val="4AA55B"/>
+          <w:lang w:val="en-GB"/>
+        </w:rPr>
+      </w:pPr>
+      <w:r>
+        <w:rPr>
+          <w:i/>
+          <w:color w:val="4AA55B"/>
+          <w:lang w:val="en-GB"/>
+        </w:rPr>
+        <w:t>How will these be covered? Note that costs related to research data/output management are eligible as part of the Horizon Europe grant (if compliant with the Grant Agreement conditions)</w:t>
+      </w:r>
+    </w:p>
+    <w:p>
+      <w:r>
+        <w:t>{{Answer</w:t>
+      </w:r>
+      <w:r>
+        <w:t>3</w:t>
+      </w:r>
+      <w:r>
+        <w:t>5</w:t>
+      </w:r>
+      <w:r>
+        <w:t>}}</w:t>
+      </w:r>
+    </w:p>
+    <w:p>
+      <w:pPr>
+        <w:pStyle w:val="Textkrper"/>
+        <w:kinsoku w:val="0"/>
+        <w:overflowPunct w:val="0"/>
+        <w:spacing w:after="240"/>
+        <w:ind w:right="-35"/>
+        <w:jc w:val="both"/>
+        <w:rPr>
+          <w:i/>
+          <w:color w:val="4AA55B"/>
+          <w:lang w:val="en-GB"/>
+        </w:rPr>
+      </w:pPr>
+      <w:r>
+        <w:rPr>
+          <w:i/>
+          <w:color w:val="4AA55B"/>
+          <w:lang w:val="en-GB"/>
+        </w:rPr>
+        <w:t>Who will be responsible for data management in your project?</w:t>
+      </w:r>
+    </w:p>
+    <w:p>
+      <w:r>
+        <w:t>{{Answer</w:t>
+      </w:r>
+      <w:r>
+        <w:t>3</w:t>
+      </w:r>
+      <w:r>
+        <w:t>6</w:t>
+      </w:r>
+      <w:r>
+        <w:t>}}</w:t>
+      </w:r>
+    </w:p>
+    <w:p>
+      <w:pPr>
+        <w:pStyle w:val="Textkrper"/>
+        <w:kinsoku w:val="0"/>
+        <w:overflowPunct w:val="0"/>
+        <w:spacing w:after="240"/>
+        <w:ind w:right="-35"/>
+        <w:jc w:val="both"/>
+        <w:rPr>
+          <w:i/>
+          <w:color w:val="4AA55B"/>
+          <w:lang w:val="en-GB"/>
+        </w:rPr>
+      </w:pPr>
+      <w:r>
+        <w:rPr>
+          <w:i/>
+          <w:color w:val="4AA55B"/>
+          <w:lang w:val="en-GB"/>
+        </w:rPr>
+        <w:t>How will long term preservation be ensured? Discuss the necessary resources to accomplish this (costs and potential value, who decides and how, what data will be kept and for how long)?</w:t>
+      </w:r>
+    </w:p>
+    <w:p>
+      <w:r>
+        <w:t>{{Answer</w:t>
+      </w:r>
+      <w:r>
+        <w:t>3</w:t>
+      </w:r>
+      <w:r>
+        <w:t>7</w:t>
+      </w:r>
+      <w:r>
+        <w:t>}}</w:t>
+      </w:r>
+    </w:p>
+    <w:p>
+      <w:pPr>
+        <w:pStyle w:val="berschrift2"/>
+      </w:pPr>
+      <w:bookmarkStart w:id="9" w:name="_Toc69311947"/>
+      <w:r>
+        <w:t>Data</w:t>
+      </w:r>
+      <w:r>
+        <w:rPr>
+          <w:spacing w:val="-3"/>
+        </w:rPr>
+        <w:t xml:space="preserve"> </w:t>
+      </w:r>
+      <w:r>
+        <w:t>security</w:t>
+      </w:r>
+      <w:bookmarkEnd w:id="9"/>
+    </w:p>
+    <w:p>
+      <w:pPr>
+        <w:pStyle w:val="Textkrper"/>
+        <w:kinsoku w:val="0"/>
+        <w:overflowPunct w:val="0"/>
+        <w:spacing w:after="240"/>
+        <w:ind w:right="-35"/>
+        <w:jc w:val="both"/>
+        <w:rPr>
+          <w:i/>
+          <w:color w:val="4AA55B"/>
+          <w:lang w:val="en-GB"/>
+        </w:rPr>
+      </w:pPr>
+      <w:r>
+        <w:rPr>
+          <w:i/>
+          <w:color w:val="4AA55B"/>
+          <w:lang w:val="en-GB"/>
+        </w:rPr>
+        <w:t>What provisions are or will be in place for data security (including data recovery as well as secure storage/archiving and transfer of sensitive data)?</w:t>
       </w:r>
     </w:p>
     <w:p>
@@ -2627,15 +2964,17 @@
             <w14:round/>
           </w14:textOutline>
         </w:rPr>
-        <w:t>Ethical aspects</w:t>
-      </w:r>
-    </w:p>
-    <w:p>
-      <w:pPr>
-        <w:pStyle w:val="Textkrper"/>
-        <w:spacing w:after="240"/>
-        <w:ind w:right="-35"/>
-        <w:jc w:val="both"/>
+        <w:t xml:space="preserve">Data recovery and secure storage </w:t>
+      </w:r>
+    </w:p>
+    <w:p>
+      <w:pPr>
+        <w:pStyle w:val="Textkrper"/>
+        <w:spacing w:after="240"/>
+        <w:ind w:right="-35"/>
+        <w:jc w:val="both"/>
+      </w:pPr>
+      <w:r>
         <w:rPr>
           <w:iCs/>
           <w:color w:val="000000" w:themeColor="text1"/>
@@ -2646,380 +2985,7 @@
             <w14:round/>
           </w14:textOutline>
         </w:rPr>
-      </w:pPr>
-      <w:r>
-        <w:rPr>
-          <w:iCs/>
-          <w:color w:val="000000" w:themeColor="text1"/>
-          <w:lang w:val="en-GB"/>
-          <w14:textOutline w14:w="0" w14:cap="flat" w14:cmpd="sng" w14:algn="ctr">
-            <w14:noFill/>
-            <w14:prstDash w14:val="solid"/>
-            <w14:round/>
-          </w14:textOutline>
-        </w:rPr>
-        <w:t>{{</w:t>
-      </w:r>
-      <w:r>
-        <w:rPr>
-          <w:iCs/>
-          <w:color w:val="000000" w:themeColor="text1"/>
-          <w:lang w:val="de-DE"/>
-          <w14:textOutline w14:w="0" w14:cap="flat" w14:cmpd="sng" w14:algn="ctr">
-            <w14:noFill/>
-            <w14:prstDash w14:val="solid"/>
-            <w14:round/>
-          </w14:textOutline>
-        </w:rPr>
-        <w:t>A</w:t>
-      </w:r>
-      <w:r>
-        <w:rPr>
-          <w:iCs/>
-          <w:color w:val="000000" w:themeColor="text1"/>
-          <w:lang w:val="en-GB"/>
-          <w14:textOutline w14:w="0" w14:cap="flat" w14:cmpd="sng" w14:algn="ctr">
-            <w14:noFill/>
-            <w14:prstDash w14:val="solid"/>
-            <w14:round/>
-          </w14:textOutline>
-        </w:rPr>
-        <w:t>nswer31c}}</w:t>
-      </w:r>
-    </w:p>
-    <w:p>
-      <w:pPr>
-        <w:pStyle w:val="berschrift2"/>
-      </w:pPr>
-      <w:r>
-        <w:t>Other research outputs</w:t>
-      </w:r>
-      <w:bookmarkEnd w:id="7"/>
-    </w:p>
-    <w:p>
-      <w:pPr>
-        <w:pStyle w:val="Textkrper"/>
-        <w:kinsoku w:val="0"/>
-        <w:overflowPunct w:val="0"/>
-        <w:spacing w:after="240"/>
-        <w:ind w:right="-35"/>
-        <w:jc w:val="both"/>
-        <w:rPr>
-          <w:i/>
-          <w:color w:val="4AA55B"/>
-          <w:lang w:val="en-GB"/>
-        </w:rPr>
-      </w:pPr>
-      <w:r>
-        <w:rPr>
-          <w:i/>
-          <w:color w:val="4AA55B"/>
-          <w:lang w:val="en-GB"/>
-        </w:rPr>
-        <w:t>In addition to the management of data, beneficiaries should also consider and plan for the management of other research outputs that may be generated or re-used throughout their projects. Such outputs can be either digital (e.g. software, workflows, protocols, models, etc.) or physical (e.g. new materials, antibodies, reagents, samples, etc.).</w:t>
-      </w:r>
-    </w:p>
-    <w:p>
-      <w:r>
-        <w:t>{{Answer</w:t>
-      </w:r>
-      <w:r>
-        <w:t>32</w:t>
-      </w:r>
-      <w:r>
-        <w:t>}}</w:t>
-      </w:r>
-    </w:p>
-    <w:p>
-      <w:pPr>
-        <w:pStyle w:val="Textkrper"/>
-        <w:kinsoku w:val="0"/>
-        <w:overflowPunct w:val="0"/>
-        <w:spacing w:after="240"/>
-        <w:ind w:right="-35"/>
-        <w:jc w:val="both"/>
-        <w:rPr>
-          <w:i/>
-          <w:color w:val="4AA55B"/>
-          <w:lang w:val="en-GB"/>
-        </w:rPr>
-      </w:pPr>
-      <w:r>
-        <w:rPr>
-          <w:i/>
-          <w:color w:val="4AA55B"/>
-          <w:lang w:val="en-GB"/>
-        </w:rPr>
-        <w:t>Beneficiaries should consider which of the questions pertaining to FAIR data above, can apply to the management of other research outputs, and should strive to provide sufficient detail on how their research outputs will be managed and shared, or made available for re-use, in line with the FAIR principles.</w:t>
-      </w:r>
-    </w:p>
-    <w:p>
-      <w:r>
-        <w:t>{{Answer</w:t>
-      </w:r>
-      <w:r>
-        <w:t>3</w:t>
-      </w:r>
-      <w:r>
-        <w:t>3</w:t>
-      </w:r>
-      <w:r>
-        <w:t>}}</w:t>
-      </w:r>
-    </w:p>
-    <w:p>
-      <w:pPr>
-        <w:pStyle w:val="berschrift2"/>
-      </w:pPr>
-      <w:bookmarkStart w:id="8" w:name="_Toc69311946"/>
-      <w:r>
-        <w:t>Allocation of</w:t>
-      </w:r>
-      <w:r>
-        <w:rPr>
-          <w:spacing w:val="-3"/>
-        </w:rPr>
-        <w:t xml:space="preserve"> </w:t>
-      </w:r>
-      <w:r>
-        <w:t>resources</w:t>
-      </w:r>
-      <w:bookmarkEnd w:id="8"/>
-    </w:p>
-    <w:p>
-      <w:pPr>
-        <w:pStyle w:val="Textkrper"/>
-        <w:kinsoku w:val="0"/>
-        <w:overflowPunct w:val="0"/>
-        <w:spacing w:after="240"/>
-        <w:ind w:right="-35"/>
-        <w:jc w:val="both"/>
-        <w:rPr>
-          <w:i/>
-          <w:color w:val="4AA55B"/>
-          <w:lang w:val="en-GB"/>
-        </w:rPr>
-      </w:pPr>
-      <w:r>
-        <w:rPr>
-          <w:i/>
-          <w:color w:val="4AA55B"/>
-          <w:lang w:val="en-GB"/>
-        </w:rPr>
-        <w:t>What will the costs be for making data or other research outputs FAIR in your project (e.g. direct and indirect costs related to storage, archiving, re-use, security, etc.) ?</w:t>
-      </w:r>
-    </w:p>
-    <w:p>
-      <w:r>
-        <w:t>{{Answer</w:t>
-      </w:r>
-      <w:r>
-        <w:t>3</w:t>
-      </w:r>
-      <w:r>
-        <w:t>4</w:t>
-      </w:r>
-      <w:r>
-        <w:t>}}</w:t>
-      </w:r>
-    </w:p>
-    <w:p>
-      <w:pPr>
-        <w:pStyle w:val="Textkrper"/>
-        <w:kinsoku w:val="0"/>
-        <w:overflowPunct w:val="0"/>
-        <w:spacing w:after="240"/>
-        <w:ind w:right="-35"/>
-        <w:jc w:val="both"/>
-        <w:rPr>
-          <w:i/>
-          <w:color w:val="4AA55B"/>
-          <w:lang w:val="en-GB"/>
-        </w:rPr>
-      </w:pPr>
-      <w:r>
-        <w:rPr>
-          <w:i/>
-          <w:color w:val="4AA55B"/>
-          <w:lang w:val="en-GB"/>
-        </w:rPr>
-        <w:t>How will these be covered? Note that costs related to research data/output management are eligible as part of the Horizon Europe grant (if compliant with the Grant Agreement conditions)</w:t>
-      </w:r>
-    </w:p>
-    <w:p>
-      <w:r>
-        <w:t>{{Answer</w:t>
-      </w:r>
-      <w:r>
-        <w:t>3</w:t>
-      </w:r>
-      <w:r>
-        <w:t>5</w:t>
-      </w:r>
-      <w:r>
-        <w:t>}}</w:t>
-      </w:r>
-    </w:p>
-    <w:p>
-      <w:pPr>
-        <w:pStyle w:val="Textkrper"/>
-        <w:kinsoku w:val="0"/>
-        <w:overflowPunct w:val="0"/>
-        <w:spacing w:after="240"/>
-        <w:ind w:right="-35"/>
-        <w:jc w:val="both"/>
-        <w:rPr>
-          <w:i/>
-          <w:color w:val="4AA55B"/>
-          <w:lang w:val="en-GB"/>
-        </w:rPr>
-      </w:pPr>
-      <w:r>
-        <w:rPr>
-          <w:i/>
-          <w:color w:val="4AA55B"/>
-          <w:lang w:val="en-GB"/>
-        </w:rPr>
-        <w:t>Who will be responsible for data management in your project?</w:t>
-      </w:r>
-    </w:p>
-    <w:p>
-      <w:r>
-        <w:t>{{Answer</w:t>
-      </w:r>
-      <w:r>
-        <w:t>3</w:t>
-      </w:r>
-      <w:r>
-        <w:t>6</w:t>
-      </w:r>
-      <w:r>
-        <w:t>}}</w:t>
-      </w:r>
-    </w:p>
-    <w:p>
-      <w:pPr>
-        <w:pStyle w:val="Textkrper"/>
-        <w:kinsoku w:val="0"/>
-        <w:overflowPunct w:val="0"/>
-        <w:spacing w:after="240"/>
-        <w:ind w:right="-35"/>
-        <w:jc w:val="both"/>
-        <w:rPr>
-          <w:i/>
-          <w:color w:val="4AA55B"/>
-          <w:lang w:val="en-GB"/>
-        </w:rPr>
-      </w:pPr>
-      <w:r>
-        <w:rPr>
-          <w:i/>
-          <w:color w:val="4AA55B"/>
-          <w:lang w:val="en-GB"/>
-        </w:rPr>
-        <w:t>How will long term preservation be ensured? Discuss the necessary resources to accomplish this (costs and potential value, who decides and how, what data will be kept and for how long)?</w:t>
-      </w:r>
-    </w:p>
-    <w:p>
-      <w:r>
-        <w:t>{{Answer</w:t>
-      </w:r>
-      <w:r>
-        <w:t>3</w:t>
-      </w:r>
-      <w:r>
-        <w:t>7</w:t>
-      </w:r>
-      <w:r>
-        <w:t>}}</w:t>
-      </w:r>
-    </w:p>
-    <w:p>
-      <w:pPr>
-        <w:pStyle w:val="berschrift2"/>
-      </w:pPr>
-      <w:bookmarkStart w:id="9" w:name="_Toc69311947"/>
-      <w:r>
-        <w:t>Data</w:t>
-      </w:r>
-      <w:r>
-        <w:rPr>
-          <w:spacing w:val="-3"/>
-        </w:rPr>
-        <w:t xml:space="preserve"> </w:t>
-      </w:r>
-      <w:r>
-        <w:t>security</w:t>
-      </w:r>
-      <w:bookmarkEnd w:id="9"/>
-    </w:p>
-    <w:p>
-      <w:pPr>
-        <w:pStyle w:val="Textkrper"/>
-        <w:kinsoku w:val="0"/>
-        <w:overflowPunct w:val="0"/>
-        <w:spacing w:after="240"/>
-        <w:ind w:right="-35"/>
-        <w:jc w:val="both"/>
-        <w:rPr>
-          <w:i/>
-          <w:color w:val="4AA55B"/>
-          <w:lang w:val="en-GB"/>
-        </w:rPr>
-      </w:pPr>
-      <w:r>
-        <w:rPr>
-          <w:i/>
-          <w:color w:val="4AA55B"/>
-          <w:lang w:val="en-GB"/>
-        </w:rPr>
-        <w:t>What provisions are or will be in place for data security (including data recovery as well as secure storage/archiving and transfer of sensitive data)?</w:t>
-      </w:r>
-    </w:p>
-    <w:p>
-      <w:pPr>
-        <w:pStyle w:val="Textkrper"/>
-        <w:spacing w:after="240"/>
-        <w:ind w:right="-35"/>
-        <w:jc w:val="both"/>
-        <w:rPr>
-          <w:u w:val="single"/>
-        </w:rPr>
-      </w:pPr>
-      <w:r>
-        <w:rPr>
-          <w:iCs/>
-          <w:color w:val="000000" w:themeColor="text1"/>
-          <w:u w:val="single"/>
-          <w:lang w:val="en-GB"/>
-          <w14:textOutline w14:w="0" w14:cap="flat" w14:cmpd="sng" w14:algn="ctr">
-            <w14:noFill/>
-            <w14:prstDash w14:val="solid"/>
-            <w14:round/>
-          </w14:textOutline>
-        </w:rPr>
         <w:lastRenderedPageBreak/>
-        <w:t xml:space="preserve">Data recovery and secure storage </w:t>
-      </w:r>
-    </w:p>
-    <w:p>
-      <w:pPr>
-        <w:pStyle w:val="Textkrper"/>
-        <w:spacing w:after="240"/>
-        <w:ind w:right="-35"/>
-        <w:jc w:val="both"/>
-      </w:pPr>
-      <w:r>
-        <w:rPr>
-          <w:iCs/>
-          <w:color w:val="000000" w:themeColor="text1"/>
-          <w:lang w:val="en-GB"/>
-          <w14:textOutline w14:w="0" w14:cap="flat" w14:cmpd="sng" w14:algn="ctr">
-            <w14:noFill/>
-            <w14:prstDash w14:val="solid"/>
-            <w14:round/>
-          </w14:textOutline>
-        </w:rPr>
         <w:t>{{</w:t>
       </w:r>
       <w:r>
@@ -4255,7 +4221,7 @@
         <v:path o:extrusionok="f" gradientshapeok="t" o:connecttype="rect"/>
         <o:lock v:ext="edit" aspectratio="t"/>
       </v:shapetype>
-      <v:shape id="_x0000_i1060" type="#_x0000_t75" style="width:13pt;height:13pt;visibility:visible;mso-wrap-style:square" o:bullet="t">
+      <v:shape id="_x0000_i1031" type="#_x0000_t75" style="width:12.75pt;height:12.75pt;visibility:visible;mso-wrap-style:square" o:bullet="t">
         <v:imagedata r:id="rId1" o:title=""/>
       </v:shape>
     </w:pict>
@@ -5593,36 +5559,6 @@
 </file>
 
 <file path=customXml/item1.xml><?xml version="1.0" encoding="utf-8"?>
-<?mso-contentType ?>
-<FormTemplates xmlns="http://schemas.microsoft.com/sharepoint/v3/contenttype/forms">
-  <Display>DocumentLibraryForm</Display>
-  <Edit>DocumentLibraryForm</Edit>
-  <New>DocumentLibraryForm</New>
-</FormTemplates>
-</file>
-
-<file path=customXml/item2.xml><?xml version="1.0" encoding="utf-8"?>
-<p:properties xmlns:p="http://schemas.microsoft.com/office/2006/metadata/properties" xmlns:xsi="http://www.w3.org/2001/XMLSchema-instance" xmlns:pc="http://schemas.microsoft.com/office/infopath/2007/PartnerControls">
-  <documentManagement>
-    <Order1 xmlns="084a5cd8-1559-4e94-ac72-b94fb9abc19e">41</Order1>
-    <DocComments xmlns="084a5cd8-1559-4e94-ac72-b94fb9abc19e">Deliverable to be available on Portal.</DocComments>
-    <DocPublversion xmlns="084a5cd8-1559-4e94-ac72-b94fb9abc19e" xsi:nil="true"/>
-    <DocInternalExternal xmlns="084a5cd8-1559-4e94-ac72-b94fb9abc19e">Internal &amp; external</DocInternalExternal>
-    <ProgrCategory xmlns="084a5cd8-1559-4e94-ac72-b94fb9abc19e">3. Customised reports &amp; forms</ProgrCategory>
-    <ProgrGroup xmlns="084a5cd8-1559-4e94-ac72-b94fb9abc19e">01 HORIZON and EURATOM</ProgrGroup>
-    <DocStatus xmlns="084a5cd8-1559-4e94-ac72-b94fb9abc19e">Ready</DocStatus>
-    <DocPublDestination xmlns="084a5cd8-1559-4e94-ac72-b94fb9abc19e" xsi:nil="true"/>
-    <DocPublProtocol xmlns="084a5cd8-1559-4e94-ac72-b94fb9abc19e">TPL2-5 Programme tpl - Reporting forms, etc</DocPublProtocol>
-    <DocOfficerComments xmlns="084a5cd8-1559-4e94-ac72-b94fb9abc19e" xsi:nil="true"/>
-    <DocPublDate xmlns="084a5cd8-1559-4e94-ac72-b94fb9abc19e" xsi:nil="true"/>
-    <ITcomments xmlns="084a5cd8-1559-4e94-ac72-b94fb9abc19e" xsi:nil="true"/>
-    <ITstatus xmlns="084a5cd8-1559-4e94-ac72-b94fb9abc19e" xsi:nil="true"/>
-    <s86b xmlns="58f75e61-ed07-41d3-a804-02f248e1fac3" xsi:nil="true"/>
-  </documentManagement>
-</p:properties>
-</file>
-
-<file path=customXml/item3.xml><?xml version="1.0" encoding="utf-8"?>
 <ct:contentTypeSchema xmlns:ct="http://schemas.microsoft.com/office/2006/metadata/contentType" xmlns:ma="http://schemas.microsoft.com/office/2006/metadata/properties/metaAttributes" ct:_="" ma:_="" ma:contentTypeName="EC Document" ma:contentTypeID="0x010100258AA79CEB83498886A3A086811232500015D68561EDF2314DA91E1210E4D82B5C" ma:contentTypeVersion="39" ma:contentTypeDescription="Create a new document in this library." ma:contentTypeScope="" ma:versionID="56462b34cf91810872ea278535c8525e">
   <xsd:schema xmlns:xsd="http://www.w3.org/2001/XMLSchema" xmlns:xs="http://www.w3.org/2001/XMLSchema" xmlns:p="http://schemas.microsoft.com/office/2006/metadata/properties" xmlns:ns2="084a5cd8-1559-4e94-ac72-b94fb9abc19e" xmlns:ns3="58f75e61-ed07-41d3-a804-02f248e1fac3" targetNamespace="http://schemas.microsoft.com/office/2006/metadata/properties" ma:root="true" ma:fieldsID="b43b5fa606abdfc14cc643bd86f7f459" ns2:_="" ns3:_="">
     <xsd:import namespace="084a5cd8-1559-4e94-ac72-b94fb9abc19e"/>
@@ -5972,10 +5908,51 @@
 </ct:contentTypeSchema>
 </file>
 
+<file path=customXml/item2.xml><?xml version="1.0" encoding="utf-8"?>
+<p:properties xmlns:p="http://schemas.microsoft.com/office/2006/metadata/properties" xmlns:xsi="http://www.w3.org/2001/XMLSchema-instance" xmlns:pc="http://schemas.microsoft.com/office/infopath/2007/PartnerControls">
+  <documentManagement>
+    <Order1 xmlns="084a5cd8-1559-4e94-ac72-b94fb9abc19e">41</Order1>
+    <DocComments xmlns="084a5cd8-1559-4e94-ac72-b94fb9abc19e">Deliverable to be available on Portal.</DocComments>
+    <DocPublversion xmlns="084a5cd8-1559-4e94-ac72-b94fb9abc19e" xsi:nil="true"/>
+    <DocInternalExternal xmlns="084a5cd8-1559-4e94-ac72-b94fb9abc19e">Internal &amp; external</DocInternalExternal>
+    <ProgrCategory xmlns="084a5cd8-1559-4e94-ac72-b94fb9abc19e">3. Customised reports &amp; forms</ProgrCategory>
+    <ProgrGroup xmlns="084a5cd8-1559-4e94-ac72-b94fb9abc19e">01 HORIZON and EURATOM</ProgrGroup>
+    <DocStatus xmlns="084a5cd8-1559-4e94-ac72-b94fb9abc19e">Ready</DocStatus>
+    <DocPublDestination xmlns="084a5cd8-1559-4e94-ac72-b94fb9abc19e" xsi:nil="true"/>
+    <DocPublProtocol xmlns="084a5cd8-1559-4e94-ac72-b94fb9abc19e">TPL2-5 Programme tpl - Reporting forms, etc</DocPublProtocol>
+    <DocOfficerComments xmlns="084a5cd8-1559-4e94-ac72-b94fb9abc19e" xsi:nil="true"/>
+    <DocPublDate xmlns="084a5cd8-1559-4e94-ac72-b94fb9abc19e" xsi:nil="true"/>
+    <ITcomments xmlns="084a5cd8-1559-4e94-ac72-b94fb9abc19e" xsi:nil="true"/>
+    <ITstatus xmlns="084a5cd8-1559-4e94-ac72-b94fb9abc19e" xsi:nil="true"/>
+    <s86b xmlns="58f75e61-ed07-41d3-a804-02f248e1fac3" xsi:nil="true"/>
+  </documentManagement>
+</p:properties>
+</file>
+
+<file path=customXml/item3.xml><?xml version="1.0" encoding="utf-8"?>
+<?mso-contentType ?>
+<FormTemplates xmlns="http://schemas.microsoft.com/sharepoint/v3/contenttype/forms">
+  <Display>DocumentLibraryForm</Display>
+  <Edit>DocumentLibraryForm</Edit>
+  <New>DocumentLibraryForm</New>
+</FormTemplates>
+</file>
+
 <file path=customXml/itemProps1.xml><?xml version="1.0" encoding="utf-8"?>
-<ds:datastoreItem xmlns:ds="http://schemas.openxmlformats.org/officeDocument/2006/customXml" ds:itemID="{E5ABEBC2-8F24-42D8-B0A5-1D2B76C15645}">
+<ds:datastoreItem xmlns:ds="http://schemas.openxmlformats.org/officeDocument/2006/customXml" ds:itemID="{4B1213AF-11B3-4386-96A6-1D4CE320A5B3}">
   <ds:schemaRefs>
-    <ds:schemaRef ds:uri="http://schemas.microsoft.com/sharepoint/v3/contenttype/forms"/>
+    <ds:schemaRef ds:uri="http://schemas.microsoft.com/office/2006/metadata/contentType"/>
+    <ds:schemaRef ds:uri="http://schemas.microsoft.com/office/2006/metadata/properties/metaAttributes"/>
+    <ds:schemaRef ds:uri="http://www.w3.org/2001/XMLSchema"/>
+    <ds:schemaRef ds:uri="http://schemas.microsoft.com/office/2006/metadata/properties"/>
+    <ds:schemaRef ds:uri="084a5cd8-1559-4e94-ac72-b94fb9abc19e"/>
+    <ds:schemaRef ds:uri="58f75e61-ed07-41d3-a804-02f248e1fac3"/>
+    <ds:schemaRef ds:uri="http://schemas.microsoft.com/office/2006/documentManagement/types"/>
+    <ds:schemaRef ds:uri="http://schemas.microsoft.com/office/infopath/2007/PartnerControls"/>
+    <ds:schemaRef ds:uri="http://schemas.openxmlformats.org/package/2006/metadata/core-properties"/>
+    <ds:schemaRef ds:uri="http://purl.org/dc/elements/1.1/"/>
+    <ds:schemaRef ds:uri="http://purl.org/dc/terms/"/>
+    <ds:schemaRef ds:uri="http://schemas.microsoft.com/internal/obd"/>
   </ds:schemaRefs>
 </ds:datastoreItem>
 </file>
@@ -5992,20 +5969,9 @@
 </file>
 
 <file path=customXml/itemProps3.xml><?xml version="1.0" encoding="utf-8"?>
-<ds:datastoreItem xmlns:ds="http://schemas.openxmlformats.org/officeDocument/2006/customXml" ds:itemID="{4B1213AF-11B3-4386-96A6-1D4CE320A5B3}">
+<ds:datastoreItem xmlns:ds="http://schemas.openxmlformats.org/officeDocument/2006/customXml" ds:itemID="{E5ABEBC2-8F24-42D8-B0A5-1D2B76C15645}">
   <ds:schemaRefs>
-    <ds:schemaRef ds:uri="http://schemas.microsoft.com/office/2006/metadata/contentType"/>
-    <ds:schemaRef ds:uri="http://schemas.microsoft.com/office/2006/metadata/properties/metaAttributes"/>
-    <ds:schemaRef ds:uri="http://www.w3.org/2001/XMLSchema"/>
-    <ds:schemaRef ds:uri="http://schemas.microsoft.com/office/2006/metadata/properties"/>
-    <ds:schemaRef ds:uri="084a5cd8-1559-4e94-ac72-b94fb9abc19e"/>
-    <ds:schemaRef ds:uri="58f75e61-ed07-41d3-a804-02f248e1fac3"/>
-    <ds:schemaRef ds:uri="http://schemas.microsoft.com/office/2006/documentManagement/types"/>
-    <ds:schemaRef ds:uri="http://schemas.microsoft.com/office/infopath/2007/PartnerControls"/>
-    <ds:schemaRef ds:uri="http://schemas.openxmlformats.org/package/2006/metadata/core-properties"/>
-    <ds:schemaRef ds:uri="http://purl.org/dc/elements/1.1/"/>
-    <ds:schemaRef ds:uri="http://purl.org/dc/terms/"/>
-    <ds:schemaRef ds:uri="http://schemas.microsoft.com/internal/obd"/>
+    <ds:schemaRef ds:uri="http://schemas.microsoft.com/sharepoint/v3/contenttype/forms"/>
   </ds:schemaRefs>
 </ds:datastoreItem>
 </file>
</xml_diff>

<commit_message>
refactors answers of type "single value per dataset"
</commit_message>
<xml_diff>
--- a/src/rdmo_docx_export/exports/templates/horizon-template.docx
+++ b/src/rdmo_docx_export/exports/templates/horizon-template.docx
@@ -1524,10 +1524,7 @@
         <w:t>{{Answer</w:t>
       </w:r>
       <w:r>
-        <w:t>13</w:t>
-      </w:r>
-      <w:r>
-        <w:t>a</w:t>
+        <w:t>13a</w:t>
       </w:r>
       <w:r>
         <w:t>}}</w:t>
@@ -2006,7 +2003,7 @@
           <w:color w:val="4AA55B"/>
           <w:lang w:val="en-GB"/>
         </w:rPr>
-        <w:t>How long will the data remain available and findable? Will metadata be guaranteed to remain available after data is no longer available?</w:t>
+        <w:t>How long will the data remain available and findable?</w:t>
       </w:r>
     </w:p>
     <w:p>
@@ -2014,10 +2011,10 @@
         <w:t>{{Answer</w:t>
       </w:r>
       <w:r>
-        <w:t>2</w:t>
-      </w:r>
-      <w:r>
-        <w:t>1</w:t>
+        <w:t>21</w:t>
+      </w:r>
+      <w:r>
+        <w:t>a</w:t>
       </w:r>
       <w:r>
         <w:t>}}</w:t>
@@ -2043,7 +2040,7 @@
           <w:color w:val="4AA55B"/>
           <w:lang w:val="en-GB"/>
         </w:rPr>
-        <w:t>Will documentation or reference about any software be needed to access or read the data be included? Will it be possible to include the relevant software (e.g. in open source code)?</w:t>
+        <w:t>Will metadata be guaranteed to remain available after data is no longer available?</w:t>
       </w:r>
     </w:p>
     <w:p>
@@ -2054,27 +2051,13 @@
         <w:t>2</w:t>
       </w:r>
       <w:r>
-        <w:t>2</w:t>
+        <w:t>1</w:t>
+      </w:r>
+      <w:r>
+        <w:t>b</w:t>
       </w:r>
       <w:r>
         <w:t>}}</w:t>
-      </w:r>
-    </w:p>
-    <w:p>
-      <w:pPr>
-        <w:pStyle w:val="berschrift3"/>
-      </w:pPr>
-      <w:r>
-        <w:t>Making data</w:t>
-      </w:r>
-      <w:r>
-        <w:rPr>
-          <w:spacing w:val="-4"/>
-        </w:rPr>
-        <w:t xml:space="preserve"> </w:t>
-      </w:r>
-      <w:r>
-        <w:t>interoperable</w:t>
       </w:r>
     </w:p>
     <w:p>
@@ -2097,7 +2080,7 @@
           <w:color w:val="4AA55B"/>
           <w:lang w:val="en-GB"/>
         </w:rPr>
-        <w:t xml:space="preserve">What data and metadata vocabularies, standards, formats or methodologies will you follow to make your data interoperable to allow data exchange and re-use within and across disciplines? Will you follow community-endorsed interoperability best practices? Which ones? </w:t>
+        <w:t>Will documentation or reference about any software be needed to access or read the data be included? Will it be possible to include the relevant software (e.g. in open source code)?</w:t>
       </w:r>
     </w:p>
     <w:p>
@@ -2108,10 +2091,27 @@
         <w:t>2</w:t>
       </w:r>
       <w:r>
-        <w:t>3</w:t>
+        <w:t>2</w:t>
       </w:r>
       <w:r>
         <w:t>}}</w:t>
+      </w:r>
+    </w:p>
+    <w:p>
+      <w:pPr>
+        <w:pStyle w:val="berschrift3"/>
+      </w:pPr>
+      <w:r>
+        <w:t>Making data</w:t>
+      </w:r>
+      <w:r>
+        <w:rPr>
+          <w:spacing w:val="-4"/>
+        </w:rPr>
+        <w:t xml:space="preserve"> </w:t>
+      </w:r>
+      <w:r>
+        <w:t>interoperable</w:t>
       </w:r>
     </w:p>
     <w:p>
@@ -2134,7 +2134,7 @@
           <w:color w:val="4AA55B"/>
           <w:lang w:val="en-GB"/>
         </w:rPr>
-        <w:t>In case it is unavoidable that you use uncommon or generate project specific ontologies or vocabularies, will you provide mappings to more commonly used ontologies? Will you openly publish the generated ontologies or vocabularies to allow reusing, refining or extending them?</w:t>
+        <w:t xml:space="preserve">What data and metadata vocabularies, standards, formats or methodologies will you follow to make your data interoperable to allow data exchange and re-use within and across disciplines? Will you follow community-endorsed interoperability best practices? Which ones? </w:t>
       </w:r>
     </w:p>
     <w:p>
@@ -2145,7 +2145,7 @@
         <w:t>2</w:t>
       </w:r>
       <w:r>
-        <w:t>4</w:t>
+        <w:t>3</w:t>
       </w:r>
       <w:r>
         <w:t>}}</w:t>
@@ -2171,23 +2171,7 @@
           <w:color w:val="4AA55B"/>
           <w:lang w:val="en-GB"/>
         </w:rPr>
-        <w:t>Will your data include qualified references</w:t>
-      </w:r>
-      <w:r>
-        <w:rPr>
-          <w:i/>
-          <w:color w:val="4AA55B"/>
-          <w:lang w:val="en-GB"/>
-        </w:rPr>
-        <w:footnoteReference w:id="2"/>
-      </w:r>
-      <w:r>
-        <w:rPr>
-          <w:i/>
-          <w:color w:val="4AA55B"/>
-          <w:lang w:val="en-GB"/>
-        </w:rPr>
-        <w:t xml:space="preserve"> to other data (e.g. other data from your project, or datasets from previous research)?</w:t>
+        <w:t>In case it is unavoidable that you use uncommon or generate project specific ontologies or vocabularies, will you provide mappings to more commonly used ontologies? Will you openly publish the generated ontologies or vocabularies to allow reusing, refining or extending them?</w:t>
       </w:r>
     </w:p>
     <w:p>
@@ -2198,18 +2182,10 @@
         <w:t>2</w:t>
       </w:r>
       <w:r>
-        <w:t>5</w:t>
+        <w:t>4</w:t>
       </w:r>
       <w:r>
         <w:t>}}</w:t>
-      </w:r>
-    </w:p>
-    <w:p>
-      <w:pPr>
-        <w:pStyle w:val="berschrift3"/>
-      </w:pPr>
-      <w:r>
-        <w:t>Increase data re-use</w:t>
       </w:r>
     </w:p>
     <w:p>
@@ -2232,7 +2208,23 @@
           <w:color w:val="4AA55B"/>
           <w:lang w:val="en-GB"/>
         </w:rPr>
-        <w:t>How will you provide documentation needed to validate data analysis and facilitate data re-use (e.g. readme files with information on methodology, codebooks, data cleaning, analyses, variable definitions, units of measurement, etc.)?</w:t>
+        <w:t>Will your data include qualified references</w:t>
+      </w:r>
+      <w:r>
+        <w:rPr>
+          <w:i/>
+          <w:color w:val="4AA55B"/>
+          <w:lang w:val="en-GB"/>
+        </w:rPr>
+        <w:footnoteReference w:id="2"/>
+      </w:r>
+      <w:r>
+        <w:rPr>
+          <w:i/>
+          <w:color w:val="4AA55B"/>
+          <w:lang w:val="en-GB"/>
+        </w:rPr>
+        <w:t xml:space="preserve"> to other data (e.g. other data from your project, or datasets from previous research)?</w:t>
       </w:r>
     </w:p>
     <w:p>
@@ -2243,10 +2235,18 @@
         <w:t>2</w:t>
       </w:r>
       <w:r>
-        <w:t>6</w:t>
+        <w:t>5</w:t>
       </w:r>
       <w:r>
         <w:t>}}</w:t>
+      </w:r>
+    </w:p>
+    <w:p>
+      <w:pPr>
+        <w:pStyle w:val="berschrift3"/>
+      </w:pPr>
+      <w:r>
+        <w:t>Increase data re-use</w:t>
       </w:r>
     </w:p>
     <w:p>
@@ -2269,7 +2269,7 @@
           <w:color w:val="4AA55B"/>
           <w:lang w:val="en-GB"/>
         </w:rPr>
-        <w:t>Will your data be made freely available in the public domain to permit the widest re-use possible? Will your data be licensed using standard reuse licenses, in line with the obligations set out in the Grant Agreement?</w:t>
+        <w:t>How will you provide documentation needed to validate data analysis and facilitate data re-use (e.g. readme files with information on methodology, codebooks, data cleaning, analyses, variable definitions, units of measurement, etc.)?</w:t>
       </w:r>
     </w:p>
     <w:p>
@@ -2280,7 +2280,7 @@
         <w:t>2</w:t>
       </w:r>
       <w:r>
-        <w:t>7</w:t>
+        <w:t>6</w:t>
       </w:r>
       <w:r>
         <w:t>}}</w:t>
@@ -2306,7 +2306,7 @@
           <w:color w:val="4AA55B"/>
           <w:lang w:val="en-GB"/>
         </w:rPr>
-        <w:t>Will the data produced in the project be useable by third parties, in particular after the end of the project?</w:t>
+        <w:t>Will your data be made freely available in the public domain to permit the widest re-use possible? Will your data be licensed using standard reuse licenses, in line with the obligations set out in the Grant Agreement?</w:t>
       </w:r>
     </w:p>
     <w:p>
@@ -2317,7 +2317,7 @@
         <w:t>2</w:t>
       </w:r>
       <w:r>
-        <w:t>8</w:t>
+        <w:t>7</w:t>
       </w:r>
       <w:r>
         <w:t>}}</w:t>
@@ -2343,7 +2343,44 @@
           <w:color w:val="4AA55B"/>
           <w:lang w:val="en-GB"/>
         </w:rPr>
+        <w:t>Will the data produced in the project be useable by third parties, in particular after the end of the project?</w:t>
+      </w:r>
+    </w:p>
+    <w:p>
+      <w:r>
         <w:lastRenderedPageBreak/>
+        <w:t>{{Answer</w:t>
+      </w:r>
+      <w:r>
+        <w:t>2</w:t>
+      </w:r>
+      <w:r>
+        <w:t>8</w:t>
+      </w:r>
+      <w:r>
+        <w:t>}}</w:t>
+      </w:r>
+    </w:p>
+    <w:p>
+      <w:pPr>
+        <w:pStyle w:val="Textkrper"/>
+        <w:kinsoku w:val="0"/>
+        <w:overflowPunct w:val="0"/>
+        <w:spacing w:after="240"/>
+        <w:ind w:right="-35"/>
+        <w:jc w:val="both"/>
+        <w:rPr>
+          <w:i/>
+          <w:color w:val="4AA55B"/>
+          <w:lang w:val="en-GB"/>
+        </w:rPr>
+      </w:pPr>
+      <w:r>
+        <w:rPr>
+          <w:i/>
+          <w:color w:val="4AA55B"/>
+          <w:lang w:val="en-GB"/>
+        </w:rPr>
         <w:t>Will the provenance of the data be thoroughly documented using the appropriate standards?</w:t>
       </w:r>
     </w:p>
@@ -2964,6 +3001,7 @@
             <w14:round/>
           </w14:textOutline>
         </w:rPr>
+        <w:lastRenderedPageBreak/>
         <w:t xml:space="preserve">Data recovery and secure storage </w:t>
       </w:r>
     </w:p>
@@ -2985,7 +3023,6 @@
             <w14:round/>
           </w14:textOutline>
         </w:rPr>
-        <w:lastRenderedPageBreak/>
         <w:t>{{</w:t>
       </w:r>
       <w:r>
@@ -5559,6 +5596,36 @@
 </file>
 
 <file path=customXml/item1.xml><?xml version="1.0" encoding="utf-8"?>
+<?mso-contentType ?>
+<FormTemplates xmlns="http://schemas.microsoft.com/sharepoint/v3/contenttype/forms">
+  <Display>DocumentLibraryForm</Display>
+  <Edit>DocumentLibraryForm</Edit>
+  <New>DocumentLibraryForm</New>
+</FormTemplates>
+</file>
+
+<file path=customXml/item2.xml><?xml version="1.0" encoding="utf-8"?>
+<p:properties xmlns:p="http://schemas.microsoft.com/office/2006/metadata/properties" xmlns:xsi="http://www.w3.org/2001/XMLSchema-instance" xmlns:pc="http://schemas.microsoft.com/office/infopath/2007/PartnerControls">
+  <documentManagement>
+    <Order1 xmlns="084a5cd8-1559-4e94-ac72-b94fb9abc19e">41</Order1>
+    <DocComments xmlns="084a5cd8-1559-4e94-ac72-b94fb9abc19e">Deliverable to be available on Portal.</DocComments>
+    <DocPublversion xmlns="084a5cd8-1559-4e94-ac72-b94fb9abc19e" xsi:nil="true"/>
+    <DocInternalExternal xmlns="084a5cd8-1559-4e94-ac72-b94fb9abc19e">Internal &amp; external</DocInternalExternal>
+    <ProgrCategory xmlns="084a5cd8-1559-4e94-ac72-b94fb9abc19e">3. Customised reports &amp; forms</ProgrCategory>
+    <ProgrGroup xmlns="084a5cd8-1559-4e94-ac72-b94fb9abc19e">01 HORIZON and EURATOM</ProgrGroup>
+    <DocStatus xmlns="084a5cd8-1559-4e94-ac72-b94fb9abc19e">Ready</DocStatus>
+    <DocPublDestination xmlns="084a5cd8-1559-4e94-ac72-b94fb9abc19e" xsi:nil="true"/>
+    <DocPublProtocol xmlns="084a5cd8-1559-4e94-ac72-b94fb9abc19e">TPL2-5 Programme tpl - Reporting forms, etc</DocPublProtocol>
+    <DocOfficerComments xmlns="084a5cd8-1559-4e94-ac72-b94fb9abc19e" xsi:nil="true"/>
+    <DocPublDate xmlns="084a5cd8-1559-4e94-ac72-b94fb9abc19e" xsi:nil="true"/>
+    <ITcomments xmlns="084a5cd8-1559-4e94-ac72-b94fb9abc19e" xsi:nil="true"/>
+    <ITstatus xmlns="084a5cd8-1559-4e94-ac72-b94fb9abc19e" xsi:nil="true"/>
+    <s86b xmlns="58f75e61-ed07-41d3-a804-02f248e1fac3" xsi:nil="true"/>
+  </documentManagement>
+</p:properties>
+</file>
+
+<file path=customXml/item3.xml><?xml version="1.0" encoding="utf-8"?>
 <ct:contentTypeSchema xmlns:ct="http://schemas.microsoft.com/office/2006/metadata/contentType" xmlns:ma="http://schemas.microsoft.com/office/2006/metadata/properties/metaAttributes" ct:_="" ma:_="" ma:contentTypeName="EC Document" ma:contentTypeID="0x010100258AA79CEB83498886A3A086811232500015D68561EDF2314DA91E1210E4D82B5C" ma:contentTypeVersion="39" ma:contentTypeDescription="Create a new document in this library." ma:contentTypeScope="" ma:versionID="56462b34cf91810872ea278535c8525e">
   <xsd:schema xmlns:xsd="http://www.w3.org/2001/XMLSchema" xmlns:xs="http://www.w3.org/2001/XMLSchema" xmlns:p="http://schemas.microsoft.com/office/2006/metadata/properties" xmlns:ns2="084a5cd8-1559-4e94-ac72-b94fb9abc19e" xmlns:ns3="58f75e61-ed07-41d3-a804-02f248e1fac3" targetNamespace="http://schemas.microsoft.com/office/2006/metadata/properties" ma:root="true" ma:fieldsID="b43b5fa606abdfc14cc643bd86f7f459" ns2:_="" ns3:_="">
     <xsd:import namespace="084a5cd8-1559-4e94-ac72-b94fb9abc19e"/>
@@ -5908,37 +5975,26 @@
 </ct:contentTypeSchema>
 </file>
 
-<file path=customXml/item2.xml><?xml version="1.0" encoding="utf-8"?>
-<p:properties xmlns:p="http://schemas.microsoft.com/office/2006/metadata/properties" xmlns:xsi="http://www.w3.org/2001/XMLSchema-instance" xmlns:pc="http://schemas.microsoft.com/office/infopath/2007/PartnerControls">
-  <documentManagement>
-    <Order1 xmlns="084a5cd8-1559-4e94-ac72-b94fb9abc19e">41</Order1>
-    <DocComments xmlns="084a5cd8-1559-4e94-ac72-b94fb9abc19e">Deliverable to be available on Portal.</DocComments>
-    <DocPublversion xmlns="084a5cd8-1559-4e94-ac72-b94fb9abc19e" xsi:nil="true"/>
-    <DocInternalExternal xmlns="084a5cd8-1559-4e94-ac72-b94fb9abc19e">Internal &amp; external</DocInternalExternal>
-    <ProgrCategory xmlns="084a5cd8-1559-4e94-ac72-b94fb9abc19e">3. Customised reports &amp; forms</ProgrCategory>
-    <ProgrGroup xmlns="084a5cd8-1559-4e94-ac72-b94fb9abc19e">01 HORIZON and EURATOM</ProgrGroup>
-    <DocStatus xmlns="084a5cd8-1559-4e94-ac72-b94fb9abc19e">Ready</DocStatus>
-    <DocPublDestination xmlns="084a5cd8-1559-4e94-ac72-b94fb9abc19e" xsi:nil="true"/>
-    <DocPublProtocol xmlns="084a5cd8-1559-4e94-ac72-b94fb9abc19e">TPL2-5 Programme tpl - Reporting forms, etc</DocPublProtocol>
-    <DocOfficerComments xmlns="084a5cd8-1559-4e94-ac72-b94fb9abc19e" xsi:nil="true"/>
-    <DocPublDate xmlns="084a5cd8-1559-4e94-ac72-b94fb9abc19e" xsi:nil="true"/>
-    <ITcomments xmlns="084a5cd8-1559-4e94-ac72-b94fb9abc19e" xsi:nil="true"/>
-    <ITstatus xmlns="084a5cd8-1559-4e94-ac72-b94fb9abc19e" xsi:nil="true"/>
-    <s86b xmlns="58f75e61-ed07-41d3-a804-02f248e1fac3" xsi:nil="true"/>
-  </documentManagement>
-</p:properties>
+<file path=customXml/itemProps1.xml><?xml version="1.0" encoding="utf-8"?>
+<ds:datastoreItem xmlns:ds="http://schemas.openxmlformats.org/officeDocument/2006/customXml" ds:itemID="{E5ABEBC2-8F24-42D8-B0A5-1D2B76C15645}">
+  <ds:schemaRefs>
+    <ds:schemaRef ds:uri="http://schemas.microsoft.com/sharepoint/v3/contenttype/forms"/>
+  </ds:schemaRefs>
+</ds:datastoreItem>
 </file>
 
-<file path=customXml/item3.xml><?xml version="1.0" encoding="utf-8"?>
-<?mso-contentType ?>
-<FormTemplates xmlns="http://schemas.microsoft.com/sharepoint/v3/contenttype/forms">
-  <Display>DocumentLibraryForm</Display>
-  <Edit>DocumentLibraryForm</Edit>
-  <New>DocumentLibraryForm</New>
-</FormTemplates>
+<file path=customXml/itemProps2.xml><?xml version="1.0" encoding="utf-8"?>
+<ds:datastoreItem xmlns:ds="http://schemas.openxmlformats.org/officeDocument/2006/customXml" ds:itemID="{FA90FD41-FA76-42DA-A088-7C01AECDABAA}">
+  <ds:schemaRefs>
+    <ds:schemaRef ds:uri="http://schemas.microsoft.com/office/2006/metadata/properties"/>
+    <ds:schemaRef ds:uri="http://schemas.microsoft.com/office/infopath/2007/PartnerControls"/>
+    <ds:schemaRef ds:uri="084a5cd8-1559-4e94-ac72-b94fb9abc19e"/>
+    <ds:schemaRef ds:uri="58f75e61-ed07-41d3-a804-02f248e1fac3"/>
+  </ds:schemaRefs>
+</ds:datastoreItem>
 </file>
 
-<file path=customXml/itemProps1.xml><?xml version="1.0" encoding="utf-8"?>
+<file path=customXml/itemProps3.xml><?xml version="1.0" encoding="utf-8"?>
 <ds:datastoreItem xmlns:ds="http://schemas.openxmlformats.org/officeDocument/2006/customXml" ds:itemID="{4B1213AF-11B3-4386-96A6-1D4CE320A5B3}">
   <ds:schemaRefs>
     <ds:schemaRef ds:uri="http://schemas.microsoft.com/office/2006/metadata/contentType"/>
@@ -5955,23 +6011,4 @@
     <ds:schemaRef ds:uri="http://schemas.microsoft.com/internal/obd"/>
   </ds:schemaRefs>
 </ds:datastoreItem>
-</file>
-
-<file path=customXml/itemProps2.xml><?xml version="1.0" encoding="utf-8"?>
-<ds:datastoreItem xmlns:ds="http://schemas.openxmlformats.org/officeDocument/2006/customXml" ds:itemID="{FA90FD41-FA76-42DA-A088-7C01AECDABAA}">
-  <ds:schemaRefs>
-    <ds:schemaRef ds:uri="http://schemas.microsoft.com/office/2006/metadata/properties"/>
-    <ds:schemaRef ds:uri="http://schemas.microsoft.com/office/infopath/2007/PartnerControls"/>
-    <ds:schemaRef ds:uri="084a5cd8-1559-4e94-ac72-b94fb9abc19e"/>
-    <ds:schemaRef ds:uri="58f75e61-ed07-41d3-a804-02f248e1fac3"/>
-  </ds:schemaRefs>
-</ds:datastoreItem>
-</file>
-
-<file path=customXml/itemProps3.xml><?xml version="1.0" encoding="utf-8"?>
-<ds:datastoreItem xmlns:ds="http://schemas.openxmlformats.org/officeDocument/2006/customXml" ds:itemID="{E5ABEBC2-8F24-42D8-B0A5-1D2B76C15645}">
-  <ds:schemaRefs>
-    <ds:schemaRef ds:uri="http://schemas.microsoft.com/sharepoint/v3/contenttype/forms"/>
-  </ds:schemaRefs>
-</ds:datastoreItem>
 </file>
</xml_diff>

<commit_message>
adds answers 24 26 27b
</commit_message>
<xml_diff>
--- a/src/rdmo_docx_export/exports/templates/horizon-template.docx
+++ b/src/rdmo_docx_export/exports/templates/horizon-template.docx
@@ -1969,7 +1969,7 @@
           <w:color w:val="4AA55B"/>
           <w:lang w:val="en-GB"/>
         </w:rPr>
-        <w:t>Will metadata be made openly available and licenced under a public domain dedication CC0, as per the Grant Agreement? If not, please clarify why. Will metadata contain information to enable the user to access the data?</w:t>
+        <w:t>Will metadata be made openly available and licenced under a public domain dedication CC0, as per the Grant Agreement? If not, please clarify why.</w:t>
       </w:r>
     </w:p>
     <w:p>
@@ -1977,7 +1977,7 @@
         <w:t>{{Answer</w:t>
       </w:r>
       <w:r>
-        <w:t>20</w:t>
+        <w:t>20a</w:t>
       </w:r>
       <w:r>
         <w:t>}}</w:t>
@@ -2003,7 +2003,7 @@
           <w:color w:val="4AA55B"/>
           <w:lang w:val="en-GB"/>
         </w:rPr>
-        <w:t>How long will the data remain available and findable?</w:t>
+        <w:t>Will metadata contain information to enable the user to access the data?</w:t>
       </w:r>
     </w:p>
     <w:p>
@@ -2011,10 +2011,10 @@
         <w:t>{{Answer</w:t>
       </w:r>
       <w:r>
-        <w:t>21</w:t>
-      </w:r>
-      <w:r>
-        <w:t>a</w:t>
+        <w:t>20</w:t>
+      </w:r>
+      <w:r>
+        <w:t>b</w:t>
       </w:r>
       <w:r>
         <w:t>}}</w:t>
@@ -2040,7 +2040,7 @@
           <w:color w:val="4AA55B"/>
           <w:lang w:val="en-GB"/>
         </w:rPr>
-        <w:t>Will metadata be guaranteed to remain available after data is no longer available?</w:t>
+        <w:t>How long will the data remain available and findable?</w:t>
       </w:r>
     </w:p>
     <w:p>
@@ -2048,13 +2048,7 @@
         <w:t>{{Answer</w:t>
       </w:r>
       <w:r>
-        <w:t>2</w:t>
-      </w:r>
-      <w:r>
-        <w:t>1</w:t>
-      </w:r>
-      <w:r>
-        <w:t>b</w:t>
+        <w:t>21a</w:t>
       </w:r>
       <w:r>
         <w:t>}}</w:t>
@@ -2080,7 +2074,7 @@
           <w:color w:val="4AA55B"/>
           <w:lang w:val="en-GB"/>
         </w:rPr>
-        <w:t>Will documentation or reference about any software be needed to access or read the data be included? Will it be possible to include the relevant software (e.g. in open source code)?</w:t>
+        <w:t>Will metadata be guaranteed to remain available after data is no longer available?</w:t>
       </w:r>
     </w:p>
     <w:p>
@@ -2091,27 +2085,13 @@
         <w:t>2</w:t>
       </w:r>
       <w:r>
-        <w:t>2</w:t>
+        <w:t>1</w:t>
+      </w:r>
+      <w:r>
+        <w:t>b</w:t>
       </w:r>
       <w:r>
         <w:t>}}</w:t>
-      </w:r>
-    </w:p>
-    <w:p>
-      <w:pPr>
-        <w:pStyle w:val="berschrift3"/>
-      </w:pPr>
-      <w:r>
-        <w:t>Making data</w:t>
-      </w:r>
-      <w:r>
-        <w:rPr>
-          <w:spacing w:val="-4"/>
-        </w:rPr>
-        <w:t xml:space="preserve"> </w:t>
-      </w:r>
-      <w:r>
-        <w:t>interoperable</w:t>
       </w:r>
     </w:p>
     <w:p>
@@ -2134,7 +2114,7 @@
           <w:color w:val="4AA55B"/>
           <w:lang w:val="en-GB"/>
         </w:rPr>
-        <w:t xml:space="preserve">What data and metadata vocabularies, standards, formats or methodologies will you follow to make your data interoperable to allow data exchange and re-use within and across disciplines? Will you follow community-endorsed interoperability best practices? Which ones? </w:t>
+        <w:t>Will documentation or reference about any software be needed to access or read the data be included? Will it be possible to include the relevant software (e.g. in open source code)?</w:t>
       </w:r>
     </w:p>
     <w:p>
@@ -2145,10 +2125,32 @@
         <w:t>2</w:t>
       </w:r>
       <w:r>
-        <w:t>3</w:t>
+        <w:t>2</w:t>
       </w:r>
       <w:r>
         <w:t>}}</w:t>
+      </w:r>
+    </w:p>
+    <w:p>
+      <w:r>
+        <w:t>See the following question for further details.</w:t>
+      </w:r>
+    </w:p>
+    <w:p>
+      <w:pPr>
+        <w:pStyle w:val="berschrift3"/>
+      </w:pPr>
+      <w:r>
+        <w:t>Making data</w:t>
+      </w:r>
+      <w:r>
+        <w:rPr>
+          <w:spacing w:val="-4"/>
+        </w:rPr>
+        <w:t xml:space="preserve"> </w:t>
+      </w:r>
+      <w:r>
+        <w:t>interoperable</w:t>
       </w:r>
     </w:p>
     <w:p>
@@ -2171,7 +2173,7 @@
           <w:color w:val="4AA55B"/>
           <w:lang w:val="en-GB"/>
         </w:rPr>
-        <w:t>In case it is unavoidable that you use uncommon or generate project specific ontologies or vocabularies, will you provide mappings to more commonly used ontologies? Will you openly publish the generated ontologies or vocabularies to allow reusing, refining or extending them?</w:t>
+        <w:t>What data and metadata vocabularies, standards, formats or methodologies will you follow to make your data interoperable to allow data exchange and re-use within and across disciplines?</w:t>
       </w:r>
     </w:p>
     <w:p>
@@ -2179,10 +2181,10 @@
         <w:t>{{Answer</w:t>
       </w:r>
       <w:r>
-        <w:t>2</w:t>
-      </w:r>
-      <w:r>
-        <w:t>4</w:t>
+        <w:t>23</w:t>
+      </w:r>
+      <w:r>
+        <w:t>a</w:t>
       </w:r>
       <w:r>
         <w:t>}}</w:t>
@@ -2208,23 +2210,7 @@
           <w:color w:val="4AA55B"/>
           <w:lang w:val="en-GB"/>
         </w:rPr>
-        <w:t>Will your data include qualified references</w:t>
-      </w:r>
-      <w:r>
-        <w:rPr>
-          <w:i/>
-          <w:color w:val="4AA55B"/>
-          <w:lang w:val="en-GB"/>
-        </w:rPr>
-        <w:footnoteReference w:id="2"/>
-      </w:r>
-      <w:r>
-        <w:rPr>
-          <w:i/>
-          <w:color w:val="4AA55B"/>
-          <w:lang w:val="en-GB"/>
-        </w:rPr>
-        <w:t xml:space="preserve"> to other data (e.g. other data from your project, or datasets from previous research)?</w:t>
+        <w:t xml:space="preserve">Will you follow community-endorsed interoperability best practices? Which ones? </w:t>
       </w:r>
     </w:p>
     <w:p>
@@ -2235,18 +2221,13 @@
         <w:t>2</w:t>
       </w:r>
       <w:r>
-        <w:t>5</w:t>
+        <w:t>3</w:t>
+      </w:r>
+      <w:r>
+        <w:t>b</w:t>
       </w:r>
       <w:r>
         <w:t>}}</w:t>
-      </w:r>
-    </w:p>
-    <w:p>
-      <w:pPr>
-        <w:pStyle w:val="berschrift3"/>
-      </w:pPr>
-      <w:r>
-        <w:t>Increase data re-use</w:t>
       </w:r>
     </w:p>
     <w:p>
@@ -2269,7 +2250,7 @@
           <w:color w:val="4AA55B"/>
           <w:lang w:val="en-GB"/>
         </w:rPr>
-        <w:t>How will you provide documentation needed to validate data analysis and facilitate data re-use (e.g. readme files with information on methodology, codebooks, data cleaning, analyses, variable definitions, units of measurement, etc.)?</w:t>
+        <w:t>In case it is unavoidable that you use uncommon or generate project specific ontologies or vocabularies, will you provide mappings to more commonly used ontologies? Will you openly publish the generated ontologies or vocabularies to allow reusing, refining or extending them?</w:t>
       </w:r>
     </w:p>
     <w:p>
@@ -2280,7 +2261,7 @@
         <w:t>2</w:t>
       </w:r>
       <w:r>
-        <w:t>6</w:t>
+        <w:t>4</w:t>
       </w:r>
       <w:r>
         <w:t>}}</w:t>
@@ -2306,7 +2287,23 @@
           <w:color w:val="4AA55B"/>
           <w:lang w:val="en-GB"/>
         </w:rPr>
-        <w:t>Will your data be made freely available in the public domain to permit the widest re-use possible? Will your data be licensed using standard reuse licenses, in line with the obligations set out in the Grant Agreement?</w:t>
+        <w:t>Will your data include qualified references</w:t>
+      </w:r>
+      <w:r>
+        <w:rPr>
+          <w:i/>
+          <w:color w:val="4AA55B"/>
+          <w:lang w:val="en-GB"/>
+        </w:rPr>
+        <w:footnoteReference w:id="2"/>
+      </w:r>
+      <w:r>
+        <w:rPr>
+          <w:i/>
+          <w:color w:val="4AA55B"/>
+          <w:lang w:val="en-GB"/>
+        </w:rPr>
+        <w:t xml:space="preserve"> to other data (e.g. other data from your project, or datasets from previous research)?</w:t>
       </w:r>
     </w:p>
     <w:p>
@@ -2317,10 +2314,18 @@
         <w:t>2</w:t>
       </w:r>
       <w:r>
-        <w:t>7</w:t>
+        <w:t>5</w:t>
       </w:r>
       <w:r>
         <w:t>}}</w:t>
+      </w:r>
+    </w:p>
+    <w:p>
+      <w:pPr>
+        <w:pStyle w:val="berschrift3"/>
+      </w:pPr>
+      <w:r>
+        <w:t>Increase data re-use</w:t>
       </w:r>
     </w:p>
     <w:p>
@@ -2343,12 +2348,86 @@
           <w:color w:val="4AA55B"/>
           <w:lang w:val="en-GB"/>
         </w:rPr>
+        <w:t>How will you provide documentation needed to validate data analysis and facilitate data re-use (e.g. readme files with information on methodology, codebooks, data cleaning, analyses, variable definitions, units of measurement, etc.)?</w:t>
+      </w:r>
+    </w:p>
+    <w:p>
+      <w:r>
+        <w:lastRenderedPageBreak/>
+        <w:t>{{Answer</w:t>
+      </w:r>
+      <w:r>
+        <w:t>2</w:t>
+      </w:r>
+      <w:r>
+        <w:t>6</w:t>
+      </w:r>
+      <w:r>
+        <w:t>}}</w:t>
+      </w:r>
+    </w:p>
+    <w:p>
+      <w:pPr>
+        <w:pStyle w:val="Textkrper"/>
+        <w:kinsoku w:val="0"/>
+        <w:overflowPunct w:val="0"/>
+        <w:spacing w:after="240"/>
+        <w:ind w:right="-35"/>
+        <w:jc w:val="both"/>
+        <w:rPr>
+          <w:i/>
+          <w:color w:val="4AA55B"/>
+          <w:lang w:val="en-GB"/>
+        </w:rPr>
+      </w:pPr>
+      <w:r>
+        <w:rPr>
+          <w:i/>
+          <w:color w:val="4AA55B"/>
+          <w:lang w:val="en-GB"/>
+        </w:rPr>
+        <w:t>Will your data be made freely available in the public domain to permit the widest re-use possible? Will your data be licensed using standard reuse licenses, in line with the obligations set out in the Grant Agreement?</w:t>
+      </w:r>
+    </w:p>
+    <w:p>
+      <w:r>
+        <w:t>{{Answer</w:t>
+      </w:r>
+      <w:r>
+        <w:t>2</w:t>
+      </w:r>
+      <w:r>
+        <w:t>7</w:t>
+      </w:r>
+      <w:r>
+        <w:t>}}</w:t>
+      </w:r>
+    </w:p>
+    <w:p>
+      <w:pPr>
+        <w:pStyle w:val="Textkrper"/>
+        <w:kinsoku w:val="0"/>
+        <w:overflowPunct w:val="0"/>
+        <w:spacing w:after="240"/>
+        <w:ind w:right="-35"/>
+        <w:jc w:val="both"/>
+        <w:rPr>
+          <w:i/>
+          <w:color w:val="4AA55B"/>
+          <w:lang w:val="en-GB"/>
+        </w:rPr>
+      </w:pPr>
+      <w:r>
+        <w:rPr>
+          <w:i/>
+          <w:color w:val="4AA55B"/>
+          <w:lang w:val="en-GB"/>
+        </w:rPr>
         <w:t>Will the data produced in the project be useable by third parties, in particular after the end of the project?</w:t>
       </w:r>
     </w:p>
     <w:p>
       <w:r>
-        <w:lastRenderedPageBreak/>
         <w:t>{{Answer</w:t>
       </w:r>
       <w:r>
@@ -2920,6 +2999,7 @@
           <w:color w:val="4AA55B"/>
           <w:lang w:val="en-GB"/>
         </w:rPr>
+        <w:lastRenderedPageBreak/>
         <w:t>How will long term preservation be ensured? Discuss the necessary resources to accomplish this (costs and potential value, who decides and how, what data will be kept and for how long)?</w:t>
       </w:r>
     </w:p>
@@ -3001,7 +3081,6 @@
             <w14:round/>
           </w14:textOutline>
         </w:rPr>
-        <w:lastRenderedPageBreak/>
         <w:t xml:space="preserve">Data recovery and secure storage </w:t>
       </w:r>
     </w:p>
@@ -5596,36 +5675,6 @@
 </file>
 
 <file path=customXml/item1.xml><?xml version="1.0" encoding="utf-8"?>
-<?mso-contentType ?>
-<FormTemplates xmlns="http://schemas.microsoft.com/sharepoint/v3/contenttype/forms">
-  <Display>DocumentLibraryForm</Display>
-  <Edit>DocumentLibraryForm</Edit>
-  <New>DocumentLibraryForm</New>
-</FormTemplates>
-</file>
-
-<file path=customXml/item2.xml><?xml version="1.0" encoding="utf-8"?>
-<p:properties xmlns:p="http://schemas.microsoft.com/office/2006/metadata/properties" xmlns:xsi="http://www.w3.org/2001/XMLSchema-instance" xmlns:pc="http://schemas.microsoft.com/office/infopath/2007/PartnerControls">
-  <documentManagement>
-    <Order1 xmlns="084a5cd8-1559-4e94-ac72-b94fb9abc19e">41</Order1>
-    <DocComments xmlns="084a5cd8-1559-4e94-ac72-b94fb9abc19e">Deliverable to be available on Portal.</DocComments>
-    <DocPublversion xmlns="084a5cd8-1559-4e94-ac72-b94fb9abc19e" xsi:nil="true"/>
-    <DocInternalExternal xmlns="084a5cd8-1559-4e94-ac72-b94fb9abc19e">Internal &amp; external</DocInternalExternal>
-    <ProgrCategory xmlns="084a5cd8-1559-4e94-ac72-b94fb9abc19e">3. Customised reports &amp; forms</ProgrCategory>
-    <ProgrGroup xmlns="084a5cd8-1559-4e94-ac72-b94fb9abc19e">01 HORIZON and EURATOM</ProgrGroup>
-    <DocStatus xmlns="084a5cd8-1559-4e94-ac72-b94fb9abc19e">Ready</DocStatus>
-    <DocPublDestination xmlns="084a5cd8-1559-4e94-ac72-b94fb9abc19e" xsi:nil="true"/>
-    <DocPublProtocol xmlns="084a5cd8-1559-4e94-ac72-b94fb9abc19e">TPL2-5 Programme tpl - Reporting forms, etc</DocPublProtocol>
-    <DocOfficerComments xmlns="084a5cd8-1559-4e94-ac72-b94fb9abc19e" xsi:nil="true"/>
-    <DocPublDate xmlns="084a5cd8-1559-4e94-ac72-b94fb9abc19e" xsi:nil="true"/>
-    <ITcomments xmlns="084a5cd8-1559-4e94-ac72-b94fb9abc19e" xsi:nil="true"/>
-    <ITstatus xmlns="084a5cd8-1559-4e94-ac72-b94fb9abc19e" xsi:nil="true"/>
-    <s86b xmlns="58f75e61-ed07-41d3-a804-02f248e1fac3" xsi:nil="true"/>
-  </documentManagement>
-</p:properties>
-</file>
-
-<file path=customXml/item3.xml><?xml version="1.0" encoding="utf-8"?>
 <ct:contentTypeSchema xmlns:ct="http://schemas.microsoft.com/office/2006/metadata/contentType" xmlns:ma="http://schemas.microsoft.com/office/2006/metadata/properties/metaAttributes" ct:_="" ma:_="" ma:contentTypeName="EC Document" ma:contentTypeID="0x010100258AA79CEB83498886A3A086811232500015D68561EDF2314DA91E1210E4D82B5C" ma:contentTypeVersion="39" ma:contentTypeDescription="Create a new document in this library." ma:contentTypeScope="" ma:versionID="56462b34cf91810872ea278535c8525e">
   <xsd:schema xmlns:xsd="http://www.w3.org/2001/XMLSchema" xmlns:xs="http://www.w3.org/2001/XMLSchema" xmlns:p="http://schemas.microsoft.com/office/2006/metadata/properties" xmlns:ns2="084a5cd8-1559-4e94-ac72-b94fb9abc19e" xmlns:ns3="58f75e61-ed07-41d3-a804-02f248e1fac3" targetNamespace="http://schemas.microsoft.com/office/2006/metadata/properties" ma:root="true" ma:fieldsID="b43b5fa606abdfc14cc643bd86f7f459" ns2:_="" ns3:_="">
     <xsd:import namespace="084a5cd8-1559-4e94-ac72-b94fb9abc19e"/>
@@ -5975,10 +6024,51 @@
 </ct:contentTypeSchema>
 </file>
 
+<file path=customXml/item2.xml><?xml version="1.0" encoding="utf-8"?>
+<p:properties xmlns:p="http://schemas.microsoft.com/office/2006/metadata/properties" xmlns:xsi="http://www.w3.org/2001/XMLSchema-instance" xmlns:pc="http://schemas.microsoft.com/office/infopath/2007/PartnerControls">
+  <documentManagement>
+    <Order1 xmlns="084a5cd8-1559-4e94-ac72-b94fb9abc19e">41</Order1>
+    <DocComments xmlns="084a5cd8-1559-4e94-ac72-b94fb9abc19e">Deliverable to be available on Portal.</DocComments>
+    <DocPublversion xmlns="084a5cd8-1559-4e94-ac72-b94fb9abc19e" xsi:nil="true"/>
+    <DocInternalExternal xmlns="084a5cd8-1559-4e94-ac72-b94fb9abc19e">Internal &amp; external</DocInternalExternal>
+    <ProgrCategory xmlns="084a5cd8-1559-4e94-ac72-b94fb9abc19e">3. Customised reports &amp; forms</ProgrCategory>
+    <ProgrGroup xmlns="084a5cd8-1559-4e94-ac72-b94fb9abc19e">01 HORIZON and EURATOM</ProgrGroup>
+    <DocStatus xmlns="084a5cd8-1559-4e94-ac72-b94fb9abc19e">Ready</DocStatus>
+    <DocPublDestination xmlns="084a5cd8-1559-4e94-ac72-b94fb9abc19e" xsi:nil="true"/>
+    <DocPublProtocol xmlns="084a5cd8-1559-4e94-ac72-b94fb9abc19e">TPL2-5 Programme tpl - Reporting forms, etc</DocPublProtocol>
+    <DocOfficerComments xmlns="084a5cd8-1559-4e94-ac72-b94fb9abc19e" xsi:nil="true"/>
+    <DocPublDate xmlns="084a5cd8-1559-4e94-ac72-b94fb9abc19e" xsi:nil="true"/>
+    <ITcomments xmlns="084a5cd8-1559-4e94-ac72-b94fb9abc19e" xsi:nil="true"/>
+    <ITstatus xmlns="084a5cd8-1559-4e94-ac72-b94fb9abc19e" xsi:nil="true"/>
+    <s86b xmlns="58f75e61-ed07-41d3-a804-02f248e1fac3" xsi:nil="true"/>
+  </documentManagement>
+</p:properties>
+</file>
+
+<file path=customXml/item3.xml><?xml version="1.0" encoding="utf-8"?>
+<?mso-contentType ?>
+<FormTemplates xmlns="http://schemas.microsoft.com/sharepoint/v3/contenttype/forms">
+  <Display>DocumentLibraryForm</Display>
+  <Edit>DocumentLibraryForm</Edit>
+  <New>DocumentLibraryForm</New>
+</FormTemplates>
+</file>
+
 <file path=customXml/itemProps1.xml><?xml version="1.0" encoding="utf-8"?>
-<ds:datastoreItem xmlns:ds="http://schemas.openxmlformats.org/officeDocument/2006/customXml" ds:itemID="{E5ABEBC2-8F24-42D8-B0A5-1D2B76C15645}">
+<ds:datastoreItem xmlns:ds="http://schemas.openxmlformats.org/officeDocument/2006/customXml" ds:itemID="{4B1213AF-11B3-4386-96A6-1D4CE320A5B3}">
   <ds:schemaRefs>
-    <ds:schemaRef ds:uri="http://schemas.microsoft.com/sharepoint/v3/contenttype/forms"/>
+    <ds:schemaRef ds:uri="http://schemas.microsoft.com/office/2006/metadata/contentType"/>
+    <ds:schemaRef ds:uri="http://schemas.microsoft.com/office/2006/metadata/properties/metaAttributes"/>
+    <ds:schemaRef ds:uri="http://www.w3.org/2001/XMLSchema"/>
+    <ds:schemaRef ds:uri="http://schemas.microsoft.com/office/2006/metadata/properties"/>
+    <ds:schemaRef ds:uri="084a5cd8-1559-4e94-ac72-b94fb9abc19e"/>
+    <ds:schemaRef ds:uri="58f75e61-ed07-41d3-a804-02f248e1fac3"/>
+    <ds:schemaRef ds:uri="http://schemas.microsoft.com/office/2006/documentManagement/types"/>
+    <ds:schemaRef ds:uri="http://schemas.microsoft.com/office/infopath/2007/PartnerControls"/>
+    <ds:schemaRef ds:uri="http://schemas.openxmlformats.org/package/2006/metadata/core-properties"/>
+    <ds:schemaRef ds:uri="http://purl.org/dc/elements/1.1/"/>
+    <ds:schemaRef ds:uri="http://purl.org/dc/terms/"/>
+    <ds:schemaRef ds:uri="http://schemas.microsoft.com/internal/obd"/>
   </ds:schemaRefs>
 </ds:datastoreItem>
 </file>
@@ -5995,20 +6085,9 @@
 </file>
 
 <file path=customXml/itemProps3.xml><?xml version="1.0" encoding="utf-8"?>
-<ds:datastoreItem xmlns:ds="http://schemas.openxmlformats.org/officeDocument/2006/customXml" ds:itemID="{4B1213AF-11B3-4386-96A6-1D4CE320A5B3}">
+<ds:datastoreItem xmlns:ds="http://schemas.openxmlformats.org/officeDocument/2006/customXml" ds:itemID="{E5ABEBC2-8F24-42D8-B0A5-1D2B76C15645}">
   <ds:schemaRefs>
-    <ds:schemaRef ds:uri="http://schemas.microsoft.com/office/2006/metadata/contentType"/>
-    <ds:schemaRef ds:uri="http://schemas.microsoft.com/office/2006/metadata/properties/metaAttributes"/>
-    <ds:schemaRef ds:uri="http://www.w3.org/2001/XMLSchema"/>
-    <ds:schemaRef ds:uri="http://schemas.microsoft.com/office/2006/metadata/properties"/>
-    <ds:schemaRef ds:uri="084a5cd8-1559-4e94-ac72-b94fb9abc19e"/>
-    <ds:schemaRef ds:uri="58f75e61-ed07-41d3-a804-02f248e1fac3"/>
-    <ds:schemaRef ds:uri="http://schemas.microsoft.com/office/2006/documentManagement/types"/>
-    <ds:schemaRef ds:uri="http://schemas.microsoft.com/office/infopath/2007/PartnerControls"/>
-    <ds:schemaRef ds:uri="http://schemas.openxmlformats.org/package/2006/metadata/core-properties"/>
-    <ds:schemaRef ds:uri="http://purl.org/dc/elements/1.1/"/>
-    <ds:schemaRef ds:uri="http://purl.org/dc/terms/"/>
-    <ds:schemaRef ds:uri="http://schemas.microsoft.com/internal/obd"/>
+    <ds:schemaRef ds:uri="http://schemas.microsoft.com/sharepoint/v3/contenttype/forms"/>
   </ds:schemaRefs>
 </ds:datastoreItem>
 </file>
</xml_diff>

<commit_message>
adds answers up to 31
</commit_message>
<xml_diff>
--- a/src/rdmo_docx_export/exports/templates/horizon-template.docx
+++ b/src/rdmo_docx_export/exports/templates/horizon-template.docx
@@ -2181,10 +2181,7 @@
         <w:t>{{Answer</w:t>
       </w:r>
       <w:r>
-        <w:t>23</w:t>
-      </w:r>
-      <w:r>
-        <w:t>a</w:t>
+        <w:t>23a</w:t>
       </w:r>
       <w:r>
         <w:t>}}</w:t>
@@ -2386,7 +2383,7 @@
           <w:color w:val="4AA55B"/>
           <w:lang w:val="en-GB"/>
         </w:rPr>
-        <w:t>Will your data be made freely available in the public domain to permit the widest re-use possible? Will your data be licensed using standard reuse licenses, in line with the obligations set out in the Grant Agreement?</w:t>
+        <w:t>Will your data be made freely available in the public domain to permit the widest re-use possible?</w:t>
       </w:r>
     </w:p>
     <w:p>
@@ -2394,10 +2391,10 @@
         <w:t>{{Answer</w:t>
       </w:r>
       <w:r>
-        <w:t>2</w:t>
-      </w:r>
-      <w:r>
-        <w:t>7</w:t>
+        <w:t>27</w:t>
+      </w:r>
+      <w:r>
+        <w:t>a</w:t>
       </w:r>
       <w:r>
         <w:t>}}</w:t>
@@ -2423,7 +2420,7 @@
           <w:color w:val="4AA55B"/>
           <w:lang w:val="en-GB"/>
         </w:rPr>
-        <w:t>Will the data produced in the project be useable by third parties, in particular after the end of the project?</w:t>
+        <w:t>Will your data be licensed using standard reuse licenses, in line with the obligations set out in the Grant Agreement?</w:t>
       </w:r>
     </w:p>
     <w:p>
@@ -2434,7 +2431,10 @@
         <w:t>2</w:t>
       </w:r>
       <w:r>
-        <w:t>8</w:t>
+        <w:t>7</w:t>
+      </w:r>
+      <w:r>
+        <w:t>b</w:t>
       </w:r>
       <w:r>
         <w:t>}}</w:t>
@@ -2460,7 +2460,7 @@
           <w:color w:val="4AA55B"/>
           <w:lang w:val="en-GB"/>
         </w:rPr>
-        <w:t>Will the provenance of the data be thoroughly documented using the appropriate standards?</w:t>
+        <w:t>Will the data produced in the project be useable by third parties, in particular after the end of the project?</w:t>
       </w:r>
     </w:p>
     <w:p>
@@ -2471,7 +2471,7 @@
         <w:t>2</w:t>
       </w:r>
       <w:r>
-        <w:t>9</w:t>
+        <w:t>8</w:t>
       </w:r>
       <w:r>
         <w:t>}}</w:t>
@@ -2497,15 +2497,7 @@
           <w:color w:val="4AA55B"/>
           <w:lang w:val="en-GB"/>
         </w:rPr>
-        <w:t>Describe all relevant d</w:t>
-      </w:r>
-      <w:r>
-        <w:rPr>
-          <w:i/>
-          <w:color w:val="4AA55B"/>
-          <w:lang w:val="en-GB"/>
-        </w:rPr>
-        <w:t>ata quality assurance processes.</w:t>
+        <w:t>Will the provenance of the data be thoroughly documented using the appropriate standards?</w:t>
       </w:r>
     </w:p>
     <w:p>
@@ -2513,7 +2505,10 @@
         <w:t>{{Answer</w:t>
       </w:r>
       <w:r>
-        <w:t>30</w:t>
+        <w:t>2</w:t>
+      </w:r>
+      <w:r>
+        <w:t>9</w:t>
       </w:r>
       <w:r>
         <w:t>}}</w:t>
@@ -2539,6 +2534,48 @@
           <w:color w:val="4AA55B"/>
           <w:lang w:val="en-GB"/>
         </w:rPr>
+        <w:t>Describe all relevant d</w:t>
+      </w:r>
+      <w:r>
+        <w:rPr>
+          <w:i/>
+          <w:color w:val="4AA55B"/>
+          <w:lang w:val="en-GB"/>
+        </w:rPr>
+        <w:t>ata quality assurance processes.</w:t>
+      </w:r>
+    </w:p>
+    <w:p>
+      <w:r>
+        <w:t>{{Answer</w:t>
+      </w:r>
+      <w:r>
+        <w:t>30</w:t>
+      </w:r>
+      <w:r>
+        <w:t>}}</w:t>
+      </w:r>
+    </w:p>
+    <w:p>
+      <w:pPr>
+        <w:pStyle w:val="Textkrper"/>
+        <w:kinsoku w:val="0"/>
+        <w:overflowPunct w:val="0"/>
+        <w:spacing w:after="240"/>
+        <w:ind w:right="-35"/>
+        <w:jc w:val="both"/>
+        <w:rPr>
+          <w:i/>
+          <w:color w:val="4AA55B"/>
+          <w:lang w:val="en-GB"/>
+        </w:rPr>
+      </w:pPr>
+      <w:r>
+        <w:rPr>
+          <w:i/>
+          <w:color w:val="4AA55B"/>
+          <w:lang w:val="en-GB"/>
+        </w:rPr>
         <w:t>Further to the FAIR principles, DMPs should also address research outputs other than data, and should carefully consider aspects related to the allocation of resources, data security and ethical aspects.</w:t>
       </w:r>
     </w:p>
@@ -2548,33 +2585,8 @@
         <w:spacing w:after="240"/>
         <w:ind w:right="-35"/>
         <w:jc w:val="both"/>
-        <w:rPr>
-          <w:u w:val="single"/>
-        </w:rPr>
       </w:pPr>
       <w:bookmarkStart w:id="7" w:name="_Toc69311945"/>
-      <w:r>
-        <w:rPr>
-          <w:iCs/>
-          <w:color w:val="000000" w:themeColor="text1"/>
-          <w:u w:val="single"/>
-          <w:lang w:val="en-GB"/>
-          <w14:textOutline w14:w="0" w14:cap="flat" w14:cmpd="sng" w14:algn="ctr">
-            <w14:noFill/>
-            <w14:prstDash w14:val="solid"/>
-            <w14:round/>
-          </w14:textOutline>
-        </w:rPr>
-        <w:t>Allocation of resources</w:t>
-      </w:r>
-    </w:p>
-    <w:p>
-      <w:pPr>
-        <w:pStyle w:val="Textkrper"/>
-        <w:spacing w:after="240"/>
-        <w:ind w:right="-35"/>
-        <w:jc w:val="both"/>
-      </w:pPr>
       <w:r>
         <w:rPr>
           <w:iCs/>
@@ -2612,32 +2624,297 @@
             <w14:round/>
           </w14:textOutline>
         </w:rPr>
-        <w:t>nswer31a}}</w:t>
-      </w:r>
+        <w:t>nswer31}}</w:t>
+      </w:r>
+    </w:p>
+    <w:p>
+      <w:pPr>
+        <w:pStyle w:val="berschrift2"/>
+      </w:pPr>
+      <w:r>
+        <w:t>Other research outputs</w:t>
+      </w:r>
+      <w:bookmarkEnd w:id="7"/>
     </w:p>
     <w:p>
       <w:pPr>
         <w:pStyle w:val="Textkrper"/>
+        <w:kinsoku w:val="0"/>
+        <w:overflowPunct w:val="0"/>
         <w:spacing w:after="240"/>
         <w:ind w:right="-35"/>
         <w:jc w:val="both"/>
         <w:rPr>
-          <w:u w:val="single"/>
-        </w:rPr>
-      </w:pPr>
-      <w:r>
-        <w:rPr>
-          <w:iCs/>
-          <w:color w:val="000000" w:themeColor="text1"/>
-          <w:u w:val="single"/>
-          <w:lang w:val="en-GB"/>
-          <w14:textOutline w14:w="0" w14:cap="flat" w14:cmpd="sng" w14:algn="ctr">
-            <w14:noFill/>
-            <w14:prstDash w14:val="solid"/>
-            <w14:round/>
-          </w14:textOutline>
-        </w:rPr>
-        <w:t>Security of other research outputs</w:t>
+          <w:i/>
+          <w:color w:val="4AA55B"/>
+          <w:lang w:val="en-GB"/>
+        </w:rPr>
+      </w:pPr>
+      <w:r>
+        <w:rPr>
+          <w:i/>
+          <w:color w:val="4AA55B"/>
+          <w:lang w:val="en-GB"/>
+        </w:rPr>
+        <w:t>In addition to the management of data, beneficiaries should also consider and plan for the management of other research outputs that may be generated or re-used throughout their projects. Such outputs can be either digital (e.g. software, workflows, protocols, models, etc.) or physical (e.g. new materials, antibodies, reagents, samples, etc.).</w:t>
+      </w:r>
+    </w:p>
+    <w:p>
+      <w:r>
+        <w:t>{{Answer</w:t>
+      </w:r>
+      <w:r>
+        <w:t>32</w:t>
+      </w:r>
+      <w:r>
+        <w:t>}}</w:t>
+      </w:r>
+    </w:p>
+    <w:p>
+      <w:pPr>
+        <w:pStyle w:val="Textkrper"/>
+        <w:kinsoku w:val="0"/>
+        <w:overflowPunct w:val="0"/>
+        <w:spacing w:after="240"/>
+        <w:ind w:right="-35"/>
+        <w:jc w:val="both"/>
+        <w:rPr>
+          <w:i/>
+          <w:color w:val="4AA55B"/>
+          <w:lang w:val="en-GB"/>
+        </w:rPr>
+      </w:pPr>
+      <w:r>
+        <w:rPr>
+          <w:i/>
+          <w:color w:val="4AA55B"/>
+          <w:lang w:val="en-GB"/>
+        </w:rPr>
+        <w:t>Beneficiaries should consider which of the questions pertaining to FAIR data above, can apply to the management of other research outputs, and should strive to provide sufficient detail on how their research outputs will be managed and shared, or made available for re-use, in line with the FAIR principles.</w:t>
+      </w:r>
+    </w:p>
+    <w:p>
+      <w:r>
+        <w:t>{{Answer</w:t>
+      </w:r>
+      <w:r>
+        <w:t>3</w:t>
+      </w:r>
+      <w:r>
+        <w:t>3</w:t>
+      </w:r>
+      <w:r>
+        <w:t>}}</w:t>
+      </w:r>
+    </w:p>
+    <w:p>
+      <w:pPr>
+        <w:pStyle w:val="berschrift2"/>
+      </w:pPr>
+      <w:bookmarkStart w:id="8" w:name="_Toc69311946"/>
+      <w:r>
+        <w:t>Allocation of</w:t>
+      </w:r>
+      <w:r>
+        <w:rPr>
+          <w:spacing w:val="-3"/>
+        </w:rPr>
+        <w:t xml:space="preserve"> </w:t>
+      </w:r>
+      <w:r>
+        <w:t>resources</w:t>
+      </w:r>
+      <w:bookmarkEnd w:id="8"/>
+    </w:p>
+    <w:p>
+      <w:pPr>
+        <w:pStyle w:val="Textkrper"/>
+        <w:kinsoku w:val="0"/>
+        <w:overflowPunct w:val="0"/>
+        <w:spacing w:after="240"/>
+        <w:ind w:right="-35"/>
+        <w:jc w:val="both"/>
+        <w:rPr>
+          <w:i/>
+          <w:color w:val="4AA55B"/>
+          <w:lang w:val="en-GB"/>
+        </w:rPr>
+      </w:pPr>
+      <w:r>
+        <w:rPr>
+          <w:i/>
+          <w:color w:val="4AA55B"/>
+          <w:lang w:val="en-GB"/>
+        </w:rPr>
+        <w:t>What will the costs be for making data or other research outputs FAIR in your project (e.g. direct and indirect costs related to storage, archiving, re-use, security, etc.) ?</w:t>
+      </w:r>
+    </w:p>
+    <w:p>
+      <w:r>
+        <w:t>{{Answer</w:t>
+      </w:r>
+      <w:r>
+        <w:t>3</w:t>
+      </w:r>
+      <w:r>
+        <w:t>4</w:t>
+      </w:r>
+      <w:r>
+        <w:t>}}</w:t>
+      </w:r>
+    </w:p>
+    <w:p>
+      <w:pPr>
+        <w:pStyle w:val="Textkrper"/>
+        <w:kinsoku w:val="0"/>
+        <w:overflowPunct w:val="0"/>
+        <w:spacing w:after="240"/>
+        <w:ind w:right="-35"/>
+        <w:jc w:val="both"/>
+        <w:rPr>
+          <w:i/>
+          <w:color w:val="4AA55B"/>
+          <w:lang w:val="en-GB"/>
+        </w:rPr>
+      </w:pPr>
+      <w:r>
+        <w:rPr>
+          <w:i/>
+          <w:color w:val="4AA55B"/>
+          <w:lang w:val="en-GB"/>
+        </w:rPr>
+        <w:t>How will these be covered? Note that costs related to research data/output management are eligible as part of the Horizon Europe grant (if compliant with the Grant Agreement conditions)</w:t>
+      </w:r>
+    </w:p>
+    <w:p>
+      <w:r>
+        <w:t>{{Answer</w:t>
+      </w:r>
+      <w:r>
+        <w:t>3</w:t>
+      </w:r>
+      <w:r>
+        <w:t>5</w:t>
+      </w:r>
+      <w:r>
+        <w:t>}}</w:t>
+      </w:r>
+    </w:p>
+    <w:p>
+      <w:pPr>
+        <w:pStyle w:val="Textkrper"/>
+        <w:kinsoku w:val="0"/>
+        <w:overflowPunct w:val="0"/>
+        <w:spacing w:after="240"/>
+        <w:ind w:right="-35"/>
+        <w:jc w:val="both"/>
+        <w:rPr>
+          <w:i/>
+          <w:color w:val="4AA55B"/>
+          <w:lang w:val="en-GB"/>
+        </w:rPr>
+      </w:pPr>
+      <w:r>
+        <w:rPr>
+          <w:i/>
+          <w:color w:val="4AA55B"/>
+          <w:lang w:val="en-GB"/>
+        </w:rPr>
+        <w:t>Who will be responsible for data management in your project?</w:t>
+      </w:r>
+    </w:p>
+    <w:p>
+      <w:r>
+        <w:t>{{Answer</w:t>
+      </w:r>
+      <w:r>
+        <w:t>3</w:t>
+      </w:r>
+      <w:r>
+        <w:t>6</w:t>
+      </w:r>
+      <w:r>
+        <w:t>}}</w:t>
+      </w:r>
+    </w:p>
+    <w:p>
+      <w:pPr>
+        <w:pStyle w:val="Textkrper"/>
+        <w:kinsoku w:val="0"/>
+        <w:overflowPunct w:val="0"/>
+        <w:spacing w:after="240"/>
+        <w:ind w:right="-35"/>
+        <w:jc w:val="both"/>
+        <w:rPr>
+          <w:i/>
+          <w:color w:val="4AA55B"/>
+          <w:lang w:val="en-GB"/>
+        </w:rPr>
+      </w:pPr>
+      <w:r>
+        <w:rPr>
+          <w:i/>
+          <w:color w:val="4AA55B"/>
+          <w:lang w:val="en-GB"/>
+        </w:rPr>
+        <w:t>How will long term preservation be ensured? Discuss the necessary resources to accomplish this (costs and potential value, who decides and how, what data will be kept and for how long)?</w:t>
+      </w:r>
+    </w:p>
+    <w:p>
+      <w:r>
+        <w:t>{{Answer</w:t>
+      </w:r>
+      <w:r>
+        <w:t>3</w:t>
+      </w:r>
+      <w:r>
+        <w:t>7</w:t>
+      </w:r>
+      <w:r>
+        <w:t>}}</w:t>
+      </w:r>
+    </w:p>
+    <w:p>
+      <w:pPr>
+        <w:pStyle w:val="berschrift2"/>
+      </w:pPr>
+      <w:bookmarkStart w:id="9" w:name="_Toc69311947"/>
+      <w:r>
+        <w:lastRenderedPageBreak/>
+        <w:t>Data</w:t>
+      </w:r>
+      <w:r>
+        <w:rPr>
+          <w:spacing w:val="-3"/>
+        </w:rPr>
+        <w:t xml:space="preserve"> </w:t>
+      </w:r>
+      <w:r>
+        <w:t>security</w:t>
+      </w:r>
+      <w:bookmarkEnd w:id="9"/>
+    </w:p>
+    <w:p>
+      <w:pPr>
+        <w:pStyle w:val="Textkrper"/>
+        <w:kinsoku w:val="0"/>
+        <w:overflowPunct w:val="0"/>
+        <w:spacing w:after="240"/>
+        <w:ind w:right="-35"/>
+        <w:jc w:val="both"/>
+        <w:rPr>
+          <w:i/>
+          <w:color w:val="4AA55B"/>
+          <w:lang w:val="en-GB"/>
+        </w:rPr>
+      </w:pPr>
+      <w:r>
+        <w:rPr>
+          <w:i/>
+          <w:color w:val="4AA55B"/>
+          <w:lang w:val="en-GB"/>
+        </w:rPr>
+        <w:t>What provisions are or will be in place for data security (including data recovery as well as secure storage/archiving and transfer of sensitive data)?</w:t>
       </w:r>
     </w:p>
     <w:p>
@@ -2684,533 +2961,7 @@
             <w14:round/>
           </w14:textOutline>
         </w:rPr>
-        <w:t>nswer31b}}</w:t>
-      </w:r>
-    </w:p>
-    <w:p>
-      <w:pPr>
-        <w:pStyle w:val="Textkrper"/>
-        <w:spacing w:after="240"/>
-        <w:ind w:right="-35"/>
-        <w:jc w:val="both"/>
-        <w:rPr>
-          <w:u w:val="single"/>
-        </w:rPr>
-      </w:pPr>
-      <w:r>
-        <w:rPr>
-          <w:iCs/>
-          <w:color w:val="000000" w:themeColor="text1"/>
-          <w:u w:val="single"/>
-          <w:lang w:val="en-GB"/>
-          <w14:textOutline w14:w="0" w14:cap="flat" w14:cmpd="sng" w14:algn="ctr">
-            <w14:noFill/>
-            <w14:prstDash w14:val="solid"/>
-            <w14:round/>
-          </w14:textOutline>
-        </w:rPr>
-        <w:t>Ethical aspects</w:t>
-      </w:r>
-    </w:p>
-    <w:p>
-      <w:pPr>
-        <w:pStyle w:val="Textkrper"/>
-        <w:spacing w:after="240"/>
-        <w:ind w:right="-35"/>
-        <w:jc w:val="both"/>
-        <w:rPr>
-          <w:iCs/>
-          <w:color w:val="000000" w:themeColor="text1"/>
-          <w:lang w:val="en-GB"/>
-          <w14:textOutline w14:w="0" w14:cap="flat" w14:cmpd="sng" w14:algn="ctr">
-            <w14:noFill/>
-            <w14:prstDash w14:val="solid"/>
-            <w14:round/>
-          </w14:textOutline>
-        </w:rPr>
-      </w:pPr>
-      <w:r>
-        <w:rPr>
-          <w:iCs/>
-          <w:color w:val="000000" w:themeColor="text1"/>
-          <w:lang w:val="en-GB"/>
-          <w14:textOutline w14:w="0" w14:cap="flat" w14:cmpd="sng" w14:algn="ctr">
-            <w14:noFill/>
-            <w14:prstDash w14:val="solid"/>
-            <w14:round/>
-          </w14:textOutline>
-        </w:rPr>
-        <w:t>{{</w:t>
-      </w:r>
-      <w:r>
-        <w:rPr>
-          <w:iCs/>
-          <w:color w:val="000000" w:themeColor="text1"/>
-          <w:lang w:val="de-DE"/>
-          <w14:textOutline w14:w="0" w14:cap="flat" w14:cmpd="sng" w14:algn="ctr">
-            <w14:noFill/>
-            <w14:prstDash w14:val="solid"/>
-            <w14:round/>
-          </w14:textOutline>
-        </w:rPr>
-        <w:t>A</w:t>
-      </w:r>
-      <w:r>
-        <w:rPr>
-          <w:iCs/>
-          <w:color w:val="000000" w:themeColor="text1"/>
-          <w:lang w:val="en-GB"/>
-          <w14:textOutline w14:w="0" w14:cap="flat" w14:cmpd="sng" w14:algn="ctr">
-            <w14:noFill/>
-            <w14:prstDash w14:val="solid"/>
-            <w14:round/>
-          </w14:textOutline>
-        </w:rPr>
-        <w:t>nswer31c}}</w:t>
-      </w:r>
-    </w:p>
-    <w:p>
-      <w:pPr>
-        <w:pStyle w:val="berschrift2"/>
-      </w:pPr>
-      <w:r>
-        <w:t>Other research outputs</w:t>
-      </w:r>
-      <w:bookmarkEnd w:id="7"/>
-    </w:p>
-    <w:p>
-      <w:pPr>
-        <w:pStyle w:val="Textkrper"/>
-        <w:kinsoku w:val="0"/>
-        <w:overflowPunct w:val="0"/>
-        <w:spacing w:after="240"/>
-        <w:ind w:right="-35"/>
-        <w:jc w:val="both"/>
-        <w:rPr>
-          <w:i/>
-          <w:color w:val="4AA55B"/>
-          <w:lang w:val="en-GB"/>
-        </w:rPr>
-      </w:pPr>
-      <w:r>
-        <w:rPr>
-          <w:i/>
-          <w:color w:val="4AA55B"/>
-          <w:lang w:val="en-GB"/>
-        </w:rPr>
-        <w:t>In addition to the management of data, beneficiaries should also consider and plan for the management of other research outputs that may be generated or re-used throughout their projects. Such outputs can be either digital (e.g. software, workflows, protocols, models, etc.) or physical (e.g. new materials, antibodies, reagents, samples, etc.).</w:t>
-      </w:r>
-    </w:p>
-    <w:p>
-      <w:r>
-        <w:t>{{Answer</w:t>
-      </w:r>
-      <w:r>
-        <w:t>32</w:t>
-      </w:r>
-      <w:r>
-        <w:t>}}</w:t>
-      </w:r>
-    </w:p>
-    <w:p>
-      <w:pPr>
-        <w:pStyle w:val="Textkrper"/>
-        <w:kinsoku w:val="0"/>
-        <w:overflowPunct w:val="0"/>
-        <w:spacing w:after="240"/>
-        <w:ind w:right="-35"/>
-        <w:jc w:val="both"/>
-        <w:rPr>
-          <w:i/>
-          <w:color w:val="4AA55B"/>
-          <w:lang w:val="en-GB"/>
-        </w:rPr>
-      </w:pPr>
-      <w:r>
-        <w:rPr>
-          <w:i/>
-          <w:color w:val="4AA55B"/>
-          <w:lang w:val="en-GB"/>
-        </w:rPr>
-        <w:t>Beneficiaries should consider which of the questions pertaining to FAIR data above, can apply to the management of other research outputs, and should strive to provide sufficient detail on how their research outputs will be managed and shared, or made available for re-use, in line with the FAIR principles.</w:t>
-      </w:r>
-    </w:p>
-    <w:p>
-      <w:r>
-        <w:t>{{Answer</w:t>
-      </w:r>
-      <w:r>
-        <w:t>3</w:t>
-      </w:r>
-      <w:r>
-        <w:t>3</w:t>
-      </w:r>
-      <w:r>
-        <w:t>}}</w:t>
-      </w:r>
-    </w:p>
-    <w:p>
-      <w:pPr>
-        <w:pStyle w:val="berschrift2"/>
-      </w:pPr>
-      <w:bookmarkStart w:id="8" w:name="_Toc69311946"/>
-      <w:r>
-        <w:t>Allocation of</w:t>
-      </w:r>
-      <w:r>
-        <w:rPr>
-          <w:spacing w:val="-3"/>
-        </w:rPr>
-        <w:t xml:space="preserve"> </w:t>
-      </w:r>
-      <w:r>
-        <w:t>resources</w:t>
-      </w:r>
-      <w:bookmarkEnd w:id="8"/>
-    </w:p>
-    <w:p>
-      <w:pPr>
-        <w:pStyle w:val="Textkrper"/>
-        <w:kinsoku w:val="0"/>
-        <w:overflowPunct w:val="0"/>
-        <w:spacing w:after="240"/>
-        <w:ind w:right="-35"/>
-        <w:jc w:val="both"/>
-        <w:rPr>
-          <w:i/>
-          <w:color w:val="4AA55B"/>
-          <w:lang w:val="en-GB"/>
-        </w:rPr>
-      </w:pPr>
-      <w:r>
-        <w:rPr>
-          <w:i/>
-          <w:color w:val="4AA55B"/>
-          <w:lang w:val="en-GB"/>
-        </w:rPr>
-        <w:t>What will the costs be for making data or other research outputs FAIR in your project (e.g. direct and indirect costs related to storage, archiving, re-use, security, etc.) ?</w:t>
-      </w:r>
-    </w:p>
-    <w:p>
-      <w:r>
-        <w:t>{{Answer</w:t>
-      </w:r>
-      <w:r>
-        <w:t>3</w:t>
-      </w:r>
-      <w:r>
-        <w:t>4</w:t>
-      </w:r>
-      <w:r>
-        <w:t>}}</w:t>
-      </w:r>
-    </w:p>
-    <w:p>
-      <w:pPr>
-        <w:pStyle w:val="Textkrper"/>
-        <w:kinsoku w:val="0"/>
-        <w:overflowPunct w:val="0"/>
-        <w:spacing w:after="240"/>
-        <w:ind w:right="-35"/>
-        <w:jc w:val="both"/>
-        <w:rPr>
-          <w:i/>
-          <w:color w:val="4AA55B"/>
-          <w:lang w:val="en-GB"/>
-        </w:rPr>
-      </w:pPr>
-      <w:r>
-        <w:rPr>
-          <w:i/>
-          <w:color w:val="4AA55B"/>
-          <w:lang w:val="en-GB"/>
-        </w:rPr>
-        <w:t>How will these be covered? Note that costs related to research data/output management are eligible as part of the Horizon Europe grant (if compliant with the Grant Agreement conditions)</w:t>
-      </w:r>
-    </w:p>
-    <w:p>
-      <w:r>
-        <w:t>{{Answer</w:t>
-      </w:r>
-      <w:r>
-        <w:t>3</w:t>
-      </w:r>
-      <w:r>
-        <w:t>5</w:t>
-      </w:r>
-      <w:r>
-        <w:t>}}</w:t>
-      </w:r>
-    </w:p>
-    <w:p>
-      <w:pPr>
-        <w:pStyle w:val="Textkrper"/>
-        <w:kinsoku w:val="0"/>
-        <w:overflowPunct w:val="0"/>
-        <w:spacing w:after="240"/>
-        <w:ind w:right="-35"/>
-        <w:jc w:val="both"/>
-        <w:rPr>
-          <w:i/>
-          <w:color w:val="4AA55B"/>
-          <w:lang w:val="en-GB"/>
-        </w:rPr>
-      </w:pPr>
-      <w:r>
-        <w:rPr>
-          <w:i/>
-          <w:color w:val="4AA55B"/>
-          <w:lang w:val="en-GB"/>
-        </w:rPr>
-        <w:t>Who will be responsible for data management in your project?</w:t>
-      </w:r>
-    </w:p>
-    <w:p>
-      <w:r>
-        <w:t>{{Answer</w:t>
-      </w:r>
-      <w:r>
-        <w:t>3</w:t>
-      </w:r>
-      <w:r>
-        <w:t>6</w:t>
-      </w:r>
-      <w:r>
-        <w:t>}}</w:t>
-      </w:r>
-    </w:p>
-    <w:p>
-      <w:pPr>
-        <w:pStyle w:val="Textkrper"/>
-        <w:kinsoku w:val="0"/>
-        <w:overflowPunct w:val="0"/>
-        <w:spacing w:after="240"/>
-        <w:ind w:right="-35"/>
-        <w:jc w:val="both"/>
-        <w:rPr>
-          <w:i/>
-          <w:color w:val="4AA55B"/>
-          <w:lang w:val="en-GB"/>
-        </w:rPr>
-      </w:pPr>
-      <w:r>
-        <w:rPr>
-          <w:i/>
-          <w:color w:val="4AA55B"/>
-          <w:lang w:val="en-GB"/>
-        </w:rPr>
-        <w:lastRenderedPageBreak/>
-        <w:t>How will long term preservation be ensured? Discuss the necessary resources to accomplish this (costs and potential value, who decides and how, what data will be kept and for how long)?</w:t>
-      </w:r>
-    </w:p>
-    <w:p>
-      <w:r>
-        <w:t>{{Answer</w:t>
-      </w:r>
-      <w:r>
-        <w:t>3</w:t>
-      </w:r>
-      <w:r>
-        <w:t>7</w:t>
-      </w:r>
-      <w:r>
-        <w:t>}}</w:t>
-      </w:r>
-    </w:p>
-    <w:p>
-      <w:pPr>
-        <w:pStyle w:val="berschrift2"/>
-      </w:pPr>
-      <w:bookmarkStart w:id="9" w:name="_Toc69311947"/>
-      <w:r>
-        <w:t>Data</w:t>
-      </w:r>
-      <w:r>
-        <w:rPr>
-          <w:spacing w:val="-3"/>
-        </w:rPr>
-        <w:t xml:space="preserve"> </w:t>
-      </w:r>
-      <w:r>
-        <w:t>security</w:t>
-      </w:r>
-      <w:bookmarkEnd w:id="9"/>
-    </w:p>
-    <w:p>
-      <w:pPr>
-        <w:pStyle w:val="Textkrper"/>
-        <w:kinsoku w:val="0"/>
-        <w:overflowPunct w:val="0"/>
-        <w:spacing w:after="240"/>
-        <w:ind w:right="-35"/>
-        <w:jc w:val="both"/>
-        <w:rPr>
-          <w:i/>
-          <w:color w:val="4AA55B"/>
-          <w:lang w:val="en-GB"/>
-        </w:rPr>
-      </w:pPr>
-      <w:r>
-        <w:rPr>
-          <w:i/>
-          <w:color w:val="4AA55B"/>
-          <w:lang w:val="en-GB"/>
-        </w:rPr>
-        <w:t>What provisions are or will be in place for data security (including data recovery as well as secure storage/archiving and transfer of sensitive data)?</w:t>
-      </w:r>
-    </w:p>
-    <w:p>
-      <w:pPr>
-        <w:pStyle w:val="Textkrper"/>
-        <w:spacing w:after="240"/>
-        <w:ind w:right="-35"/>
-        <w:jc w:val="both"/>
-        <w:rPr>
-          <w:u w:val="single"/>
-        </w:rPr>
-      </w:pPr>
-      <w:r>
-        <w:rPr>
-          <w:iCs/>
-          <w:color w:val="000000" w:themeColor="text1"/>
-          <w:u w:val="single"/>
-          <w:lang w:val="en-GB"/>
-          <w14:textOutline w14:w="0" w14:cap="flat" w14:cmpd="sng" w14:algn="ctr">
-            <w14:noFill/>
-            <w14:prstDash w14:val="solid"/>
-            <w14:round/>
-          </w14:textOutline>
-        </w:rPr>
-        <w:t xml:space="preserve">Data recovery and secure storage </w:t>
-      </w:r>
-    </w:p>
-    <w:p>
-      <w:pPr>
-        <w:pStyle w:val="Textkrper"/>
-        <w:spacing w:after="240"/>
-        <w:ind w:right="-35"/>
-        <w:jc w:val="both"/>
-      </w:pPr>
-      <w:r>
-        <w:rPr>
-          <w:iCs/>
-          <w:color w:val="000000" w:themeColor="text1"/>
-          <w:lang w:val="en-GB"/>
-          <w14:textOutline w14:w="0" w14:cap="flat" w14:cmpd="sng" w14:algn="ctr">
-            <w14:noFill/>
-            <w14:prstDash w14:val="solid"/>
-            <w14:round/>
-          </w14:textOutline>
-        </w:rPr>
-        <w:t>{{</w:t>
-      </w:r>
-      <w:r>
-        <w:rPr>
-          <w:iCs/>
-          <w:color w:val="000000" w:themeColor="text1"/>
-          <w:lang w:val="de-DE"/>
-          <w14:textOutline w14:w="0" w14:cap="flat" w14:cmpd="sng" w14:algn="ctr">
-            <w14:noFill/>
-            <w14:prstDash w14:val="solid"/>
-            <w14:round/>
-          </w14:textOutline>
-        </w:rPr>
-        <w:t>A</w:t>
-      </w:r>
-      <w:r>
-        <w:rPr>
-          <w:iCs/>
-          <w:color w:val="000000" w:themeColor="text1"/>
-          <w:lang w:val="en-GB"/>
-          <w14:textOutline w14:w="0" w14:cap="flat" w14:cmpd="sng" w14:algn="ctr">
-            <w14:noFill/>
-            <w14:prstDash w14:val="solid"/>
-            <w14:round/>
-          </w14:textOutline>
-        </w:rPr>
-        <w:t>nswer38a}}</w:t>
-      </w:r>
-    </w:p>
-    <w:p>
-      <w:pPr>
-        <w:pStyle w:val="Textkrper"/>
-        <w:spacing w:after="240"/>
-        <w:ind w:right="-35"/>
-        <w:jc w:val="both"/>
-        <w:rPr>
-          <w:u w:val="single"/>
-        </w:rPr>
-      </w:pPr>
-      <w:r>
-        <w:rPr>
-          <w:iCs/>
-          <w:color w:val="000000" w:themeColor="text1"/>
-          <w:u w:val="single"/>
-          <w:lang w:val="en-GB"/>
-          <w14:textOutline w14:w="0" w14:cap="flat" w14:cmpd="sng" w14:algn="ctr">
-            <w14:noFill/>
-            <w14:prstDash w14:val="solid"/>
-            <w14:round/>
-          </w14:textOutline>
-        </w:rPr>
-        <w:t>Transfer of sensitive data</w:t>
-      </w:r>
-    </w:p>
-    <w:p>
-      <w:pPr>
-        <w:pStyle w:val="Textkrper"/>
-        <w:spacing w:after="240"/>
-        <w:ind w:right="-35"/>
-        <w:jc w:val="both"/>
-        <w:rPr>
-          <w:iCs/>
-          <w:color w:val="000000" w:themeColor="text1"/>
-          <w:lang w:val="en-GB"/>
-          <w14:textOutline w14:w="0" w14:cap="flat" w14:cmpd="sng" w14:algn="ctr">
-            <w14:noFill/>
-            <w14:prstDash w14:val="solid"/>
-            <w14:round/>
-          </w14:textOutline>
-        </w:rPr>
-      </w:pPr>
-      <w:r>
-        <w:rPr>
-          <w:iCs/>
-          <w:color w:val="000000" w:themeColor="text1"/>
-          <w:lang w:val="en-GB"/>
-          <w14:textOutline w14:w="0" w14:cap="flat" w14:cmpd="sng" w14:algn="ctr">
-            <w14:noFill/>
-            <w14:prstDash w14:val="solid"/>
-            <w14:round/>
-          </w14:textOutline>
-        </w:rPr>
-        <w:t>{{</w:t>
-      </w:r>
-      <w:r>
-        <w:rPr>
-          <w:iCs/>
-          <w:color w:val="000000" w:themeColor="text1"/>
-          <w:lang w:val="de-DE"/>
-          <w14:textOutline w14:w="0" w14:cap="flat" w14:cmpd="sng" w14:algn="ctr">
-            <w14:noFill/>
-            <w14:prstDash w14:val="solid"/>
-            <w14:round/>
-          </w14:textOutline>
-        </w:rPr>
-        <w:t>A</w:t>
-      </w:r>
-      <w:r>
-        <w:rPr>
-          <w:iCs/>
-          <w:color w:val="000000" w:themeColor="text1"/>
-          <w:lang w:val="en-GB"/>
-          <w14:textOutline w14:w="0" w14:cap="flat" w14:cmpd="sng" w14:algn="ctr">
-            <w14:noFill/>
-            <w14:prstDash w14:val="solid"/>
-            <w14:round/>
-          </w14:textOutline>
-        </w:rPr>
-        <w:t>nswer38b}}</w:t>
+        <w:t>nswer38}}</w:t>
       </w:r>
     </w:p>
     <w:p>

</xml_diff>